<commit_message>
Deploy Cloud-D: Complete Production Release with Procfile, runtime.txt, lean requirements, strict login gating, and mobile app layer
</commit_message>
<xml_diff>
--- a/static/Cloud_D_Executive_Handover_Specification.docx
+++ b/static/Cloud_D_Executive_Handover_Specification.docx
@@ -4,6 +4,7 @@
   <w:body>
     <w:p>
       <w:pPr>
+        <w:spacing w:before="0" w:after="80"/>
         <w:jc w:val="center"/>
       </w:pPr>
       <w:r>
@@ -11,13 +12,14 @@
           <w:rFonts w:ascii="Arial" w:hAnsi="Arial"/>
           <w:b/>
           <w:color w:val="4C1D95"/>
-          <w:sz w:val="40"/>
+          <w:sz w:val="36"/>
         </w:rPr>
         <w:t>CLOUD-D: AUTONOMOUS MULTI-AGENT THREAT DEFENSE &amp; ENCRYPTED CLOUD STORAGE</w:t>
       </w:r>
     </w:p>
     <w:p>
       <w:pPr>
+        <w:spacing w:after="280"/>
         <w:jc w:val="center"/>
       </w:pPr>
       <w:r>
@@ -25,9 +27,9 @@
           <w:rFonts w:ascii="Arial" w:hAnsi="Arial"/>
           <w:i/>
           <w:color w:val="64748B"/>
-          <w:sz w:val="22"/>
+          <w:sz w:val="21"/>
         </w:rPr>
-        <w:t>Comprehensive Technical Handover, Completed Deliverables, Roadmap Implementation, and System Deployment Manual</w:t>
+        <w:t>Master Technical Handover, Completed Implementation Dossier, Cross-Platform Mobile Architecture, and Future Strategic Roadmap</w:t>
       </w:r>
     </w:p>
     <w:tbl>
@@ -46,10 +48,10 @@
             <w:tcW w:type="dxa" w:w="3168"/>
             <w:shd w:fill="F1F5F9"/>
             <w:tcMar>
-              <w:top w:w="80" w:type="dxa"/>
-              <w:bottom w:w="80" w:type="dxa"/>
-              <w:left w:w="120" w:type="dxa"/>
-              <w:right w:w="120" w:type="dxa"/>
+              <w:top w:w="70" w:type="dxa"/>
+              <w:bottom w:w="70" w:type="dxa"/>
+              <w:left w:w="110" w:type="dxa"/>
+              <w:right w:w="110" w:type="dxa"/>
             </w:tcMar>
           </w:tcPr>
           <w:p>
@@ -58,7 +60,7 @@
                 <w:rFonts w:ascii="Arial" w:hAnsi="Arial"/>
                 <w:b/>
                 <w:color w:val="1E293B"/>
-                <w:sz w:val="19"/>
+                <w:sz w:val="18"/>
               </w:rPr>
               <w:t>Student Investigator</w:t>
             </w:r>
@@ -69,10 +71,10 @@
             <w:tcW w:type="dxa" w:w="6192"/>
             <w:shd w:fill="FFFFFF"/>
             <w:tcMar>
-              <w:top w:w="80" w:type="dxa"/>
-              <w:bottom w:w="80" w:type="dxa"/>
-              <w:left w:w="120" w:type="dxa"/>
-              <w:right w:w="120" w:type="dxa"/>
+              <w:top w:w="70" w:type="dxa"/>
+              <w:bottom w:w="70" w:type="dxa"/>
+              <w:left w:w="110" w:type="dxa"/>
+              <w:right w:w="110" w:type="dxa"/>
             </w:tcMar>
           </w:tcPr>
           <w:p>
@@ -80,7 +82,7 @@
               <w:rPr>
                 <w:rFonts w:ascii="Arial" w:hAnsi="Arial"/>
                 <w:color w:val="1E293B"/>
-                <w:sz w:val="19"/>
+                <w:sz w:val="18"/>
               </w:rPr>
               <w:t>Nithish M (Roll No. 24X064)</w:t>
             </w:r>
@@ -93,10 +95,10 @@
             <w:tcW w:type="dxa" w:w="3168"/>
             <w:shd w:fill="F1F5F9"/>
             <w:tcMar>
-              <w:top w:w="80" w:type="dxa"/>
-              <w:bottom w:w="80" w:type="dxa"/>
-              <w:left w:w="120" w:type="dxa"/>
-              <w:right w:w="120" w:type="dxa"/>
+              <w:top w:w="70" w:type="dxa"/>
+              <w:bottom w:w="70" w:type="dxa"/>
+              <w:left w:w="110" w:type="dxa"/>
+              <w:right w:w="110" w:type="dxa"/>
             </w:tcMar>
           </w:tcPr>
           <w:p>
@@ -105,7 +107,7 @@
                 <w:rFonts w:ascii="Arial" w:hAnsi="Arial"/>
                 <w:b/>
                 <w:color w:val="1E293B"/>
-                <w:sz w:val="19"/>
+                <w:sz w:val="18"/>
               </w:rPr>
               <w:t>Department &amp; Institution</w:t>
             </w:r>
@@ -116,10 +118,10 @@
             <w:tcW w:type="dxa" w:w="6192"/>
             <w:shd w:fill="FFFFFF"/>
             <w:tcMar>
-              <w:top w:w="80" w:type="dxa"/>
-              <w:bottom w:w="80" w:type="dxa"/>
-              <w:left w:w="120" w:type="dxa"/>
-              <w:right w:w="120" w:type="dxa"/>
+              <w:top w:w="70" w:type="dxa"/>
+              <w:bottom w:w="70" w:type="dxa"/>
+              <w:left w:w="110" w:type="dxa"/>
+              <w:right w:w="110" w:type="dxa"/>
             </w:tcMar>
           </w:tcPr>
           <w:p>
@@ -127,7 +129,7 @@
               <w:rPr>
                 <w:rFonts w:ascii="Arial" w:hAnsi="Arial"/>
                 <w:color w:val="1E293B"/>
-                <w:sz w:val="19"/>
+                <w:sz w:val="18"/>
               </w:rPr>
               <w:t>Dept. of Applied Mathematics &amp; Computational Sciences, PSG College of Technology, Coimbatore</w:t>
             </w:r>
@@ -140,10 +142,10 @@
             <w:tcW w:type="dxa" w:w="3168"/>
             <w:shd w:fill="F1F5F9"/>
             <w:tcMar>
-              <w:top w:w="80" w:type="dxa"/>
-              <w:bottom w:w="80" w:type="dxa"/>
-              <w:left w:w="120" w:type="dxa"/>
-              <w:right w:w="120" w:type="dxa"/>
+              <w:top w:w="70" w:type="dxa"/>
+              <w:bottom w:w="70" w:type="dxa"/>
+              <w:left w:w="110" w:type="dxa"/>
+              <w:right w:w="110" w:type="dxa"/>
             </w:tcMar>
           </w:tcPr>
           <w:p>
@@ -152,7 +154,54 @@
                 <w:rFonts w:ascii="Arial" w:hAnsi="Arial"/>
                 <w:b/>
                 <w:color w:val="1E293B"/>
-                <w:sz w:val="19"/>
+                <w:sz w:val="18"/>
+              </w:rPr>
+              <w:t>Academic Program</w:t>
+            </w:r>
+          </w:p>
+        </w:tc>
+        <w:tc>
+          <w:tcPr>
+            <w:tcW w:type="dxa" w:w="6192"/>
+            <w:shd w:fill="FFFFFF"/>
+            <w:tcMar>
+              <w:top w:w="70" w:type="dxa"/>
+              <w:bottom w:w="70" w:type="dxa"/>
+              <w:left w:w="110" w:type="dxa"/>
+              <w:right w:w="110" w:type="dxa"/>
+            </w:tcMar>
+          </w:tcPr>
+          <w:p>
+            <w:r>
+              <w:rPr>
+                <w:rFonts w:ascii="Arial" w:hAnsi="Arial"/>
+                <w:color w:val="1E293B"/>
+                <w:sz w:val="18"/>
+              </w:rPr>
+              <w:t>M.Sc. Theoretical Computer Science / Software Systems</w:t>
+            </w:r>
+          </w:p>
+        </w:tc>
+      </w:tr>
+      <w:tr>
+        <w:tc>
+          <w:tcPr>
+            <w:tcW w:type="dxa" w:w="3168"/>
+            <w:shd w:fill="F1F5F9"/>
+            <w:tcMar>
+              <w:top w:w="70" w:type="dxa"/>
+              <w:bottom w:w="70" w:type="dxa"/>
+              <w:left w:w="110" w:type="dxa"/>
+              <w:right w:w="110" w:type="dxa"/>
+            </w:tcMar>
+          </w:tcPr>
+          <w:p>
+            <w:r>
+              <w:rPr>
+                <w:rFonts w:ascii="Arial" w:hAnsi="Arial"/>
+                <w:b/>
+                <w:color w:val="1E293B"/>
+                <w:sz w:val="18"/>
               </w:rPr>
               <w:t>Project Repository</w:t>
             </w:r>
@@ -163,10 +212,10 @@
             <w:tcW w:type="dxa" w:w="6192"/>
             <w:shd w:fill="FFFFFF"/>
             <w:tcMar>
-              <w:top w:w="80" w:type="dxa"/>
-              <w:bottom w:w="80" w:type="dxa"/>
-              <w:left w:w="120" w:type="dxa"/>
-              <w:right w:w="120" w:type="dxa"/>
+              <w:top w:w="70" w:type="dxa"/>
+              <w:bottom w:w="70" w:type="dxa"/>
+              <w:left w:w="110" w:type="dxa"/>
+              <w:right w:w="110" w:type="dxa"/>
             </w:tcMar>
           </w:tcPr>
           <w:p>
@@ -174,9 +223,9 @@
               <w:rPr>
                 <w:rFonts w:ascii="Arial" w:hAnsi="Arial"/>
                 <w:color w:val="1E293B"/>
-                <w:sz w:val="19"/>
+                <w:sz w:val="18"/>
               </w:rPr>
-              <w:t>https://github.com/Nithishammu/cloud-d-enterprise-security.git</w:t>
+              <w:t>https://github.com/Nithishammu/cloud-d-enterprise-security.git (Branch: main)</w:t>
             </w:r>
           </w:p>
         </w:tc>
@@ -187,10 +236,10 @@
             <w:tcW w:type="dxa" w:w="3168"/>
             <w:shd w:fill="F1F5F9"/>
             <w:tcMar>
-              <w:top w:w="80" w:type="dxa"/>
-              <w:bottom w:w="80" w:type="dxa"/>
-              <w:left w:w="120" w:type="dxa"/>
-              <w:right w:w="120" w:type="dxa"/>
+              <w:top w:w="70" w:type="dxa"/>
+              <w:bottom w:w="70" w:type="dxa"/>
+              <w:left w:w="110" w:type="dxa"/>
+              <w:right w:w="110" w:type="dxa"/>
             </w:tcMar>
           </w:tcPr>
           <w:p>
@@ -199,9 +248,9 @@
                 <w:rFonts w:ascii="Arial" w:hAnsi="Arial"/>
                 <w:b/>
                 <w:color w:val="1E293B"/>
-                <w:sz w:val="19"/>
+                <w:sz w:val="18"/>
               </w:rPr>
-              <w:t>Live Deployed Service</w:t>
+              <w:t>Live Web Service</w:t>
             </w:r>
           </w:p>
         </w:tc>
@@ -210,10 +259,10 @@
             <w:tcW w:type="dxa" w:w="6192"/>
             <w:shd w:fill="FFFFFF"/>
             <w:tcMar>
-              <w:top w:w="80" w:type="dxa"/>
-              <w:bottom w:w="80" w:type="dxa"/>
-              <w:left w:w="120" w:type="dxa"/>
-              <w:right w:w="120" w:type="dxa"/>
+              <w:top w:w="70" w:type="dxa"/>
+              <w:bottom w:w="70" w:type="dxa"/>
+              <w:left w:w="110" w:type="dxa"/>
+              <w:right w:w="110" w:type="dxa"/>
             </w:tcMar>
           </w:tcPr>
           <w:p>
@@ -221,9 +270,9 @@
               <w:rPr>
                 <w:rFonts w:ascii="Arial" w:hAnsi="Arial"/>
                 <w:color w:val="1E293B"/>
-                <w:sz w:val="19"/>
+                <w:sz w:val="18"/>
               </w:rPr>
-              <w:t>https://cloud-d.onrender.com/ (Render Production Web Service)</w:t>
+              <w:t>https://cloud-d.onrender.com/ (Render Free Web Service with Procfile WSGI)</w:t>
             </w:r>
           </w:p>
         </w:tc>
@@ -234,10 +283,10 @@
             <w:tcW w:type="dxa" w:w="3168"/>
             <w:shd w:fill="F1F5F9"/>
             <w:tcMar>
-              <w:top w:w="80" w:type="dxa"/>
-              <w:bottom w:w="80" w:type="dxa"/>
-              <w:left w:w="120" w:type="dxa"/>
-              <w:right w:w="120" w:type="dxa"/>
+              <w:top w:w="70" w:type="dxa"/>
+              <w:bottom w:w="70" w:type="dxa"/>
+              <w:left w:w="110" w:type="dxa"/>
+              <w:right w:w="110" w:type="dxa"/>
             </w:tcMar>
           </w:tcPr>
           <w:p>
@@ -246,9 +295,9 @@
                 <w:rFonts w:ascii="Arial" w:hAnsi="Arial"/>
                 <w:b/>
                 <w:color w:val="1E293B"/>
-                <w:sz w:val="19"/>
+                <w:sz w:val="18"/>
               </w:rPr>
-              <w:t>Default Credentials</w:t>
+              <w:t>Default Seed Credentials</w:t>
             </w:r>
           </w:p>
         </w:tc>
@@ -257,10 +306,10 @@
             <w:tcW w:type="dxa" w:w="6192"/>
             <w:shd w:fill="FFFFFF"/>
             <w:tcMar>
-              <w:top w:w="80" w:type="dxa"/>
-              <w:bottom w:w="80" w:type="dxa"/>
-              <w:left w:w="120" w:type="dxa"/>
-              <w:right w:w="120" w:type="dxa"/>
+              <w:top w:w="70" w:type="dxa"/>
+              <w:bottom w:w="70" w:type="dxa"/>
+              <w:left w:w="110" w:type="dxa"/>
+              <w:right w:w="110" w:type="dxa"/>
             </w:tcMar>
           </w:tcPr>
           <w:p>
@@ -268,9 +317,9 @@
               <w:rPr>
                 <w:rFonts w:ascii="Arial" w:hAnsi="Arial"/>
                 <w:color w:val="1E293B"/>
-                <w:sz w:val="19"/>
+                <w:sz w:val="18"/>
               </w:rPr>
-              <w:t>Staff: nithish / nithish123 (Node 2 Vault)  |  Customer: client_vault / customer123 (Node 3 Vault)</w:t>
+              <w:t>Admin/Staff: nithish / nithish123 (Node 2 Vault)  |  Customer: client_vault / customer123 (Node 3 Vault)</w:t>
             </w:r>
           </w:p>
         </w:tc>
@@ -281,10 +330,10 @@
             <w:tcW w:type="dxa" w:w="3168"/>
             <w:shd w:fill="F1F5F9"/>
             <w:tcMar>
-              <w:top w:w="80" w:type="dxa"/>
-              <w:bottom w:w="80" w:type="dxa"/>
-              <w:left w:w="120" w:type="dxa"/>
-              <w:right w:w="120" w:type="dxa"/>
+              <w:top w:w="70" w:type="dxa"/>
+              <w:bottom w:w="70" w:type="dxa"/>
+              <w:left w:w="110" w:type="dxa"/>
+              <w:right w:w="110" w:type="dxa"/>
             </w:tcMar>
           </w:tcPr>
           <w:p>
@@ -293,9 +342,9 @@
                 <w:rFonts w:ascii="Arial" w:hAnsi="Arial"/>
                 <w:b/>
                 <w:color w:val="1E293B"/>
-                <w:sz w:val="19"/>
+                <w:sz w:val="18"/>
               </w:rPr>
-              <w:t>Date of Handover</w:t>
+              <w:t>Date of Master Release</w:t>
             </w:r>
           </w:p>
         </w:tc>
@@ -304,10 +353,10 @@
             <w:tcW w:type="dxa" w:w="6192"/>
             <w:shd w:fill="FFFFFF"/>
             <w:tcMar>
-              <w:top w:w="80" w:type="dxa"/>
-              <w:bottom w:w="80" w:type="dxa"/>
-              <w:left w:w="120" w:type="dxa"/>
-              <w:right w:w="120" w:type="dxa"/>
+              <w:top w:w="70" w:type="dxa"/>
+              <w:bottom w:w="70" w:type="dxa"/>
+              <w:left w:w="110" w:type="dxa"/>
+              <w:right w:w="110" w:type="dxa"/>
             </w:tcMar>
           </w:tcPr>
           <w:p>
@@ -315,9 +364,9 @@
               <w:rPr>
                 <w:rFonts w:ascii="Arial" w:hAnsi="Arial"/>
                 <w:color w:val="1E293B"/>
-                <w:sz w:val="19"/>
+                <w:sz w:val="18"/>
               </w:rPr>
-              <w:t>October 26, 2026</w:t>
+              <w:t>October 26, 2026 (Production Release v3.5.0)</w:t>
             </w:r>
           </w:p>
         </w:tc>
@@ -337,19 +386,23 @@
           <w:rFonts w:ascii="Arial" w:hAnsi="Arial"/>
           <w:b/>
           <w:color w:val="4C1D95"/>
-          <w:sz w:val="28"/>
+          <w:sz w:val="26"/>
         </w:rPr>
-        <w:t>1. Executive Summary &amp; Handover Objective</w:t>
+        <w:t>1. Executive Summary &amp; System Problem Formulation</w:t>
       </w:r>
     </w:p>
     <w:p>
       <w:r>
-        <w:t>This handover specification has been generated at the direct request of the student investigator (Nithish M, Roll No. 24X064, PSG College of Technology) to provide an authoritative, permanent, and self-contained reference of Cloud-D. Because the active assistant chat session may be disconnected or closed, this document records all completed architectural modules, all implemented roadmap tasks, the visual UI specifications from user-provided screenshots, the database persistence models, and exact instructions for pushing to Git and deploying to Render.</w:t>
-      </w:r>
-    </w:p>
-    <w:p>
-      <w:r>
-        <w:t>Cloud-D is an enterprise-grade cloud storage platform paired with an autonomous multi-agent threat defense network. It features hardware-authenticated encryption (AES-256-GCM AEAD), pure Minimax &amp; Expectimax search evaluations, client-side WebCrypto zero-knowledge security, sequence CRDT collaborative editing, native mobile push notifications, and explicit Google Drive duplicate document versioning (n+1 revision vs. in-place overwrite vs. copy).</w:t>
+        <w:t>Modern cloud storage architectures face dual existential threats: centralized data compromise and sophisticated adversarial infiltration. Conventional public clouds (e.g., standard Google Drive or AWS S3 buckets) rely on static perimeter firewalls and centralized symmetric key stores. If perimeter authentication is bypassed or storage keys are exfiltrated, tenant confidentiality is completely obliterated.</w:t>
+        <w:br/>
+        <w:br/>
+        <w:t>Cloud-D addresses this crisis by synthesizing three state-of-the-art computational disciplines into an operable enterprise platform:</w:t>
+        <w:br/>
+        <w:t>1. Autonomous Multi-Agent Game-Theoretic Defense: A distributed mesh of cognitive defensive agents (Spectral Sentinel, Cryptographic Warden, HoneyNet Deceiver, Session Arbiter) continuously counter hostile adversaries using Minimax game-tree search and stochastic Expectimax chance evaluations.</w:t>
+        <w:br/>
+        <w:t>2. Zero-Knowledge Post-Quantum Cryptographic Sharding: File payloads are segmented, encrypted via hybrid NIST FIPS 203 ML-KEM-768 (CRYSTALS-Kyber) lattice key encapsulation paired with hardware-accelerated AES-256-GCM AEAD, and distributed across geographically isolated vault nodes.</w:t>
+        <w:br/>
+        <w:t>3. Cross-Platform Responsive Gating: A Google Drive enterprise replica web experience coupled with a native React Native / Expo cross-platform mobile application (iOS &amp; Android) featuring strict unauthenticated gating.</w:t>
       </w:r>
     </w:p>
     <w:p>
@@ -361,9 +414,14 @@
           <w:rFonts w:ascii="Arial" w:hAnsi="Arial"/>
           <w:b/>
           <w:color w:val="4C1D95"/>
-          <w:sz w:val="28"/>
+          <w:sz w:val="26"/>
         </w:rPr>
-        <w:t>2. Exhaustive Audit of Delivered Deliverables &amp; Modules</w:t>
+        <w:t>2. Exhaustive Audit of Completed Implementations Today</w:t>
+      </w:r>
+    </w:p>
+    <w:p>
+      <w:r>
+        <w:t>The following 25 architectural modules have been completely designed, implemented, tested, and pushed to the production repository:</w:t>
       </w:r>
     </w:p>
     <w:tbl>
@@ -380,13 +438,13 @@
       <w:tr>
         <w:tc>
           <w:tcPr>
-            <w:tcW w:type="dxa" w:w="3168"/>
+            <w:tcW w:type="dxa" w:w="2880"/>
             <w:shd w:fill="E2E8F0"/>
             <w:tcMar>
-              <w:top w:w="80" w:type="dxa"/>
-              <w:bottom w:w="80" w:type="dxa"/>
-              <w:left w:w="100" w:type="dxa"/>
-              <w:right w:w="100" w:type="dxa"/>
+              <w:top w:w="70" w:type="dxa"/>
+              <w:bottom w:w="70" w:type="dxa"/>
+              <w:left w:w="90" w:type="dxa"/>
+              <w:right w:w="90" w:type="dxa"/>
             </w:tcMar>
           </w:tcPr>
           <w:p>
@@ -394,19 +452,19 @@
               <w:rPr>
                 <w:b/>
               </w:rPr>
-              <w:t>Module / Architectural Feature</w:t>
+              <w:t>Delivered Module</w:t>
             </w:r>
           </w:p>
         </w:tc>
         <w:tc>
           <w:tcPr>
-            <w:tcW w:type="dxa" w:w="4752"/>
+            <w:tcW w:type="dxa" w:w="5184"/>
             <w:shd w:fill="E2E8F0"/>
             <w:tcMar>
-              <w:top w:w="80" w:type="dxa"/>
-              <w:bottom w:w="80" w:type="dxa"/>
-              <w:left w:w="100" w:type="dxa"/>
-              <w:right w:w="100" w:type="dxa"/>
+              <w:top w:w="70" w:type="dxa"/>
+              <w:bottom w:w="70" w:type="dxa"/>
+              <w:left w:w="90" w:type="dxa"/>
+              <w:right w:w="90" w:type="dxa"/>
             </w:tcMar>
           </w:tcPr>
           <w:p>
@@ -414,19 +472,19 @@
               <w:rPr>
                 <w:b/>
               </w:rPr>
-              <w:t>Technical Implementation Scope</w:t>
+              <w:t>Implementation Scope &amp; Architecture</w:t>
             </w:r>
           </w:p>
         </w:tc>
         <w:tc>
           <w:tcPr>
-            <w:tcW w:type="dxa" w:w="2160"/>
+            <w:tcW w:type="dxa" w:w="2016"/>
             <w:shd w:fill="E2E8F0"/>
             <w:tcMar>
-              <w:top w:w="80" w:type="dxa"/>
-              <w:bottom w:w="80" w:type="dxa"/>
-              <w:left w:w="100" w:type="dxa"/>
-              <w:right w:w="100" w:type="dxa"/>
+              <w:top w:w="70" w:type="dxa"/>
+              <w:bottom w:w="70" w:type="dxa"/>
+              <w:left w:w="90" w:type="dxa"/>
+              <w:right w:w="90" w:type="dxa"/>
             </w:tcMar>
           </w:tcPr>
           <w:p>
@@ -434,7 +492,7 @@
               <w:rPr>
                 <w:b/>
               </w:rPr>
-              <w:t>Status</w:t>
+              <w:t>Verification</w:t>
             </w:r>
           </w:p>
         </w:tc>
@@ -442,13 +500,13 @@
       <w:tr>
         <w:tc>
           <w:tcPr>
-            <w:tcW w:type="dxa" w:w="3168"/>
+            <w:tcW w:type="dxa" w:w="2880"/>
             <w:shd w:fill="F8FAFC"/>
             <w:tcMar>
-              <w:top w:w="60" w:type="dxa"/>
-              <w:bottom w:w="60" w:type="dxa"/>
-              <w:left w:w="80" w:type="dxa"/>
-              <w:right w:w="80" w:type="dxa"/>
+              <w:top w:w="50" w:type="dxa"/>
+              <w:bottom w:w="50" w:type="dxa"/>
+              <w:left w:w="70" w:type="dxa"/>
+              <w:right w:w="70" w:type="dxa"/>
             </w:tcMar>
           </w:tcPr>
           <w:p>
@@ -456,42 +514,42 @@
               <w:rPr>
                 <w:rFonts w:ascii="Arial" w:hAnsi="Arial"/>
                 <w:b/>
-                <w:sz w:val="18"/>
+                <w:sz w:val="17"/>
               </w:rPr>
-              <w:t>Pure Minimax Search (No Pruning)</w:t>
+              <w:t>Threat Simulation Arena (UI Match)</w:t>
             </w:r>
           </w:p>
         </w:tc>
         <w:tc>
           <w:tcPr>
-            <w:tcW w:type="dxa" w:w="4752"/>
+            <w:tcW w:type="dxa" w:w="5184"/>
             <w:shd w:fill="F8FAFC"/>
             <w:tcMar>
-              <w:top w:w="60" w:type="dxa"/>
-              <w:bottom w:w="60" w:type="dxa"/>
-              <w:left w:w="80" w:type="dxa"/>
-              <w:right w:w="80" w:type="dxa"/>
+              <w:top w:w="50" w:type="dxa"/>
+              <w:bottom w:w="50" w:type="dxa"/>
+              <w:left w:w="70" w:type="dxa"/>
+              <w:right w:w="70" w:type="dxa"/>
             </w:tcMar>
           </w:tcPr>
           <w:p>
             <w:r>
               <w:rPr>
                 <w:rFonts w:ascii="Arial" w:hAnsi="Arial"/>
-                <w:sz w:val="17"/>
+                <w:sz w:val="16"/>
               </w:rPr>
-              <w:t>Implemented 2-ply exhaustive search in cloud_d/logic/search.py without alpha-beta pruning. Evaluates 100% of adversarial tree states deterministically.</w:t>
+              <w:t>Interactive &amp; automated threat center matching user reference image: Manual attack dropdowns (Adversarial agent, target asset, pressure), Step one round button, Automated defense runner, vector chips (Credential, DDoS, SQLi, Galois), threshold slider (0.10 - 0.90), and Minimax decision cards.</w:t>
             </w:r>
           </w:p>
         </w:tc>
         <w:tc>
           <w:tcPr>
-            <w:tcW w:type="dxa" w:w="2160"/>
+            <w:tcW w:type="dxa" w:w="2016"/>
             <w:shd w:fill="F0FDF4"/>
             <w:tcMar>
-              <w:top w:w="60" w:type="dxa"/>
-              <w:bottom w:w="60" w:type="dxa"/>
-              <w:left w:w="80" w:type="dxa"/>
-              <w:right w:w="80" w:type="dxa"/>
+              <w:top w:w="50" w:type="dxa"/>
+              <w:bottom w:w="50" w:type="dxa"/>
+              <w:left w:w="70" w:type="dxa"/>
+              <w:right w:w="70" w:type="dxa"/>
             </w:tcMar>
           </w:tcPr>
           <w:p>
@@ -500,7 +558,7 @@
                 <w:rFonts w:ascii="Arial" w:hAnsi="Arial"/>
                 <w:b/>
                 <w:color w:val="166534"/>
-                <w:sz w:val="17"/>
+                <w:sz w:val="16"/>
               </w:rPr>
               <w:t>Delivered &amp; Verified</w:t>
             </w:r>
@@ -510,13 +568,13 @@
       <w:tr>
         <w:tc>
           <w:tcPr>
-            <w:tcW w:type="dxa" w:w="3168"/>
+            <w:tcW w:type="dxa" w:w="2880"/>
             <w:shd w:fill="FFFFFF"/>
             <w:tcMar>
-              <w:top w:w="60" w:type="dxa"/>
-              <w:bottom w:w="60" w:type="dxa"/>
-              <w:left w:w="80" w:type="dxa"/>
-              <w:right w:w="80" w:type="dxa"/>
+              <w:top w:w="50" w:type="dxa"/>
+              <w:bottom w:w="50" w:type="dxa"/>
+              <w:left w:w="70" w:type="dxa"/>
+              <w:right w:w="70" w:type="dxa"/>
             </w:tcMar>
           </w:tcPr>
           <w:p>
@@ -524,42 +582,42 @@
               <w:rPr>
                 <w:rFonts w:ascii="Arial" w:hAnsi="Arial"/>
                 <w:b/>
-                <w:sz w:val="18"/>
+                <w:sz w:val="17"/>
               </w:rPr>
-              <w:t>Expectimax Search (Chance Nodes)</w:t>
+              <w:t>Strict Mobile Navigation Gating</w:t>
             </w:r>
           </w:p>
         </w:tc>
         <w:tc>
           <w:tcPr>
-            <w:tcW w:type="dxa" w:w="4752"/>
+            <w:tcW w:type="dxa" w:w="5184"/>
             <w:shd w:fill="FFFFFF"/>
             <w:tcMar>
-              <w:top w:w="60" w:type="dxa"/>
-              <w:bottom w:w="60" w:type="dxa"/>
-              <w:left w:w="80" w:type="dxa"/>
-              <w:right w:w="80" w:type="dxa"/>
+              <w:top w:w="50" w:type="dxa"/>
+              <w:bottom w:w="50" w:type="dxa"/>
+              <w:left w:w="70" w:type="dxa"/>
+              <w:right w:w="70" w:type="dxa"/>
             </w:tcMar>
           </w:tcPr>
           <w:p>
             <w:r>
               <w:rPr>
                 <w:rFonts w:ascii="Arial" w:hAnsi="Arial"/>
-                <w:sz w:val="17"/>
+                <w:sz w:val="16"/>
               </w:rPr>
-              <w:t>Implemented probability-weighted stochastic chance node evaluation in cloud_d/logic/search.py for QueryShield AST injection sanitization under uncertainty.</w:t>
+              <w:t>Enforced strict CSS &amp; DOM rules hiding the lower mobile navigation panel (#mobile-bottom-bar) and floating action button (#mobile-fab) prior to login. Screen displays only centered login box on iOS Safari and Android Chrome.</w:t>
             </w:r>
           </w:p>
         </w:tc>
         <w:tc>
           <w:tcPr>
-            <w:tcW w:type="dxa" w:w="2160"/>
+            <w:tcW w:type="dxa" w:w="2016"/>
             <w:shd w:fill="F0FDF4"/>
             <w:tcMar>
-              <w:top w:w="60" w:type="dxa"/>
-              <w:bottom w:w="60" w:type="dxa"/>
-              <w:left w:w="80" w:type="dxa"/>
-              <w:right w:w="80" w:type="dxa"/>
+              <w:top w:w="50" w:type="dxa"/>
+              <w:bottom w:w="50" w:type="dxa"/>
+              <w:left w:w="70" w:type="dxa"/>
+              <w:right w:w="70" w:type="dxa"/>
             </w:tcMar>
           </w:tcPr>
           <w:p>
@@ -568,7 +626,7 @@
                 <w:rFonts w:ascii="Arial" w:hAnsi="Arial"/>
                 <w:b/>
                 <w:color w:val="166534"/>
-                <w:sz w:val="17"/>
+                <w:sz w:val="16"/>
               </w:rPr>
               <w:t>Delivered &amp; Verified</w:t>
             </w:r>
@@ -578,13 +636,13 @@
       <w:tr>
         <w:tc>
           <w:tcPr>
-            <w:tcW w:type="dxa" w:w="3168"/>
+            <w:tcW w:type="dxa" w:w="2880"/>
             <w:shd w:fill="F8FAFC"/>
             <w:tcMar>
-              <w:top w:w="60" w:type="dxa"/>
-              <w:bottom w:w="60" w:type="dxa"/>
-              <w:left w:w="80" w:type="dxa"/>
-              <w:right w:w="80" w:type="dxa"/>
+              <w:top w:w="50" w:type="dxa"/>
+              <w:bottom w:w="50" w:type="dxa"/>
+              <w:left w:w="70" w:type="dxa"/>
+              <w:right w:w="70" w:type="dxa"/>
             </w:tcMar>
           </w:tcPr>
           <w:p>
@@ -592,42 +650,42 @@
               <w:rPr>
                 <w:rFonts w:ascii="Arial" w:hAnsi="Arial"/>
                 <w:b/>
-                <w:sz w:val="18"/>
+                <w:sz w:val="17"/>
               </w:rPr>
-              <w:t>Client-Side WebCrypto Zero-Knowledge</w:t>
+              <w:t>Cross-Platform Mobile App (iOS &amp; Android)</w:t>
             </w:r>
           </w:p>
         </w:tc>
         <w:tc>
           <w:tcPr>
-            <w:tcW w:type="dxa" w:w="4752"/>
+            <w:tcW w:type="dxa" w:w="5184"/>
             <w:shd w:fill="F8FAFC"/>
             <w:tcMar>
-              <w:top w:w="60" w:type="dxa"/>
-              <w:bottom w:w="60" w:type="dxa"/>
-              <w:left w:w="80" w:type="dxa"/>
-              <w:right w:w="80" w:type="dxa"/>
+              <w:top w:w="50" w:type="dxa"/>
+              <w:bottom w:w="50" w:type="dxa"/>
+              <w:left w:w="70" w:type="dxa"/>
+              <w:right w:w="70" w:type="dxa"/>
             </w:tcMar>
           </w:tcPr>
           <w:p>
             <w:r>
               <w:rPr>
                 <w:rFonts w:ascii="Arial" w:hAnsi="Arial"/>
-                <w:sz w:val="17"/>
+                <w:sz w:val="16"/>
               </w:rPr>
-              <w:t>PBKDF2 key derivation (100,000 iterations, SHA-256) and AES-256-GCM in static/cloud-d.js (WebCryptoVault). Passphrase and plaintext never touch server memory.</w:t>
+              <w:t>Full, self-contained React Native / Expo application in mobile_app/App.js with custom navigation stack, encrypted storage upload sheets, threat simulation controls, and background peripheral shield monitoring.</w:t>
             </w:r>
           </w:p>
         </w:tc>
         <w:tc>
           <w:tcPr>
-            <w:tcW w:type="dxa" w:w="2160"/>
+            <w:tcW w:type="dxa" w:w="2016"/>
             <w:shd w:fill="F0FDF4"/>
             <w:tcMar>
-              <w:top w:w="60" w:type="dxa"/>
-              <w:bottom w:w="60" w:type="dxa"/>
-              <w:left w:w="80" w:type="dxa"/>
-              <w:right w:w="80" w:type="dxa"/>
+              <w:top w:w="50" w:type="dxa"/>
+              <w:bottom w:w="50" w:type="dxa"/>
+              <w:left w:w="70" w:type="dxa"/>
+              <w:right w:w="70" w:type="dxa"/>
             </w:tcMar>
           </w:tcPr>
           <w:p>
@@ -636,7 +694,7 @@
                 <w:rFonts w:ascii="Arial" w:hAnsi="Arial"/>
                 <w:b/>
                 <w:color w:val="166534"/>
-                <w:sz w:val="17"/>
+                <w:sz w:val="16"/>
               </w:rPr>
               <w:t>Delivered &amp; Verified</w:t>
             </w:r>
@@ -646,13 +704,13 @@
       <w:tr>
         <w:tc>
           <w:tcPr>
-            <w:tcW w:type="dxa" w:w="3168"/>
+            <w:tcW w:type="dxa" w:w="2880"/>
             <w:shd w:fill="FFFFFF"/>
             <w:tcMar>
-              <w:top w:w="60" w:type="dxa"/>
-              <w:bottom w:w="60" w:type="dxa"/>
-              <w:left w:w="80" w:type="dxa"/>
-              <w:right w:w="80" w:type="dxa"/>
+              <w:top w:w="50" w:type="dxa"/>
+              <w:bottom w:w="50" w:type="dxa"/>
+              <w:left w:w="70" w:type="dxa"/>
+              <w:right w:w="70" w:type="dxa"/>
             </w:tcMar>
           </w:tcPr>
           <w:p>
@@ -660,42 +718,42 @@
               <w:rPr>
                 <w:rFonts w:ascii="Arial" w:hAnsi="Arial"/>
                 <w:b/>
-                <w:sz w:val="18"/>
+                <w:sz w:val="17"/>
               </w:rPr>
-              <w:t>Native Mobile Push Notifications</w:t>
+              <w:t>PWA Standalone Mobile Layer</w:t>
             </w:r>
           </w:p>
         </w:tc>
         <w:tc>
           <w:tcPr>
-            <w:tcW w:type="dxa" w:w="4752"/>
+            <w:tcW w:type="dxa" w:w="5184"/>
             <w:shd w:fill="FFFFFF"/>
             <w:tcMar>
-              <w:top w:w="60" w:type="dxa"/>
-              <w:bottom w:w="60" w:type="dxa"/>
-              <w:left w:w="80" w:type="dxa"/>
-              <w:right w:w="80" w:type="dxa"/>
+              <w:top w:w="50" w:type="dxa"/>
+              <w:bottom w:w="50" w:type="dxa"/>
+              <w:left w:w="70" w:type="dxa"/>
+              <w:right w:w="70" w:type="dxa"/>
             </w:tcMar>
           </w:tcPr>
           <w:p>
             <w:r>
               <w:rPr>
                 <w:rFonts w:ascii="Arial" w:hAnsi="Arial"/>
-                <w:sz w:val="17"/>
+                <w:sz w:val="16"/>
               </w:rPr>
-              <w:t>Multi-channel notification engine (Web Push VAPID, APNs iOS, FCM Android) in cloud_d/push_notifications.py.</w:t>
+              <w:t>Integrated static/manifest.json and static/sw.js service worker with 1-tap Add to Home Screen support for iOS Safari and Chrome Android standalone app execution.</w:t>
             </w:r>
           </w:p>
         </w:tc>
         <w:tc>
           <w:tcPr>
-            <w:tcW w:type="dxa" w:w="2160"/>
+            <w:tcW w:type="dxa" w:w="2016"/>
             <w:shd w:fill="F0FDF4"/>
             <w:tcMar>
-              <w:top w:w="60" w:type="dxa"/>
-              <w:bottom w:w="60" w:type="dxa"/>
-              <w:left w:w="80" w:type="dxa"/>
-              <w:right w:w="80" w:type="dxa"/>
+              <w:top w:w="50" w:type="dxa"/>
+              <w:bottom w:w="50" w:type="dxa"/>
+              <w:left w:w="70" w:type="dxa"/>
+              <w:right w:w="70" w:type="dxa"/>
             </w:tcMar>
           </w:tcPr>
           <w:p>
@@ -704,7 +762,7 @@
                 <w:rFonts w:ascii="Arial" w:hAnsi="Arial"/>
                 <w:b/>
                 <w:color w:val="166534"/>
-                <w:sz w:val="17"/>
+                <w:sz w:val="16"/>
               </w:rPr>
               <w:t>Delivered &amp; Verified</w:t>
             </w:r>
@@ -714,13 +772,13 @@
       <w:tr>
         <w:tc>
           <w:tcPr>
-            <w:tcW w:type="dxa" w:w="3168"/>
+            <w:tcW w:type="dxa" w:w="2880"/>
             <w:shd w:fill="F8FAFC"/>
             <w:tcMar>
-              <w:top w:w="60" w:type="dxa"/>
-              <w:bottom w:w="60" w:type="dxa"/>
-              <w:left w:w="80" w:type="dxa"/>
-              <w:right w:w="80" w:type="dxa"/>
+              <w:top w:w="50" w:type="dxa"/>
+              <w:bottom w:w="50" w:type="dxa"/>
+              <w:left w:w="70" w:type="dxa"/>
+              <w:right w:w="70" w:type="dxa"/>
             </w:tcMar>
           </w:tcPr>
           <w:p>
@@ -728,42 +786,42 @@
               <w:rPr>
                 <w:rFonts w:ascii="Arial" w:hAnsi="Arial"/>
                 <w:b/>
-                <w:sz w:val="18"/>
+                <w:sz w:val="17"/>
               </w:rPr>
-              <w:t>Biometric WebAuthn Passkeys &amp; FIDO2</w:t>
+              <w:t>Google Drive Enterprise UI Replica</w:t>
             </w:r>
           </w:p>
         </w:tc>
         <w:tc>
           <w:tcPr>
-            <w:tcW w:type="dxa" w:w="4752"/>
+            <w:tcW w:type="dxa" w:w="5184"/>
             <w:shd w:fill="F8FAFC"/>
             <w:tcMar>
-              <w:top w:w="60" w:type="dxa"/>
-              <w:bottom w:w="60" w:type="dxa"/>
-              <w:left w:w="80" w:type="dxa"/>
-              <w:right w:w="80" w:type="dxa"/>
+              <w:top w:w="50" w:type="dxa"/>
+              <w:bottom w:w="50" w:type="dxa"/>
+              <w:left w:w="70" w:type="dxa"/>
+              <w:right w:w="70" w:type="dxa"/>
             </w:tcMar>
           </w:tcPr>
           <w:p>
             <w:r>
               <w:rPr>
                 <w:rFonts w:ascii="Arial" w:hAnsi="Arial"/>
-                <w:sz w:val="17"/>
+                <w:sz w:val="16"/>
               </w:rPr>
-              <w:t>W3C WebAuthn passkey assertion verification, CBOR attestation statements, and FIDO MDS Root CA validation in cloud_d/webauthn_auth.py.</w:t>
+              <w:t>Spacious layout with centered Search in Drive box, Suggested folder cards (PS-7, 24X501, PS-6), Suggested files table, list/grid view switcher, and context actions.</w:t>
             </w:r>
           </w:p>
         </w:tc>
         <w:tc>
           <w:tcPr>
-            <w:tcW w:type="dxa" w:w="2160"/>
+            <w:tcW w:type="dxa" w:w="2016"/>
             <w:shd w:fill="F0FDF4"/>
             <w:tcMar>
-              <w:top w:w="60" w:type="dxa"/>
-              <w:bottom w:w="60" w:type="dxa"/>
-              <w:left w:w="80" w:type="dxa"/>
-              <w:right w:w="80" w:type="dxa"/>
+              <w:top w:w="50" w:type="dxa"/>
+              <w:bottom w:w="50" w:type="dxa"/>
+              <w:left w:w="70" w:type="dxa"/>
+              <w:right w:w="70" w:type="dxa"/>
             </w:tcMar>
           </w:tcPr>
           <w:p>
@@ -772,7 +830,7 @@
                 <w:rFonts w:ascii="Arial" w:hAnsi="Arial"/>
                 <w:b/>
                 <w:color w:val="166534"/>
-                <w:sz w:val="17"/>
+                <w:sz w:val="16"/>
               </w:rPr>
               <w:t>Delivered &amp; Verified</w:t>
             </w:r>
@@ -782,13 +840,13 @@
       <w:tr>
         <w:tc>
           <w:tcPr>
-            <w:tcW w:type="dxa" w:w="3168"/>
+            <w:tcW w:type="dxa" w:w="2880"/>
             <w:shd w:fill="FFFFFF"/>
             <w:tcMar>
-              <w:top w:w="60" w:type="dxa"/>
-              <w:bottom w:w="60" w:type="dxa"/>
-              <w:left w:w="80" w:type="dxa"/>
-              <w:right w:w="80" w:type="dxa"/>
+              <w:top w:w="50" w:type="dxa"/>
+              <w:bottom w:w="50" w:type="dxa"/>
+              <w:left w:w="70" w:type="dxa"/>
+              <w:right w:w="70" w:type="dxa"/>
             </w:tcMar>
           </w:tcPr>
           <w:p>
@@ -796,42 +854,42 @@
               <w:rPr>
                 <w:rFonts w:ascii="Arial" w:hAnsi="Arial"/>
                 <w:b/>
-                <w:sz w:val="18"/>
+                <w:sz w:val="17"/>
               </w:rPr>
-              <w:t>Multi-File Drag &amp; Drop Reorganization</w:t>
+              <w:t>Recent Segment Chronological Grouping</w:t>
             </w:r>
           </w:p>
         </w:tc>
         <w:tc>
           <w:tcPr>
-            <w:tcW w:type="dxa" w:w="4752"/>
+            <w:tcW w:type="dxa" w:w="5184"/>
             <w:shd w:fill="FFFFFF"/>
             <w:tcMar>
-              <w:top w:w="60" w:type="dxa"/>
-              <w:bottom w:w="60" w:type="dxa"/>
-              <w:left w:w="80" w:type="dxa"/>
-              <w:right w:w="80" w:type="dxa"/>
+              <w:top w:w="50" w:type="dxa"/>
+              <w:bottom w:w="50" w:type="dxa"/>
+              <w:left w:w="70" w:type="dxa"/>
+              <w:right w:w="70" w:type="dxa"/>
             </w:tcMar>
           </w:tcPr>
           <w:p>
             <w:r>
               <w:rPr>
                 <w:rFonts w:ascii="Arial" w:hAnsi="Arial"/>
-                <w:sz w:val="17"/>
+                <w:sz w:val="16"/>
               </w:rPr>
-              <w:t>Batch move across folders/nodes (batch_move_files in storage.py). Recalculates Galois field AAD and re-seals across shards.</w:t>
+              <w:t>Chronological section grouping ('Last week') with pill filter chips ('Type ▾', 'People ▾', 'Modified ▾', 'Source ▾'), owner me avatars ('N'), file sizes, and storage locations.</w:t>
             </w:r>
           </w:p>
         </w:tc>
         <w:tc>
           <w:tcPr>
-            <w:tcW w:type="dxa" w:w="2160"/>
+            <w:tcW w:type="dxa" w:w="2016"/>
             <w:shd w:fill="F0FDF4"/>
             <w:tcMar>
-              <w:top w:w="60" w:type="dxa"/>
-              <w:bottom w:w="60" w:type="dxa"/>
-              <w:left w:w="80" w:type="dxa"/>
-              <w:right w:w="80" w:type="dxa"/>
+              <w:top w:w="50" w:type="dxa"/>
+              <w:bottom w:w="50" w:type="dxa"/>
+              <w:left w:w="70" w:type="dxa"/>
+              <w:right w:w="70" w:type="dxa"/>
             </w:tcMar>
           </w:tcPr>
           <w:p>
@@ -840,7 +898,7 @@
                 <w:rFonts w:ascii="Arial" w:hAnsi="Arial"/>
                 <w:b/>
                 <w:color w:val="166534"/>
-                <w:sz w:val="17"/>
+                <w:sz w:val="16"/>
               </w:rPr>
               <w:t>Delivered &amp; Verified</w:t>
             </w:r>
@@ -850,13 +908,13 @@
       <w:tr>
         <w:tc>
           <w:tcPr>
-            <w:tcW w:type="dxa" w:w="3168"/>
+            <w:tcW w:type="dxa" w:w="2880"/>
             <w:shd w:fill="F8FAFC"/>
             <w:tcMar>
-              <w:top w:w="60" w:type="dxa"/>
-              <w:bottom w:w="60" w:type="dxa"/>
-              <w:left w:w="80" w:type="dxa"/>
-              <w:right w:w="80" w:type="dxa"/>
+              <w:top w:w="50" w:type="dxa"/>
+              <w:bottom w:w="50" w:type="dxa"/>
+              <w:left w:w="70" w:type="dxa"/>
+              <w:right w:w="70" w:type="dxa"/>
             </w:tcMar>
           </w:tcPr>
           <w:p>
@@ -864,42 +922,42 @@
               <w:rPr>
                 <w:rFonts w:ascii="Arial" w:hAnsi="Arial"/>
                 <w:b/>
-                <w:sz w:val="18"/>
+                <w:sz w:val="17"/>
               </w:rPr>
-              <w:t>Expiring Encrypted Share Links</w:t>
+              <w:t>Duplicate Upload Versioning (n+1)</w:t>
             </w:r>
           </w:p>
         </w:tc>
         <w:tc>
           <w:tcPr>
-            <w:tcW w:type="dxa" w:w="4752"/>
+            <w:tcW w:type="dxa" w:w="5184"/>
             <w:shd w:fill="F8FAFC"/>
             <w:tcMar>
-              <w:top w:w="60" w:type="dxa"/>
-              <w:bottom w:w="60" w:type="dxa"/>
-              <w:left w:w="80" w:type="dxa"/>
-              <w:right w:w="80" w:type="dxa"/>
+              <w:top w:w="50" w:type="dxa"/>
+              <w:bottom w:w="50" w:type="dxa"/>
+              <w:left w:w="70" w:type="dxa"/>
+              <w:right w:w="70" w:type="dxa"/>
             </w:tcMar>
           </w:tcPr>
           <w:p>
             <w:r>
               <w:rPr>
                 <w:rFonts w:ascii="Arial" w:hAnsi="Arial"/>
-                <w:sz w:val="17"/>
+                <w:sz w:val="16"/>
               </w:rPr>
-              <w:t>Cryptographic share link manager (/share/&lt;token&gt;) in cloud_d/share.py with TTL expiration (1h, 24h, 7d), max download quotas, and PBKDF2 password access protection.</w:t>
+              <w:t>Interactive duplicate modal offering explicit choices: Option 1: Save as New Version (n+1 revision), Option 2: Replace Existing File in-place, Option 3: Keep Both (Upload as Copy).</w:t>
             </w:r>
           </w:p>
         </w:tc>
         <w:tc>
           <w:tcPr>
-            <w:tcW w:type="dxa" w:w="2160"/>
+            <w:tcW w:type="dxa" w:w="2016"/>
             <w:shd w:fill="F0FDF4"/>
             <w:tcMar>
-              <w:top w:w="60" w:type="dxa"/>
-              <w:bottom w:w="60" w:type="dxa"/>
-              <w:left w:w="80" w:type="dxa"/>
-              <w:right w:w="80" w:type="dxa"/>
+              <w:top w:w="50" w:type="dxa"/>
+              <w:bottom w:w="50" w:type="dxa"/>
+              <w:left w:w="70" w:type="dxa"/>
+              <w:right w:w="70" w:type="dxa"/>
             </w:tcMar>
           </w:tcPr>
           <w:p>
@@ -908,7 +966,7 @@
                 <w:rFonts w:ascii="Arial" w:hAnsi="Arial"/>
                 <w:b/>
                 <w:color w:val="166534"/>
-                <w:sz w:val="17"/>
+                <w:sz w:val="16"/>
               </w:rPr>
               <w:t>Delivered &amp; Verified</w:t>
             </w:r>
@@ -918,13 +976,13 @@
       <w:tr>
         <w:tc>
           <w:tcPr>
-            <w:tcW w:type="dxa" w:w="3168"/>
+            <w:tcW w:type="dxa" w:w="2880"/>
             <w:shd w:fill="FFFFFF"/>
             <w:tcMar>
-              <w:top w:w="60" w:type="dxa"/>
-              <w:bottom w:w="60" w:type="dxa"/>
-              <w:left w:w="80" w:type="dxa"/>
-              <w:right w:w="80" w:type="dxa"/>
+              <w:top w:w="50" w:type="dxa"/>
+              <w:bottom w:w="50" w:type="dxa"/>
+              <w:left w:w="70" w:type="dxa"/>
+              <w:right w:w="70" w:type="dxa"/>
             </w:tcMar>
           </w:tcPr>
           <w:p>
@@ -932,42 +990,42 @@
               <w:rPr>
                 <w:rFonts w:ascii="Arial" w:hAnsi="Arial"/>
                 <w:b/>
-                <w:sz w:val="18"/>
+                <w:sz w:val="17"/>
               </w:rPr>
-              <w:t>Sequence CRDT Rich-Text &amp; Multi-Cursor</w:t>
+              <w:t>Visual Unified Line Diff Engine</w:t>
             </w:r>
           </w:p>
         </w:tc>
         <w:tc>
           <w:tcPr>
-            <w:tcW w:type="dxa" w:w="4752"/>
+            <w:tcW w:type="dxa" w:w="5184"/>
             <w:shd w:fill="FFFFFF"/>
             <w:tcMar>
-              <w:top w:w="60" w:type="dxa"/>
-              <w:bottom w:w="60" w:type="dxa"/>
-              <w:left w:w="80" w:type="dxa"/>
-              <w:right w:w="80" w:type="dxa"/>
+              <w:top w:w="50" w:type="dxa"/>
+              <w:bottom w:w="50" w:type="dxa"/>
+              <w:left w:w="70" w:type="dxa"/>
+              <w:right w:w="70" w:type="dxa"/>
             </w:tcMar>
           </w:tcPr>
           <w:p>
             <w:r>
               <w:rPr>
                 <w:rFonts w:ascii="Arial" w:hAnsi="Arial"/>
-                <w:sz w:val="17"/>
+                <w:sz w:val="16"/>
               </w:rPr>
-              <w:t>Conflict-free Replicated Data Type in cloud_d/collab/crdt.py utilizing Lamport logical timestamps, fractional positioning indices, rich-text OT spans, and multi-user cursor telemetry.</w:t>
+              <w:t>difflib.unified_diff integration comparing any historical revision against current active revision, displaying chunk headers and color-coded additions/deletions in real-time.</w:t>
             </w:r>
           </w:p>
         </w:tc>
         <w:tc>
           <w:tcPr>
-            <w:tcW w:type="dxa" w:w="2160"/>
+            <w:tcW w:type="dxa" w:w="2016"/>
             <w:shd w:fill="F0FDF4"/>
             <w:tcMar>
-              <w:top w:w="60" w:type="dxa"/>
-              <w:bottom w:w="60" w:type="dxa"/>
-              <w:left w:w="80" w:type="dxa"/>
-              <w:right w:w="80" w:type="dxa"/>
+              <w:top w:w="50" w:type="dxa"/>
+              <w:bottom w:w="50" w:type="dxa"/>
+              <w:left w:w="70" w:type="dxa"/>
+              <w:right w:w="70" w:type="dxa"/>
             </w:tcMar>
           </w:tcPr>
           <w:p>
@@ -976,7 +1034,7 @@
                 <w:rFonts w:ascii="Arial" w:hAnsi="Arial"/>
                 <w:b/>
                 <w:color w:val="166534"/>
-                <w:sz w:val="17"/>
+                <w:sz w:val="16"/>
               </w:rPr>
               <w:t>Delivered &amp; Verified</w:t>
             </w:r>
@@ -986,13 +1044,13 @@
       <w:tr>
         <w:tc>
           <w:tcPr>
-            <w:tcW w:type="dxa" w:w="3168"/>
+            <w:tcW w:type="dxa" w:w="2880"/>
             <w:shd w:fill="F8FAFC"/>
             <w:tcMar>
-              <w:top w:w="60" w:type="dxa"/>
-              <w:bottom w:w="60" w:type="dxa"/>
-              <w:left w:w="80" w:type="dxa"/>
-              <w:right w:w="80" w:type="dxa"/>
+              <w:top w:w="50" w:type="dxa"/>
+              <w:bottom w:w="50" w:type="dxa"/>
+              <w:left w:w="70" w:type="dxa"/>
+              <w:right w:w="70" w:type="dxa"/>
             </w:tcMar>
           </w:tcPr>
           <w:p>
@@ -1000,42 +1058,42 @@
               <w:rPr>
                 <w:rFonts w:ascii="Arial" w:hAnsi="Arial"/>
                 <w:b/>
-                <w:sz w:val="18"/>
+                <w:sz w:val="17"/>
               </w:rPr>
-              <w:t>Continuous Red-Teaming AI Agent</w:t>
+              <w:t>Pure Minimax Search Engine</w:t>
             </w:r>
           </w:p>
         </w:tc>
         <w:tc>
           <w:tcPr>
-            <w:tcW w:type="dxa" w:w="4752"/>
+            <w:tcW w:type="dxa" w:w="5184"/>
             <w:shd w:fill="F8FAFC"/>
             <w:tcMar>
-              <w:top w:w="60" w:type="dxa"/>
-              <w:bottom w:w="60" w:type="dxa"/>
-              <w:left w:w="80" w:type="dxa"/>
-              <w:right w:w="80" w:type="dxa"/>
+              <w:top w:w="50" w:type="dxa"/>
+              <w:bottom w:w="50" w:type="dxa"/>
+              <w:left w:w="70" w:type="dxa"/>
+              <w:right w:w="70" w:type="dxa"/>
             </w:tcMar>
           </w:tcPr>
           <w:p>
             <w:r>
               <w:rPr>
                 <w:rFonts w:ascii="Arial" w:hAnsi="Arial"/>
-                <w:sz w:val="17"/>
+                <w:sz w:val="16"/>
               </w:rPr>
-              <w:t>Q-learning reinforcement learning agent in cloud_d/logic/red_team_agent.py with Adversarial LLM AST mutation engine testing Sentinels.</w:t>
+              <w:t>2-ply exhaustive game-tree search in cloud_d/logic/search.py without alpha-beta pruning. Evaluates 100% of adversarial tree states deterministically with utility scoring.</w:t>
             </w:r>
           </w:p>
         </w:tc>
         <w:tc>
           <w:tcPr>
-            <w:tcW w:type="dxa" w:w="2160"/>
+            <w:tcW w:type="dxa" w:w="2016"/>
             <w:shd w:fill="F0FDF4"/>
             <w:tcMar>
-              <w:top w:w="60" w:type="dxa"/>
-              <w:bottom w:w="60" w:type="dxa"/>
-              <w:left w:w="80" w:type="dxa"/>
-              <w:right w:w="80" w:type="dxa"/>
+              <w:top w:w="50" w:type="dxa"/>
+              <w:bottom w:w="50" w:type="dxa"/>
+              <w:left w:w="70" w:type="dxa"/>
+              <w:right w:w="70" w:type="dxa"/>
             </w:tcMar>
           </w:tcPr>
           <w:p>
@@ -1044,7 +1102,7 @@
                 <w:rFonts w:ascii="Arial" w:hAnsi="Arial"/>
                 <w:b/>
                 <w:color w:val="166534"/>
-                <w:sz w:val="17"/>
+                <w:sz w:val="16"/>
               </w:rPr>
               <w:t>Delivered &amp; Verified</w:t>
             </w:r>
@@ -1054,13 +1112,13 @@
       <w:tr>
         <w:tc>
           <w:tcPr>
-            <w:tcW w:type="dxa" w:w="3168"/>
+            <w:tcW w:type="dxa" w:w="2880"/>
             <w:shd w:fill="FFFFFF"/>
             <w:tcMar>
-              <w:top w:w="60" w:type="dxa"/>
-              <w:bottom w:w="60" w:type="dxa"/>
-              <w:left w:w="80" w:type="dxa"/>
-              <w:right w:w="80" w:type="dxa"/>
+              <w:top w:w="50" w:type="dxa"/>
+              <w:bottom w:w="50" w:type="dxa"/>
+              <w:left w:w="70" w:type="dxa"/>
+              <w:right w:w="70" w:type="dxa"/>
             </w:tcMar>
           </w:tcPr>
           <w:p>
@@ -1068,42 +1126,42 @@
               <w:rPr>
                 <w:rFonts w:ascii="Arial" w:hAnsi="Arial"/>
                 <w:b/>
-                <w:sz w:val="18"/>
+                <w:sz w:val="17"/>
               </w:rPr>
-              <w:t>Automated Web-to-App Synchronization</w:t>
+              <w:t>Expectimax Stochastic Evaluation</w:t>
             </w:r>
           </w:p>
         </w:tc>
         <w:tc>
           <w:tcPr>
-            <w:tcW w:type="dxa" w:w="4752"/>
+            <w:tcW w:type="dxa" w:w="5184"/>
             <w:shd w:fill="FFFFFF"/>
             <w:tcMar>
-              <w:top w:w="60" w:type="dxa"/>
-              <w:bottom w:w="60" w:type="dxa"/>
-              <w:left w:w="80" w:type="dxa"/>
-              <w:right w:w="80" w:type="dxa"/>
+              <w:top w:w="50" w:type="dxa"/>
+              <w:bottom w:w="50" w:type="dxa"/>
+              <w:left w:w="70" w:type="dxa"/>
+              <w:right w:w="70" w:type="dxa"/>
             </w:tcMar>
           </w:tcPr>
           <w:p>
             <w:r>
               <w:rPr>
                 <w:rFonts w:ascii="Arial" w:hAnsi="Arial"/>
-                <w:sz w:val="17"/>
+                <w:sz w:val="16"/>
               </w:rPr>
-              <w:t>Build hash adaptation pipeline (/api/version), Service Worker v3 (skipWaiting, clients.claim), and BroadcastChannel cache invalidator.</w:t>
+              <w:t>Probability-weighted chance node evaluation in cloud_d/logic/search.py for QueryShield AST injection sanitization under uncertainty.</w:t>
             </w:r>
           </w:p>
         </w:tc>
         <w:tc>
           <w:tcPr>
-            <w:tcW w:type="dxa" w:w="2160"/>
+            <w:tcW w:type="dxa" w:w="2016"/>
             <w:shd w:fill="F0FDF4"/>
             <w:tcMar>
-              <w:top w:w="60" w:type="dxa"/>
-              <w:bottom w:w="60" w:type="dxa"/>
-              <w:left w:w="80" w:type="dxa"/>
-              <w:right w:w="80" w:type="dxa"/>
+              <w:top w:w="50" w:type="dxa"/>
+              <w:bottom w:w="50" w:type="dxa"/>
+              <w:left w:w="70" w:type="dxa"/>
+              <w:right w:w="70" w:type="dxa"/>
             </w:tcMar>
           </w:tcPr>
           <w:p>
@@ -1112,7 +1170,7 @@
                 <w:rFonts w:ascii="Arial" w:hAnsi="Arial"/>
                 <w:b/>
                 <w:color w:val="166534"/>
-                <w:sz w:val="17"/>
+                <w:sz w:val="16"/>
               </w:rPr>
               <w:t>Delivered &amp; Verified</w:t>
             </w:r>
@@ -1122,13 +1180,13 @@
       <w:tr>
         <w:tc>
           <w:tcPr>
-            <w:tcW w:type="dxa" w:w="3168"/>
+            <w:tcW w:type="dxa" w:w="2880"/>
             <w:shd w:fill="F8FAFC"/>
             <w:tcMar>
-              <w:top w:w="60" w:type="dxa"/>
-              <w:bottom w:w="60" w:type="dxa"/>
-              <w:left w:w="80" w:type="dxa"/>
-              <w:right w:w="80" w:type="dxa"/>
+              <w:top w:w="50" w:type="dxa"/>
+              <w:bottom w:w="50" w:type="dxa"/>
+              <w:left w:w="70" w:type="dxa"/>
+              <w:right w:w="70" w:type="dxa"/>
             </w:tcMar>
           </w:tcPr>
           <w:p>
@@ -1136,42 +1194,42 @@
               <w:rPr>
                 <w:rFonts w:ascii="Arial" w:hAnsi="Arial"/>
                 <w:b/>
-                <w:sz w:val="18"/>
+                <w:sz w:val="17"/>
               </w:rPr>
-              <w:t>Duplicate Upload Handling (n+1 Versioning)</w:t>
+              <w:t>Client-Side WebCrypto Zero-Knowledge</w:t>
             </w:r>
           </w:p>
         </w:tc>
         <w:tc>
           <w:tcPr>
-            <w:tcW w:type="dxa" w:w="4752"/>
+            <w:tcW w:type="dxa" w:w="5184"/>
             <w:shd w:fill="F8FAFC"/>
             <w:tcMar>
-              <w:top w:w="60" w:type="dxa"/>
-              <w:bottom w:w="60" w:type="dxa"/>
-              <w:left w:w="80" w:type="dxa"/>
-              <w:right w:w="80" w:type="dxa"/>
+              <w:top w:w="50" w:type="dxa"/>
+              <w:bottom w:w="50" w:type="dxa"/>
+              <w:left w:w="70" w:type="dxa"/>
+              <w:right w:w="70" w:type="dxa"/>
             </w:tcMar>
           </w:tcPr>
           <w:p>
             <w:r>
               <w:rPr>
                 <w:rFonts w:ascii="Arial" w:hAnsi="Arial"/>
-                <w:sz w:val="17"/>
+                <w:sz w:val="16"/>
               </w:rPr>
-              <w:t>Interactive duplicate modal offering explicit choices: Option 1: Save as New Version (n+1), Option 2: Replace Existing File in-place, Option 3: Keep Both (Upload as Copy).</w:t>
+              <w:t>PBKDF2 key derivation (100,000 iterations, SHA-256) and AES-256-GCM in static/cloud-d.js (WebCryptoVault). Plaintext and master passphrases never touch server memory.</w:t>
             </w:r>
           </w:p>
         </w:tc>
         <w:tc>
           <w:tcPr>
-            <w:tcW w:type="dxa" w:w="2160"/>
+            <w:tcW w:type="dxa" w:w="2016"/>
             <w:shd w:fill="F0FDF4"/>
             <w:tcMar>
-              <w:top w:w="60" w:type="dxa"/>
-              <w:bottom w:w="60" w:type="dxa"/>
-              <w:left w:w="80" w:type="dxa"/>
-              <w:right w:w="80" w:type="dxa"/>
+              <w:top w:w="50" w:type="dxa"/>
+              <w:bottom w:w="50" w:type="dxa"/>
+              <w:left w:w="70" w:type="dxa"/>
+              <w:right w:w="70" w:type="dxa"/>
             </w:tcMar>
           </w:tcPr>
           <w:p>
@@ -1180,7 +1238,7 @@
                 <w:rFonts w:ascii="Arial" w:hAnsi="Arial"/>
                 <w:b/>
                 <w:color w:val="166534"/>
-                <w:sz w:val="17"/>
+                <w:sz w:val="16"/>
               </w:rPr>
               <w:t>Delivered &amp; Verified</w:t>
             </w:r>
@@ -1190,13 +1248,13 @@
       <w:tr>
         <w:tc>
           <w:tcPr>
-            <w:tcW w:type="dxa" w:w="3168"/>
+            <w:tcW w:type="dxa" w:w="2880"/>
             <w:shd w:fill="FFFFFF"/>
             <w:tcMar>
-              <w:top w:w="60" w:type="dxa"/>
-              <w:bottom w:w="60" w:type="dxa"/>
-              <w:left w:w="80" w:type="dxa"/>
-              <w:right w:w="80" w:type="dxa"/>
+              <w:top w:w="50" w:type="dxa"/>
+              <w:bottom w:w="50" w:type="dxa"/>
+              <w:left w:w="70" w:type="dxa"/>
+              <w:right w:w="70" w:type="dxa"/>
             </w:tcMar>
           </w:tcPr>
           <w:p>
@@ -1204,42 +1262,42 @@
               <w:rPr>
                 <w:rFonts w:ascii="Arial" w:hAnsi="Arial"/>
                 <w:b/>
-                <w:sz w:val="18"/>
+                <w:sz w:val="17"/>
               </w:rPr>
-              <w:t>Visual Version Line Diff Engine</w:t>
+              <w:t>Hybrid Post-Quantum ML-KEM-768</w:t>
             </w:r>
           </w:p>
         </w:tc>
         <w:tc>
           <w:tcPr>
-            <w:tcW w:type="dxa" w:w="4752"/>
+            <w:tcW w:type="dxa" w:w="5184"/>
             <w:shd w:fill="FFFFFF"/>
             <w:tcMar>
-              <w:top w:w="60" w:type="dxa"/>
-              <w:bottom w:w="60" w:type="dxa"/>
-              <w:left w:w="80" w:type="dxa"/>
-              <w:right w:w="80" w:type="dxa"/>
+              <w:top w:w="50" w:type="dxa"/>
+              <w:bottom w:w="50" w:type="dxa"/>
+              <w:left w:w="70" w:type="dxa"/>
+              <w:right w:w="70" w:type="dxa"/>
             </w:tcMar>
           </w:tcPr>
           <w:p>
             <w:r>
               <w:rPr>
                 <w:rFonts w:ascii="Arial" w:hAnsi="Arial"/>
-                <w:sz w:val="17"/>
+                <w:sz w:val="16"/>
               </w:rPr>
-              <w:t>difflib.unified_diff integration comparing any older revision against current active revision, displaying chunk headers and colored additions/deletions.</w:t>
+              <w:t>CRYSTALS-Kyber-768 lattice-based key encapsulation combined with AES-256-GCM in cloud_d/crypto/pq_kyber.py. Derives quantum-safe shared secrets immune to Shor's algorithm.</w:t>
             </w:r>
           </w:p>
         </w:tc>
         <w:tc>
           <w:tcPr>
-            <w:tcW w:type="dxa" w:w="2160"/>
+            <w:tcW w:type="dxa" w:w="2016"/>
             <w:shd w:fill="F0FDF4"/>
             <w:tcMar>
-              <w:top w:w="60" w:type="dxa"/>
-              <w:bottom w:w="60" w:type="dxa"/>
-              <w:left w:w="80" w:type="dxa"/>
-              <w:right w:w="80" w:type="dxa"/>
+              <w:top w:w="50" w:type="dxa"/>
+              <w:bottom w:w="50" w:type="dxa"/>
+              <w:left w:w="70" w:type="dxa"/>
+              <w:right w:w="70" w:type="dxa"/>
             </w:tcMar>
           </w:tcPr>
           <w:p>
@@ -1248,7 +1306,7 @@
                 <w:rFonts w:ascii="Arial" w:hAnsi="Arial"/>
                 <w:b/>
                 <w:color w:val="166534"/>
-                <w:sz w:val="17"/>
+                <w:sz w:val="16"/>
               </w:rPr>
               <w:t>Delivered &amp; Verified</w:t>
             </w:r>
@@ -1258,13 +1316,13 @@
       <w:tr>
         <w:tc>
           <w:tcPr>
-            <w:tcW w:type="dxa" w:w="3168"/>
+            <w:tcW w:type="dxa" w:w="2880"/>
             <w:shd w:fill="F8FAFC"/>
             <w:tcMar>
-              <w:top w:w="60" w:type="dxa"/>
-              <w:bottom w:w="60" w:type="dxa"/>
-              <w:left w:w="80" w:type="dxa"/>
-              <w:right w:w="80" w:type="dxa"/>
+              <w:top w:w="50" w:type="dxa"/>
+              <w:bottom w:w="50" w:type="dxa"/>
+              <w:left w:w="70" w:type="dxa"/>
+              <w:right w:w="70" w:type="dxa"/>
             </w:tcMar>
           </w:tcPr>
           <w:p>
@@ -1272,42 +1330,42 @@
               <w:rPr>
                 <w:rFonts w:ascii="Arial" w:hAnsi="Arial"/>
                 <w:b/>
-                <w:sz w:val="18"/>
+                <w:sz w:val="17"/>
               </w:rPr>
-              <w:t>Hardware AES-256-GCM AEAD Proof Verification</w:t>
+              <w:t>Cross-Region Vault Sharding (Nodes 0-3)</w:t>
             </w:r>
           </w:p>
         </w:tc>
         <w:tc>
           <w:tcPr>
-            <w:tcW w:type="dxa" w:w="4752"/>
+            <w:tcW w:type="dxa" w:w="5184"/>
             <w:shd w:fill="F8FAFC"/>
             <w:tcMar>
-              <w:top w:w="60" w:type="dxa"/>
-              <w:bottom w:w="60" w:type="dxa"/>
-              <w:left w:w="80" w:type="dxa"/>
-              <w:right w:w="80" w:type="dxa"/>
+              <w:top w:w="50" w:type="dxa"/>
+              <w:bottom w:w="50" w:type="dxa"/>
+              <w:left w:w="70" w:type="dxa"/>
+              <w:right w:w="70" w:type="dxa"/>
             </w:tcMar>
           </w:tcPr>
           <w:p>
             <w:r>
               <w:rPr>
                 <w:rFonts w:ascii="Arial" w:hAnsi="Arial"/>
-                <w:sz w:val="17"/>
+                <w:sz w:val="16"/>
               </w:rPr>
-              <w:t>Interactive hardware dialog extracting 96-bit nonce, SHA-256 digest, and verifying 128-bit Galois field tag integrity status.</w:t>
+              <w:t>4-tier distributed topology: Node 0 (Auth, us-east-1), Node 1 (Gateway, us-west-2), Node 2 (Primary Vault, eu-central-1), Node 3 (Tenant Vault, ap-southeast-1). Regional AAD re-sealing.</w:t>
             </w:r>
           </w:p>
         </w:tc>
         <w:tc>
           <w:tcPr>
-            <w:tcW w:type="dxa" w:w="2160"/>
+            <w:tcW w:type="dxa" w:w="2016"/>
             <w:shd w:fill="F0FDF4"/>
             <w:tcMar>
-              <w:top w:w="60" w:type="dxa"/>
-              <w:bottom w:w="60" w:type="dxa"/>
-              <w:left w:w="80" w:type="dxa"/>
-              <w:right w:w="80" w:type="dxa"/>
+              <w:top w:w="50" w:type="dxa"/>
+              <w:bottom w:w="50" w:type="dxa"/>
+              <w:left w:w="70" w:type="dxa"/>
+              <w:right w:w="70" w:type="dxa"/>
             </w:tcMar>
           </w:tcPr>
           <w:p>
@@ -1316,7 +1374,7 @@
                 <w:rFonts w:ascii="Arial" w:hAnsi="Arial"/>
                 <w:b/>
                 <w:color w:val="166534"/>
-                <w:sz w:val="17"/>
+                <w:sz w:val="16"/>
               </w:rPr>
               <w:t>Delivered &amp; Verified</w:t>
             </w:r>
@@ -1326,13 +1384,13 @@
       <w:tr>
         <w:tc>
           <w:tcPr>
-            <w:tcW w:type="dxa" w:w="3168"/>
+            <w:tcW w:type="dxa" w:w="2880"/>
             <w:shd w:fill="FFFFFF"/>
             <w:tcMar>
-              <w:top w:w="60" w:type="dxa"/>
-              <w:bottom w:w="60" w:type="dxa"/>
-              <w:left w:w="80" w:type="dxa"/>
-              <w:right w:w="80" w:type="dxa"/>
+              <w:top w:w="50" w:type="dxa"/>
+              <w:bottom w:w="50" w:type="dxa"/>
+              <w:left w:w="70" w:type="dxa"/>
+              <w:right w:w="70" w:type="dxa"/>
             </w:tcMar>
           </w:tcPr>
           <w:p>
@@ -1340,42 +1398,42 @@
               <w:rPr>
                 <w:rFonts w:ascii="Arial" w:hAnsi="Arial"/>
                 <w:b/>
-                <w:sz w:val="18"/>
+                <w:sz w:val="17"/>
               </w:rPr>
-              <w:t>Hybrid Post-Quantum Cryptography</w:t>
+              <w:t>Autonomous Peripheral Shield (Customer)</w:t>
             </w:r>
           </w:p>
         </w:tc>
         <w:tc>
           <w:tcPr>
-            <w:tcW w:type="dxa" w:w="4752"/>
+            <w:tcW w:type="dxa" w:w="5184"/>
             <w:shd w:fill="FFFFFF"/>
             <w:tcMar>
-              <w:top w:w="60" w:type="dxa"/>
-              <w:bottom w:w="60" w:type="dxa"/>
-              <w:left w:w="80" w:type="dxa"/>
-              <w:right w:w="80" w:type="dxa"/>
+              <w:top w:w="50" w:type="dxa"/>
+              <w:bottom w:w="50" w:type="dxa"/>
+              <w:left w:w="70" w:type="dxa"/>
+              <w:right w:w="70" w:type="dxa"/>
             </w:tcMar>
           </w:tcPr>
           <w:p>
             <w:r>
               <w:rPr>
                 <w:rFonts w:ascii="Arial" w:hAnsi="Arial"/>
-                <w:sz w:val="17"/>
+                <w:sz w:val="16"/>
               </w:rPr>
-              <w:t>CRYSTALS-Kyber-768 (ML-KEM NIST FIPS 203) lattice-based key encapsulation combined with AES-256-GCM in cloud_d/crypto/pq_kyber.py.</w:t>
+              <w:t>Customers have zero manual attack controls; automated background defense with transparent monitoring of Rings 1-4 and Customer Air-Gap Guarantee.</w:t>
             </w:r>
           </w:p>
         </w:tc>
         <w:tc>
           <w:tcPr>
-            <w:tcW w:type="dxa" w:w="2160"/>
+            <w:tcW w:type="dxa" w:w="2016"/>
             <w:shd w:fill="F0FDF4"/>
             <w:tcMar>
-              <w:top w:w="60" w:type="dxa"/>
-              <w:bottom w:w="60" w:type="dxa"/>
-              <w:left w:w="80" w:type="dxa"/>
-              <w:right w:w="80" w:type="dxa"/>
+              <w:top w:w="50" w:type="dxa"/>
+              <w:bottom w:w="50" w:type="dxa"/>
+              <w:left w:w="70" w:type="dxa"/>
+              <w:right w:w="70" w:type="dxa"/>
             </w:tcMar>
           </w:tcPr>
           <w:p>
@@ -1384,7 +1442,7 @@
                 <w:rFonts w:ascii="Arial" w:hAnsi="Arial"/>
                 <w:b/>
                 <w:color w:val="166534"/>
-                <w:sz w:val="17"/>
+                <w:sz w:val="16"/>
               </w:rPr>
               <w:t>Delivered &amp; Verified</w:t>
             </w:r>
@@ -1394,13 +1452,13 @@
       <w:tr>
         <w:tc>
           <w:tcPr>
-            <w:tcW w:type="dxa" w:w="3168"/>
+            <w:tcW w:type="dxa" w:w="2880"/>
             <w:shd w:fill="F8FAFC"/>
             <w:tcMar>
-              <w:top w:w="60" w:type="dxa"/>
-              <w:bottom w:w="60" w:type="dxa"/>
-              <w:left w:w="80" w:type="dxa"/>
-              <w:right w:w="80" w:type="dxa"/>
+              <w:top w:w="50" w:type="dxa"/>
+              <w:bottom w:w="50" w:type="dxa"/>
+              <w:left w:w="70" w:type="dxa"/>
+              <w:right w:w="70" w:type="dxa"/>
             </w:tcMar>
           </w:tcPr>
           <w:p>
@@ -1408,42 +1466,42 @@
               <w:rPr>
                 <w:rFonts w:ascii="Arial" w:hAnsi="Arial"/>
                 <w:b/>
-                <w:sz w:val="18"/>
+                <w:sz w:val="17"/>
               </w:rPr>
-              <w:t>Cross-Region Sharding Topology</w:t>
+              <w:t>Sequence CRDT Rich-Text Collaborative Editor</w:t>
             </w:r>
           </w:p>
         </w:tc>
         <w:tc>
           <w:tcPr>
-            <w:tcW w:type="dxa" w:w="4752"/>
+            <w:tcW w:type="dxa" w:w="5184"/>
             <w:shd w:fill="F8FAFC"/>
             <w:tcMar>
-              <w:top w:w="60" w:type="dxa"/>
-              <w:bottom w:w="60" w:type="dxa"/>
-              <w:left w:w="80" w:type="dxa"/>
-              <w:right w:w="80" w:type="dxa"/>
+              <w:top w:w="50" w:type="dxa"/>
+              <w:bottom w:w="50" w:type="dxa"/>
+              <w:left w:w="70" w:type="dxa"/>
+              <w:right w:w="70" w:type="dxa"/>
             </w:tcMar>
           </w:tcPr>
           <w:p>
             <w:r>
               <w:rPr>
                 <w:rFonts w:ascii="Arial" w:hAnsi="Arial"/>
-                <w:sz w:val="17"/>
+                <w:sz w:val="16"/>
               </w:rPr>
-              <w:t>4-tier distributed sharding router (Nodes 0-3 across us-east-1, us-west-2, eu-central-1, ap-southeast-1) with regional AAD re-sealing in storage.py.</w:t>
+              <w:t>Conflict-free Replicated Data Type in cloud_d/collab/crdt.py utilizing Lamport logical timestamps, fractional position indices, rich-text OT spans, and multi-user cursor presence.</w:t>
             </w:r>
           </w:p>
         </w:tc>
         <w:tc>
           <w:tcPr>
-            <w:tcW w:type="dxa" w:w="2160"/>
+            <w:tcW w:type="dxa" w:w="2016"/>
             <w:shd w:fill="F0FDF4"/>
             <w:tcMar>
-              <w:top w:w="60" w:type="dxa"/>
-              <w:bottom w:w="60" w:type="dxa"/>
-              <w:left w:w="80" w:type="dxa"/>
-              <w:right w:w="80" w:type="dxa"/>
+              <w:top w:w="50" w:type="dxa"/>
+              <w:bottom w:w="50" w:type="dxa"/>
+              <w:left w:w="70" w:type="dxa"/>
+              <w:right w:w="70" w:type="dxa"/>
             </w:tcMar>
           </w:tcPr>
           <w:p>
@@ -1452,7 +1510,7 @@
                 <w:rFonts w:ascii="Arial" w:hAnsi="Arial"/>
                 <w:b/>
                 <w:color w:val="166534"/>
-                <w:sz w:val="17"/>
+                <w:sz w:val="16"/>
               </w:rPr>
               <w:t>Delivered &amp; Verified</w:t>
             </w:r>
@@ -1462,13 +1520,13 @@
       <w:tr>
         <w:tc>
           <w:tcPr>
-            <w:tcW w:type="dxa" w:w="3168"/>
+            <w:tcW w:type="dxa" w:w="2880"/>
             <w:shd w:fill="FFFFFF"/>
             <w:tcMar>
-              <w:top w:w="60" w:type="dxa"/>
-              <w:bottom w:w="60" w:type="dxa"/>
-              <w:left w:w="80" w:type="dxa"/>
-              <w:right w:w="80" w:type="dxa"/>
+              <w:top w:w="50" w:type="dxa"/>
+              <w:bottom w:w="50" w:type="dxa"/>
+              <w:left w:w="70" w:type="dxa"/>
+              <w:right w:w="70" w:type="dxa"/>
             </w:tcMar>
           </w:tcPr>
           <w:p>
@@ -1476,42 +1534,42 @@
               <w:rPr>
                 <w:rFonts w:ascii="Arial" w:hAnsi="Arial"/>
                 <w:b/>
-                <w:sz w:val="18"/>
+                <w:sz w:val="17"/>
               </w:rPr>
-              <w:t>Persistent Cloud Disk on Render</w:t>
+              <w:t>Continuous Red-Teaming AI Agent</w:t>
             </w:r>
           </w:p>
         </w:tc>
         <w:tc>
           <w:tcPr>
-            <w:tcW w:type="dxa" w:w="4752"/>
+            <w:tcW w:type="dxa" w:w="5184"/>
             <w:shd w:fill="FFFFFF"/>
             <w:tcMar>
-              <w:top w:w="60" w:type="dxa"/>
-              <w:bottom w:w="60" w:type="dxa"/>
-              <w:left w:w="80" w:type="dxa"/>
-              <w:right w:w="80" w:type="dxa"/>
+              <w:top w:w="50" w:type="dxa"/>
+              <w:bottom w:w="50" w:type="dxa"/>
+              <w:left w:w="70" w:type="dxa"/>
+              <w:right w:w="70" w:type="dxa"/>
             </w:tcMar>
           </w:tcPr>
           <w:p>
             <w:r>
               <w:rPr>
                 <w:rFonts w:ascii="Arial" w:hAnsi="Arial"/>
-                <w:sz w:val="17"/>
+                <w:sz w:val="16"/>
               </w:rPr>
-              <w:t>Storage path resolution supporting /var/data and RENDER_DISK_PATH with auto-migration and live telemetry in storage.py.</w:t>
+              <w:t>Q-learning reinforcement learning agent in cloud_d/logic/red_team_agent.py with Adversarial LLM AST mutation engine testing Sentinels against zero-day evasion vectors.</w:t>
             </w:r>
           </w:p>
         </w:tc>
         <w:tc>
           <w:tcPr>
-            <w:tcW w:type="dxa" w:w="2160"/>
+            <w:tcW w:type="dxa" w:w="2016"/>
             <w:shd w:fill="F0FDF4"/>
             <w:tcMar>
-              <w:top w:w="60" w:type="dxa"/>
-              <w:bottom w:w="60" w:type="dxa"/>
-              <w:left w:w="80" w:type="dxa"/>
-              <w:right w:w="80" w:type="dxa"/>
+              <w:top w:w="50" w:type="dxa"/>
+              <w:bottom w:w="50" w:type="dxa"/>
+              <w:left w:w="70" w:type="dxa"/>
+              <w:right w:w="70" w:type="dxa"/>
             </w:tcMar>
           </w:tcPr>
           <w:p>
@@ -1520,7 +1578,7 @@
                 <w:rFonts w:ascii="Arial" w:hAnsi="Arial"/>
                 <w:b/>
                 <w:color w:val="166534"/>
-                <w:sz w:val="17"/>
+                <w:sz w:val="16"/>
               </w:rPr>
               <w:t>Delivered &amp; Verified</w:t>
             </w:r>
@@ -1530,13 +1588,13 @@
       <w:tr>
         <w:tc>
           <w:tcPr>
-            <w:tcW w:type="dxa" w:w="3168"/>
+            <w:tcW w:type="dxa" w:w="2880"/>
             <w:shd w:fill="F8FAFC"/>
             <w:tcMar>
-              <w:top w:w="60" w:type="dxa"/>
-              <w:bottom w:w="60" w:type="dxa"/>
-              <w:left w:w="80" w:type="dxa"/>
-              <w:right w:w="80" w:type="dxa"/>
+              <w:top w:w="50" w:type="dxa"/>
+              <w:bottom w:w="50" w:type="dxa"/>
+              <w:left w:w="70" w:type="dxa"/>
+              <w:right w:w="70" w:type="dxa"/>
             </w:tcMar>
           </w:tcPr>
           <w:p>
@@ -1544,42 +1602,42 @@
               <w:rPr>
                 <w:rFonts w:ascii="Arial" w:hAnsi="Arial"/>
                 <w:b/>
-                <w:sz w:val="18"/>
+                <w:sz w:val="17"/>
               </w:rPr>
-              <w:t>Permanent Account Persistence &amp; Auto-Seeding</w:t>
+              <w:t>Biometric WebAuthn Passkeys &amp; FIDO2</w:t>
             </w:r>
           </w:p>
         </w:tc>
         <w:tc>
           <w:tcPr>
-            <w:tcW w:type="dxa" w:w="4752"/>
+            <w:tcW w:type="dxa" w:w="5184"/>
             <w:shd w:fill="F8FAFC"/>
             <w:tcMar>
-              <w:top w:w="60" w:type="dxa"/>
-              <w:bottom w:w="60" w:type="dxa"/>
-              <w:left w:w="80" w:type="dxa"/>
-              <w:right w:w="80" w:type="dxa"/>
+              <w:top w:w="50" w:type="dxa"/>
+              <w:bottom w:w="50" w:type="dxa"/>
+              <w:left w:w="70" w:type="dxa"/>
+              <w:right w:w="70" w:type="dxa"/>
             </w:tcMar>
           </w:tcPr>
           <w:p>
             <w:r>
               <w:rPr>
                 <w:rFonts w:ascii="Arial" w:hAnsi="Arial"/>
-                <w:sz w:val="17"/>
+                <w:sz w:val="16"/>
               </w:rPr>
-              <w:t>INSERT OR REPLACE in _init_users_db seeding nithish / nithish123 and seeding default folders (PS-7, 24X501, PS-6) and real encrypted files on startup.</w:t>
+              <w:t>W3C WebAuthn passkey assertion verification, CBOR attestation statements, and FIDO MDS Root CA validation in cloud_d/webauthn_auth.py with AAGUID hardware grading.</w:t>
             </w:r>
           </w:p>
         </w:tc>
         <w:tc>
           <w:tcPr>
-            <w:tcW w:type="dxa" w:w="2160"/>
+            <w:tcW w:type="dxa" w:w="2016"/>
             <w:shd w:fill="F0FDF4"/>
             <w:tcMar>
-              <w:top w:w="60" w:type="dxa"/>
-              <w:bottom w:w="60" w:type="dxa"/>
-              <w:left w:w="80" w:type="dxa"/>
-              <w:right w:w="80" w:type="dxa"/>
+              <w:top w:w="50" w:type="dxa"/>
+              <w:bottom w:w="50" w:type="dxa"/>
+              <w:left w:w="70" w:type="dxa"/>
+              <w:right w:w="70" w:type="dxa"/>
             </w:tcMar>
           </w:tcPr>
           <w:p>
@@ -1588,7 +1646,7 @@
                 <w:rFonts w:ascii="Arial" w:hAnsi="Arial"/>
                 <w:b/>
                 <w:color w:val="166534"/>
-                <w:sz w:val="17"/>
+                <w:sz w:val="16"/>
               </w:rPr>
               <w:t>Delivered &amp; Verified</w:t>
             </w:r>
@@ -1598,13 +1656,13 @@
       <w:tr>
         <w:tc>
           <w:tcPr>
-            <w:tcW w:type="dxa" w:w="3168"/>
+            <w:tcW w:type="dxa" w:w="2880"/>
             <w:shd w:fill="FFFFFF"/>
             <w:tcMar>
-              <w:top w:w="60" w:type="dxa"/>
-              <w:bottom w:w="60" w:type="dxa"/>
-              <w:left w:w="80" w:type="dxa"/>
-              <w:right w:w="80" w:type="dxa"/>
+              <w:top w:w="50" w:type="dxa"/>
+              <w:bottom w:w="50" w:type="dxa"/>
+              <w:left w:w="70" w:type="dxa"/>
+              <w:right w:w="70" w:type="dxa"/>
             </w:tcMar>
           </w:tcPr>
           <w:p>
@@ -1612,42 +1670,42 @@
               <w:rPr>
                 <w:rFonts w:ascii="Arial" w:hAnsi="Arial"/>
                 <w:b/>
-                <w:sz w:val="18"/>
+                <w:sz w:val="17"/>
               </w:rPr>
-              <w:t>Google Drive UI Structure Replica</w:t>
+              <w:t>Native Push Notifications (APNs &amp; FCM)</w:t>
             </w:r>
           </w:p>
         </w:tc>
         <w:tc>
           <w:tcPr>
-            <w:tcW w:type="dxa" w:w="4752"/>
+            <w:tcW w:type="dxa" w:w="5184"/>
             <w:shd w:fill="FFFFFF"/>
             <w:tcMar>
-              <w:top w:w="60" w:type="dxa"/>
-              <w:bottom w:w="60" w:type="dxa"/>
-              <w:left w:w="80" w:type="dxa"/>
-              <w:right w:w="80" w:type="dxa"/>
+              <w:top w:w="50" w:type="dxa"/>
+              <w:bottom w:w="50" w:type="dxa"/>
+              <w:left w:w="70" w:type="dxa"/>
+              <w:right w:w="70" w:type="dxa"/>
             </w:tcMar>
           </w:tcPr>
           <w:p>
             <w:r>
               <w:rPr>
                 <w:rFonts w:ascii="Arial" w:hAnsi="Arial"/>
-                <w:sz w:val="17"/>
+                <w:sz w:val="16"/>
               </w:rPr>
-              <w:t>Spacious layout matching user screenshots: centered Search in Drive box, filter chips, Suggested folders grid, and clean table.</w:t>
+              <w:t>Multi-channel notification engine (Web Push VAPID, APNs iOS, FCM Android) in cloud_d/push_notifications.py dispatching critical priority threat banners.</w:t>
             </w:r>
           </w:p>
         </w:tc>
         <w:tc>
           <w:tcPr>
-            <w:tcW w:type="dxa" w:w="2160"/>
+            <w:tcW w:type="dxa" w:w="2016"/>
             <w:shd w:fill="F0FDF4"/>
             <w:tcMar>
-              <w:top w:w="60" w:type="dxa"/>
-              <w:bottom w:w="60" w:type="dxa"/>
-              <w:left w:w="80" w:type="dxa"/>
-              <w:right w:w="80" w:type="dxa"/>
+              <w:top w:w="50" w:type="dxa"/>
+              <w:bottom w:w="50" w:type="dxa"/>
+              <w:left w:w="70" w:type="dxa"/>
+              <w:right w:w="70" w:type="dxa"/>
             </w:tcMar>
           </w:tcPr>
           <w:p>
@@ -1656,7 +1714,7 @@
                 <w:rFonts w:ascii="Arial" w:hAnsi="Arial"/>
                 <w:b/>
                 <w:color w:val="166534"/>
-                <w:sz w:val="17"/>
+                <w:sz w:val="16"/>
               </w:rPr>
               <w:t>Delivered &amp; Verified</w:t>
             </w:r>
@@ -1666,13 +1724,13 @@
       <w:tr>
         <w:tc>
           <w:tcPr>
-            <w:tcW w:type="dxa" w:w="3168"/>
+            <w:tcW w:type="dxa" w:w="2880"/>
             <w:shd w:fill="F8FAFC"/>
             <w:tcMar>
-              <w:top w:w="60" w:type="dxa"/>
-              <w:bottom w:w="60" w:type="dxa"/>
-              <w:left w:w="80" w:type="dxa"/>
-              <w:right w:w="80" w:type="dxa"/>
+              <w:top w:w="50" w:type="dxa"/>
+              <w:bottom w:w="50" w:type="dxa"/>
+              <w:left w:w="70" w:type="dxa"/>
+              <w:right w:w="70" w:type="dxa"/>
             </w:tcMar>
           </w:tcPr>
           <w:p>
@@ -1680,42 +1738,42 @@
               <w:rPr>
                 <w:rFonts w:ascii="Arial" w:hAnsi="Arial"/>
                 <w:b/>
-                <w:sz w:val="18"/>
+                <w:sz w:val="17"/>
               </w:rPr>
-              <w:t>Recent Segment Chronological Grouping</w:t>
+              <w:t>Expiring Encrypted Share Links</w:t>
             </w:r>
           </w:p>
         </w:tc>
         <w:tc>
           <w:tcPr>
-            <w:tcW w:type="dxa" w:w="4752"/>
+            <w:tcW w:type="dxa" w:w="5184"/>
             <w:shd w:fill="F8FAFC"/>
             <w:tcMar>
-              <w:top w:w="60" w:type="dxa"/>
-              <w:bottom w:w="60" w:type="dxa"/>
-              <w:left w:w="80" w:type="dxa"/>
-              <w:right w:w="80" w:type="dxa"/>
+              <w:top w:w="50" w:type="dxa"/>
+              <w:bottom w:w="50" w:type="dxa"/>
+              <w:left w:w="70" w:type="dxa"/>
+              <w:right w:w="70" w:type="dxa"/>
             </w:tcMar>
           </w:tcPr>
           <w:p>
             <w:r>
               <w:rPr>
                 <w:rFonts w:ascii="Arial" w:hAnsi="Arial"/>
-                <w:sz w:val="17"/>
+                <w:sz w:val="16"/>
               </w:rPr>
-              <w:t>Matches user screenshot media_1792989521886_bbf42880.png: Recent title, filter chips, Last week grouping, Owner me with N avatar, file sizes.</w:t>
+              <w:t>Cryptographic share link manager (/share/&lt;token&gt;) in cloud_d/share.py with TTL expiration (1h, 24h, 7d), max download quotas, and PBKDF2 password access protection.</w:t>
             </w:r>
           </w:p>
         </w:tc>
         <w:tc>
           <w:tcPr>
-            <w:tcW w:type="dxa" w:w="2160"/>
+            <w:tcW w:type="dxa" w:w="2016"/>
             <w:shd w:fill="F0FDF4"/>
             <w:tcMar>
-              <w:top w:w="60" w:type="dxa"/>
-              <w:bottom w:w="60" w:type="dxa"/>
-              <w:left w:w="80" w:type="dxa"/>
-              <w:right w:w="80" w:type="dxa"/>
+              <w:top w:w="50" w:type="dxa"/>
+              <w:bottom w:w="50" w:type="dxa"/>
+              <w:left w:w="70" w:type="dxa"/>
+              <w:right w:w="70" w:type="dxa"/>
             </w:tcMar>
           </w:tcPr>
           <w:p>
@@ -1724,7 +1782,7 @@
                 <w:rFonts w:ascii="Arial" w:hAnsi="Arial"/>
                 <w:b/>
                 <w:color w:val="166534"/>
-                <w:sz w:val="17"/>
+                <w:sz w:val="16"/>
               </w:rPr>
               <w:t>Delivered &amp; Verified</w:t>
             </w:r>
@@ -1734,13 +1792,13 @@
       <w:tr>
         <w:tc>
           <w:tcPr>
-            <w:tcW w:type="dxa" w:w="3168"/>
+            <w:tcW w:type="dxa" w:w="2880"/>
             <w:shd w:fill="FFFFFF"/>
             <w:tcMar>
-              <w:top w:w="60" w:type="dxa"/>
-              <w:bottom w:w="60" w:type="dxa"/>
-              <w:left w:w="80" w:type="dxa"/>
-              <w:right w:w="80" w:type="dxa"/>
+              <w:top w:w="50" w:type="dxa"/>
+              <w:bottom w:w="50" w:type="dxa"/>
+              <w:left w:w="70" w:type="dxa"/>
+              <w:right w:w="70" w:type="dxa"/>
             </w:tcMar>
           </w:tcPr>
           <w:p>
@@ -1748,42 +1806,42 @@
               <w:rPr>
                 <w:rFonts w:ascii="Arial" w:hAnsi="Arial"/>
                 <w:b/>
-                <w:sz w:val="18"/>
+                <w:sz w:val="17"/>
               </w:rPr>
-              <w:t>Consolidated Security &amp; Architecture Dossier</w:t>
+              <w:t>Multi-File Drag &amp; Drop Batch Operations</w:t>
             </w:r>
           </w:p>
         </w:tc>
         <w:tc>
           <w:tcPr>
-            <w:tcW w:type="dxa" w:w="4752"/>
+            <w:tcW w:type="dxa" w:w="5184"/>
             <w:shd w:fill="FFFFFF"/>
             <w:tcMar>
-              <w:top w:w="60" w:type="dxa"/>
-              <w:bottom w:w="60" w:type="dxa"/>
-              <w:left w:w="80" w:type="dxa"/>
-              <w:right w:w="80" w:type="dxa"/>
+              <w:top w:w="50" w:type="dxa"/>
+              <w:bottom w:w="50" w:type="dxa"/>
+              <w:left w:w="70" w:type="dxa"/>
+              <w:right w:w="70" w:type="dxa"/>
             </w:tcMar>
           </w:tcPr>
           <w:p>
             <w:r>
               <w:rPr>
                 <w:rFonts w:ascii="Arial" w:hAnsi="Arial"/>
-                <w:sz w:val="17"/>
+                <w:sz w:val="16"/>
               </w:rPr>
-              <w:t>Unified command hub (tab-security-report) containing complete 4-tier cloud sharding, AI agent Sentinel mesh, 4-tier peripheral ring defense, Tasks A-G matrix, and one-click docx specification download.</w:t>
+              <w:t>Batch move across folders/nodes (batch_move_files in storage.py). Recalculates Galois field AAD and re-seals across shards.</w:t>
             </w:r>
           </w:p>
         </w:tc>
         <w:tc>
           <w:tcPr>
-            <w:tcW w:type="dxa" w:w="2160"/>
+            <w:tcW w:type="dxa" w:w="2016"/>
             <w:shd w:fill="F0FDF4"/>
             <w:tcMar>
-              <w:top w:w="60" w:type="dxa"/>
-              <w:bottom w:w="60" w:type="dxa"/>
-              <w:left w:w="80" w:type="dxa"/>
-              <w:right w:w="80" w:type="dxa"/>
+              <w:top w:w="50" w:type="dxa"/>
+              <w:bottom w:w="50" w:type="dxa"/>
+              <w:left w:w="70" w:type="dxa"/>
+              <w:right w:w="70" w:type="dxa"/>
             </w:tcMar>
           </w:tcPr>
           <w:p>
@@ -1792,7 +1850,7 @@
                 <w:rFonts w:ascii="Arial" w:hAnsi="Arial"/>
                 <w:b/>
                 <w:color w:val="166534"/>
-                <w:sz w:val="17"/>
+                <w:sz w:val="16"/>
               </w:rPr>
               <w:t>Delivered &amp; Verified</w:t>
             </w:r>
@@ -1802,13 +1860,13 @@
       <w:tr>
         <w:tc>
           <w:tcPr>
-            <w:tcW w:type="dxa" w:w="3168"/>
+            <w:tcW w:type="dxa" w:w="2880"/>
             <w:shd w:fill="F8FAFC"/>
             <w:tcMar>
-              <w:top w:w="60" w:type="dxa"/>
-              <w:bottom w:w="60" w:type="dxa"/>
-              <w:left w:w="80" w:type="dxa"/>
-              <w:right w:w="80" w:type="dxa"/>
+              <w:top w:w="50" w:type="dxa"/>
+              <w:bottom w:w="50" w:type="dxa"/>
+              <w:left w:w="70" w:type="dxa"/>
+              <w:right w:w="70" w:type="dxa"/>
             </w:tcMar>
           </w:tcPr>
           <w:p>
@@ -1816,42 +1874,42 @@
               <w:rPr>
                 <w:rFonts w:ascii="Arial" w:hAnsi="Arial"/>
                 <w:b/>
-                <w:sz w:val="18"/>
+                <w:sz w:val="17"/>
               </w:rPr>
-              <w:t>Autonomous Peripheral Shield (Customer)</w:t>
+              <w:t>Persistent Cloud Disk Attachment</w:t>
             </w:r>
           </w:p>
         </w:tc>
         <w:tc>
           <w:tcPr>
-            <w:tcW w:type="dxa" w:w="4752"/>
+            <w:tcW w:type="dxa" w:w="5184"/>
             <w:shd w:fill="F8FAFC"/>
             <w:tcMar>
-              <w:top w:w="60" w:type="dxa"/>
-              <w:bottom w:w="60" w:type="dxa"/>
-              <w:left w:w="80" w:type="dxa"/>
-              <w:right w:w="80" w:type="dxa"/>
+              <w:top w:w="50" w:type="dxa"/>
+              <w:bottom w:w="50" w:type="dxa"/>
+              <w:left w:w="70" w:type="dxa"/>
+              <w:right w:w="70" w:type="dxa"/>
             </w:tcMar>
           </w:tcPr>
           <w:p>
             <w:r>
               <w:rPr>
                 <w:rFonts w:ascii="Arial" w:hAnsi="Arial"/>
-                <w:sz w:val="17"/>
+                <w:sz w:val="16"/>
               </w:rPr>
-              <w:t>Customers have zero manual attack controls; automated background defense with transparent monitoring of Rings 1-4 and Customer Air-Gap Guarantee.</w:t>
+              <w:t>Storage path resolution supporting /var/data and RENDER_DISK_PATH with auto-migration and live telemetry in storage.py.</w:t>
             </w:r>
           </w:p>
         </w:tc>
         <w:tc>
           <w:tcPr>
-            <w:tcW w:type="dxa" w:w="2160"/>
+            <w:tcW w:type="dxa" w:w="2016"/>
             <w:shd w:fill="F0FDF4"/>
             <w:tcMar>
-              <w:top w:w="60" w:type="dxa"/>
-              <w:bottom w:w="60" w:type="dxa"/>
-              <w:left w:w="80" w:type="dxa"/>
-              <w:right w:w="80" w:type="dxa"/>
+              <w:top w:w="50" w:type="dxa"/>
+              <w:bottom w:w="50" w:type="dxa"/>
+              <w:left w:w="70" w:type="dxa"/>
+              <w:right w:w="70" w:type="dxa"/>
             </w:tcMar>
           </w:tcPr>
           <w:p>
@@ -1860,7 +1918,7 @@
                 <w:rFonts w:ascii="Arial" w:hAnsi="Arial"/>
                 <w:b/>
                 <w:color w:val="166534"/>
-                <w:sz w:val="17"/>
+                <w:sz w:val="16"/>
               </w:rPr>
               <w:t>Delivered &amp; Verified</w:t>
             </w:r>
@@ -1870,13 +1928,13 @@
       <w:tr>
         <w:tc>
           <w:tcPr>
-            <w:tcW w:type="dxa" w:w="3168"/>
+            <w:tcW w:type="dxa" w:w="2880"/>
             <w:shd w:fill="FFFFFF"/>
             <w:tcMar>
-              <w:top w:w="60" w:type="dxa"/>
-              <w:bottom w:w="60" w:type="dxa"/>
-              <w:left w:w="80" w:type="dxa"/>
-              <w:right w:w="80" w:type="dxa"/>
+              <w:top w:w="50" w:type="dxa"/>
+              <w:bottom w:w="50" w:type="dxa"/>
+              <w:left w:w="70" w:type="dxa"/>
+              <w:right w:w="70" w:type="dxa"/>
             </w:tcMar>
           </w:tcPr>
           <w:p>
@@ -1884,42 +1942,42 @@
               <w:rPr>
                 <w:rFonts w:ascii="Arial" w:hAnsi="Arial"/>
                 <w:b/>
-                <w:sz w:val="18"/>
+                <w:sz w:val="17"/>
               </w:rPr>
-              <w:t>Easily Operable Simulation Arena (Staff)</w:t>
+              <w:t>Account Persistence &amp; Auto-Seeding</w:t>
             </w:r>
           </w:p>
         </w:tc>
         <w:tc>
           <w:tcPr>
-            <w:tcW w:type="dxa" w:w="4752"/>
+            <w:tcW w:type="dxa" w:w="5184"/>
             <w:shd w:fill="FFFFFF"/>
             <w:tcMar>
-              <w:top w:w="60" w:type="dxa"/>
-              <w:bottom w:w="60" w:type="dxa"/>
-              <w:left w:w="80" w:type="dxa"/>
-              <w:right w:w="80" w:type="dxa"/>
+              <w:top w:w="50" w:type="dxa"/>
+              <w:bottom w:w="50" w:type="dxa"/>
+              <w:left w:w="70" w:type="dxa"/>
+              <w:right w:w="70" w:type="dxa"/>
             </w:tcMar>
           </w:tcPr>
           <w:p>
             <w:r>
               <w:rPr>
                 <w:rFonts w:ascii="Arial" w:hAnsi="Arial"/>
-                <w:sz w:val="17"/>
+                <w:sz w:val="16"/>
               </w:rPr>
-              <w:t>One-click presets (SQLi AST, Galois Nonce Bit-Flip, Cross-Shard AAD, Ingress Burst) + Full Automated Security Audit Suite with live animated terminal evaluation and concurrent customer push.</w:t>
+              <w:t>INSERT OR REPLACE in _init_users_db seeding nithish / nithish123 and default student folders and real encrypted files on cold startup.</w:t>
             </w:r>
           </w:p>
         </w:tc>
         <w:tc>
           <w:tcPr>
-            <w:tcW w:type="dxa" w:w="2160"/>
+            <w:tcW w:type="dxa" w:w="2016"/>
             <w:shd w:fill="F0FDF4"/>
             <w:tcMar>
-              <w:top w:w="60" w:type="dxa"/>
-              <w:bottom w:w="60" w:type="dxa"/>
-              <w:left w:w="80" w:type="dxa"/>
-              <w:right w:w="80" w:type="dxa"/>
+              <w:top w:w="50" w:type="dxa"/>
+              <w:bottom w:w="50" w:type="dxa"/>
+              <w:left w:w="70" w:type="dxa"/>
+              <w:right w:w="70" w:type="dxa"/>
             </w:tcMar>
           </w:tcPr>
           <w:p>
@@ -1928,7 +1986,7 @@
                 <w:rFonts w:ascii="Arial" w:hAnsi="Arial"/>
                 <w:b/>
                 <w:color w:val="166534"/>
-                <w:sz w:val="17"/>
+                <w:sz w:val="16"/>
               </w:rPr>
               <w:t>Delivered &amp; Verified</w:t>
             </w:r>
@@ -1938,13 +1996,13 @@
       <w:tr>
         <w:tc>
           <w:tcPr>
-            <w:tcW w:type="dxa" w:w="3168"/>
+            <w:tcW w:type="dxa" w:w="2880"/>
             <w:shd w:fill="F8FAFC"/>
             <w:tcMar>
-              <w:top w:w="60" w:type="dxa"/>
-              <w:bottom w:w="60" w:type="dxa"/>
-              <w:left w:w="80" w:type="dxa"/>
-              <w:right w:w="80" w:type="dxa"/>
+              <w:top w:w="50" w:type="dxa"/>
+              <w:bottom w:w="50" w:type="dxa"/>
+              <w:left w:w="70" w:type="dxa"/>
+              <w:right w:w="70" w:type="dxa"/>
             </w:tcMar>
           </w:tcPr>
           <w:p>
@@ -1952,42 +2010,42 @@
               <w:rPr>
                 <w:rFonts w:ascii="Arial" w:hAnsi="Arial"/>
                 <w:b/>
-                <w:sz w:val="18"/>
+                <w:sz w:val="17"/>
               </w:rPr>
-              <w:t>Strict Mobile Bottom Navigation Gating</w:t>
+              <w:t>Lean Render Production Packaging</w:t>
             </w:r>
           </w:p>
         </w:tc>
         <w:tc>
           <w:tcPr>
-            <w:tcW w:type="dxa" w:w="4752"/>
+            <w:tcW w:type="dxa" w:w="5184"/>
             <w:shd w:fill="F8FAFC"/>
             <w:tcMar>
-              <w:top w:w="60" w:type="dxa"/>
-              <w:bottom w:w="60" w:type="dxa"/>
-              <w:left w:w="80" w:type="dxa"/>
-              <w:right w:w="80" w:type="dxa"/>
+              <w:top w:w="50" w:type="dxa"/>
+              <w:bottom w:w="50" w:type="dxa"/>
+              <w:left w:w="70" w:type="dxa"/>
+              <w:right w:w="70" w:type="dxa"/>
             </w:tcMar>
           </w:tcPr>
           <w:p>
             <w:r>
               <w:rPr>
                 <w:rFonts w:ascii="Arial" w:hAnsi="Arial"/>
-                <w:sz w:val="17"/>
+                <w:sz w:val="16"/>
               </w:rPr>
-              <w:t>Mobile bottom navigation panel (#mobile-bottom-bar) and FAB strictly hidden prior to authentication; accessible with dedicated Drive, Simulation, and Security tabs.</w:t>
+              <w:t>Added Procfile (web: python run_server.py), runtime.txt (python-3.11.9), render.yaml, and stripped Linux C-extension compilation dependencies from requirements.txt.</w:t>
             </w:r>
           </w:p>
         </w:tc>
         <w:tc>
           <w:tcPr>
-            <w:tcW w:type="dxa" w:w="2160"/>
+            <w:tcW w:type="dxa" w:w="2016"/>
             <w:shd w:fill="F0FDF4"/>
             <w:tcMar>
-              <w:top w:w="60" w:type="dxa"/>
-              <w:bottom w:w="60" w:type="dxa"/>
-              <w:left w:w="80" w:type="dxa"/>
-              <w:right w:w="80" w:type="dxa"/>
+              <w:top w:w="50" w:type="dxa"/>
+              <w:bottom w:w="50" w:type="dxa"/>
+              <w:left w:w="70" w:type="dxa"/>
+              <w:right w:w="70" w:type="dxa"/>
             </w:tcMar>
           </w:tcPr>
           <w:p>
@@ -1996,7 +2054,143 @@
                 <w:rFonts w:ascii="Arial" w:hAnsi="Arial"/>
                 <w:b/>
                 <w:color w:val="166534"/>
+                <w:sz w:val="16"/>
+              </w:rPr>
+              <w:t>Delivered &amp; Verified</w:t>
+            </w:r>
+          </w:p>
+        </w:tc>
+      </w:tr>
+      <w:tr>
+        <w:tc>
+          <w:tcPr>
+            <w:tcW w:type="dxa" w:w="2880"/>
+            <w:shd w:fill="FFFFFF"/>
+            <w:tcMar>
+              <w:top w:w="50" w:type="dxa"/>
+              <w:bottom w:w="50" w:type="dxa"/>
+              <w:left w:w="70" w:type="dxa"/>
+              <w:right w:w="70" w:type="dxa"/>
+            </w:tcMar>
+          </w:tcPr>
+          <w:p>
+            <w:r>
+              <w:rPr>
+                <w:rFonts w:ascii="Arial" w:hAnsi="Arial"/>
+                <w:b/>
                 <w:sz w:val="17"/>
+              </w:rPr>
+              <w:t>Root WSGI Entrypoint</w:t>
+            </w:r>
+          </w:p>
+        </w:tc>
+        <w:tc>
+          <w:tcPr>
+            <w:tcW w:type="dxa" w:w="5184"/>
+            <w:shd w:fill="FFFFFF"/>
+            <w:tcMar>
+              <w:top w:w="50" w:type="dxa"/>
+              <w:bottom w:w="50" w:type="dxa"/>
+              <w:left w:w="70" w:type="dxa"/>
+              <w:right w:w="70" w:type="dxa"/>
+            </w:tcMar>
+          </w:tcPr>
+          <w:p>
+            <w:r>
+              <w:rPr>
+                <w:rFonts w:ascii="Arial" w:hAnsi="Arial"/>
+                <w:sz w:val="16"/>
+              </w:rPr>
+              <w:t>Added app.py at root importing app from run_server for standard PaaS and Gunicorn container autodiscovery.</w:t>
+            </w:r>
+          </w:p>
+        </w:tc>
+        <w:tc>
+          <w:tcPr>
+            <w:tcW w:type="dxa" w:w="2016"/>
+            <w:shd w:fill="F0FDF4"/>
+            <w:tcMar>
+              <w:top w:w="50" w:type="dxa"/>
+              <w:bottom w:w="50" w:type="dxa"/>
+              <w:left w:w="70" w:type="dxa"/>
+              <w:right w:w="70" w:type="dxa"/>
+            </w:tcMar>
+          </w:tcPr>
+          <w:p>
+            <w:r>
+              <w:rPr>
+                <w:rFonts w:ascii="Arial" w:hAnsi="Arial"/>
+                <w:b/>
+                <w:color w:val="166534"/>
+                <w:sz w:val="16"/>
+              </w:rPr>
+              <w:t>Delivered &amp; Verified</w:t>
+            </w:r>
+          </w:p>
+        </w:tc>
+      </w:tr>
+      <w:tr>
+        <w:tc>
+          <w:tcPr>
+            <w:tcW w:type="dxa" w:w="2880"/>
+            <w:shd w:fill="F8FAFC"/>
+            <w:tcMar>
+              <w:top w:w="50" w:type="dxa"/>
+              <w:bottom w:w="50" w:type="dxa"/>
+              <w:left w:w="70" w:type="dxa"/>
+              <w:right w:w="70" w:type="dxa"/>
+            </w:tcMar>
+          </w:tcPr>
+          <w:p>
+            <w:r>
+              <w:rPr>
+                <w:rFonts w:ascii="Arial" w:hAnsi="Arial"/>
+                <w:b/>
+                <w:sz w:val="17"/>
+              </w:rPr>
+              <w:t>Automated GitHub Deployment Engine</w:t>
+            </w:r>
+          </w:p>
+        </w:tc>
+        <w:tc>
+          <w:tcPr>
+            <w:tcW w:type="dxa" w:w="5184"/>
+            <w:shd w:fill="F8FAFC"/>
+            <w:tcMar>
+              <w:top w:w="50" w:type="dxa"/>
+              <w:bottom w:w="50" w:type="dxa"/>
+              <w:left w:w="70" w:type="dxa"/>
+              <w:right w:w="70" w:type="dxa"/>
+            </w:tcMar>
+          </w:tcPr>
+          <w:p>
+            <w:r>
+              <w:rPr>
+                <w:rFonts w:ascii="Arial" w:hAnsi="Arial"/>
+                <w:sz w:val="16"/>
+              </w:rPr>
+              <w:t>Created push_to_github.py using GitHub Git Data REST API to stage base64 binary blobs and update main branch with zero Git CLI dependencies.</w:t>
+            </w:r>
+          </w:p>
+        </w:tc>
+        <w:tc>
+          <w:tcPr>
+            <w:tcW w:type="dxa" w:w="2016"/>
+            <w:shd w:fill="F0FDF4"/>
+            <w:tcMar>
+              <w:top w:w="50" w:type="dxa"/>
+              <w:bottom w:w="50" w:type="dxa"/>
+              <w:left w:w="70" w:type="dxa"/>
+              <w:right w:w="70" w:type="dxa"/>
+            </w:tcMar>
+          </w:tcPr>
+          <w:p>
+            <w:r>
+              <w:rPr>
+                <w:rFonts w:ascii="Arial" w:hAnsi="Arial"/>
+                <w:b/>
+                <w:color w:val="166534"/>
+                <w:sz w:val="16"/>
               </w:rPr>
               <w:t>Delivered &amp; Verified</w:t>
             </w:r>
@@ -2018,9 +2212,14 @@
           <w:rFonts w:ascii="Arial" w:hAnsi="Arial"/>
           <w:b/>
           <w:color w:val="4C1D95"/>
-          <w:sz w:val="28"/>
+          <w:sz w:val="26"/>
         </w:rPr>
-        <w:t>3. Technical Implementation of Roadmap Tasks (Tasks A through G)</w:t>
+        <w:t>3. Future Strategic Roadmap: Architecture &amp; Upcoming Milestones</w:t>
+      </w:r>
+    </w:p>
+    <w:p>
+      <w:r>
+        <w:t>While Cloud-D has fulfilled all primary deliverables, the research and engineering roadmap outlines eight high-impact strategic initiatives planned for upcoming development cycles:</w:t>
       </w:r>
     </w:p>
     <w:p>
@@ -2032,14 +2231,28 @@
           <w:rFonts w:ascii="Arial" w:hAnsi="Arial"/>
           <w:b/>
           <w:color w:val="7C3AED"/>
-          <w:sz w:val="22"/>
+          <w:sz w:val="21"/>
         </w:rPr>
-        <w:t>3.1 Task A: Persistent Cloud Disk Attachment on Render (/var/data)</w:t>
+        <w:t>Roadmap Phase 1: Multi-Region Kubernetes (K8s) Cluster Orchestration</w:t>
       </w:r>
     </w:p>
     <w:p>
       <w:r>
-        <w:t>Render Free web services utilize ephemeral container filesystems that wipe disk writes on cold reboot. In storage.py, the resolve_persistent_storage_path() function automatically detects attached Render persistent disks via RENDER_DISK_PATH or /var/data. The storage telemetry endpoint (/api/system/storage-info) monitors disk capacity, utilization, and mount health, ensuring accounts, encryption keys, and files persist permanently.</w:t>
+        <w:rPr>
+          <w:rFonts w:ascii="Arial" w:hAnsi="Arial"/>
+          <w:b/>
+          <w:color w:val="0D9488"/>
+          <w:sz w:val="18"/>
+        </w:rPr>
+        <w:t>[Target: Cloud Infrastructure &amp; Scalability]</w:t>
+        <w:br/>
+      </w:r>
+      <w:r>
+        <w:rPr>
+          <w:rFonts w:ascii="Arial" w:hAnsi="Arial"/>
+          <w:sz w:val="18"/>
+        </w:rPr>
+        <w:t>Transition the 4-node logical sharding architecture into physical multi-region Kubernetes clusters (us-east-1, us-west-2, eu-central-1, ap-southeast-1) using Terraform and Helm charts. Deploy automated ingress controllers with Envoy proxies, automated pod autoscaling (HPA), and zero-downtime rolling deploys.</w:t>
       </w:r>
     </w:p>
     <w:p>
@@ -2051,14 +2264,28 @@
           <w:rFonts w:ascii="Arial" w:hAnsi="Arial"/>
           <w:b/>
           <w:color w:val="7C3AED"/>
-          <w:sz w:val="22"/>
+          <w:sz w:val="21"/>
         </w:rPr>
-        <w:t>3.2 Task B: Sequence CRDT Rich-Text Operational Transforms &amp; Multi-Cursor Telemetry</w:t>
+        <w:t>Roadmap Phase 2: Fully Homomorphic Encryption (FHE) on Ciphertexts</w:t>
       </w:r>
     </w:p>
     <w:p>
       <w:r>
-        <w:t>The collaborative editing engine (cloud_d/collab/crdt.py) has been upgraded from plain text to rich-text operational transforms. Character attributes (bold, italic, underline, color, headings) are maintained across fractional position indices with Lamport logical clocks. Multi-user cursor telemetry is tracked in real-time via /api/collab/&lt;file_id&gt;/cursors, broadcasting active collaborator selections and cursor positions.</w:t>
+        <w:rPr>
+          <w:rFonts w:ascii="Arial" w:hAnsi="Arial"/>
+          <w:b/>
+          <w:color w:val="0D9488"/>
+          <w:sz w:val="18"/>
+        </w:rPr>
+        <w:t>[Target: Zero-Knowledge Search &amp; Analytics]</w:t>
+        <w:br/>
+      </w:r>
+      <w:r>
+        <w:rPr>
+          <w:rFonts w:ascii="Arial" w:hAnsi="Arial"/>
+          <w:sz w:val="18"/>
+        </w:rPr>
+        <w:t>Integrate Microsoft SEAL / OpenFHE (CKKS and BFV schemes) to allow server nodes to perform keyword search, full-text string indexing, and metadata aggregation directly on AES/Kyber encrypted ciphertexts without ever needing to decrypt them into memory.</w:t>
       </w:r>
     </w:p>
     <w:p>
@@ -2070,14 +2297,28 @@
           <w:rFonts w:ascii="Arial" w:hAnsi="Arial"/>
           <w:b/>
           <w:color w:val="7C3AED"/>
-          <w:sz w:val="22"/>
+          <w:sz w:val="21"/>
         </w:rPr>
-        <w:t>3.3 Task C: Physically Distributed Cross-Region Sharding (Nodes 0-3)</w:t>
+        <w:t>Roadmap Phase 3: Zero-Knowledge Proofs (zk-SNARKs) for Tenant Auditing</w:t>
       </w:r>
     </w:p>
     <w:p>
       <w:r>
-        <w:t>Storage topology is partitioned across 4 geographic regions: Node 0 (Auth, us-east-1), Node 1 (Gateway, us-west-2), Node 2 (Primary Vault, eu-central-1), and Node 3 (Tenant Vault, ap-southeast-1). When files migrate between shards, the CrossRegionShardRouter verifies origin AEAD tags, recalculates regional AAD (cloud-d|v2|node-X|file_id|region), re-seals under a new 96-bit nonce, and issues cryptographic transfer receipts signed with HMAC-SHA256.</w:t>
+        <w:rPr>
+          <w:rFonts w:ascii="Arial" w:hAnsi="Arial"/>
+          <w:b/>
+          <w:color w:val="0D9488"/>
+          <w:sz w:val="18"/>
+        </w:rPr>
+        <w:t>[Target: Regulatory Compliance &amp; Cryptographic Proofs]</w:t>
+        <w:br/>
+      </w:r>
+      <w:r>
+        <w:rPr>
+          <w:rFonts w:ascii="Arial" w:hAnsi="Arial"/>
+          <w:sz w:val="18"/>
+        </w:rPr>
+        <w:t>Construct arithmetic circuits (using Circom / snarkjs) that generate zero-knowledge succinct non-interactive arguments of knowledge. Allows tenants to mathematically prove that their files have not been accessed by other tenants or unauthorized administrators without revealing file names, contents, or access patterns.</w:t>
       </w:r>
     </w:p>
     <w:p>
@@ -2089,14 +2330,28 @@
           <w:rFonts w:ascii="Arial" w:hAnsi="Arial"/>
           <w:b/>
           <w:color w:val="7C3AED"/>
-          <w:sz w:val="22"/>
+          <w:sz w:val="21"/>
         </w:rPr>
-        <w:t>3.4 Task D: Hybrid Post-Quantum Cryptography (ML-KEM / Kyber-768)</w:t>
+        <w:t>Roadmap Phase 4: Real-Time Multi-Party Computation (MPC) Key Management</w:t>
       </w:r>
     </w:p>
     <w:p>
       <w:r>
-        <w:t>To protect against quantum polynomial-time Shor's algorithm attacks, Cloud-D embeds CRYSTALS-Kyber-768 (ML-KEM, NIST FIPS 203) in cloud_d/crypto/pq_kyber.py. Symmetric vault keys are derived using HKDF-SHA256 over concatenated Kyber-768 lattice shared secrets and classical ECDH X25519 secrets, providing unconditional hybrid defense.</w:t>
+        <w:rPr>
+          <w:rFonts w:ascii="Arial" w:hAnsi="Arial"/>
+          <w:b/>
+          <w:color w:val="0D9488"/>
+          <w:sz w:val="18"/>
+        </w:rPr>
+        <w:t>[Target: Distributed Cryptographic Resilience]</w:t>
+        <w:br/>
+      </w:r>
+      <w:r>
+        <w:rPr>
+          <w:rFonts w:ascii="Arial" w:hAnsi="Arial"/>
+          <w:sz w:val="18"/>
+        </w:rPr>
+        <w:t>Eliminate single-point master keys by implementing Shamir's Secret Sharing and Gennaro-Goldfeder threshold signatures. Vault keys are split across all 4 regional nodes; decryption requires at least 3 nodes to collaboratively sign without any individual node ever knowing the reconstructed master key.</w:t>
       </w:r>
     </w:p>
     <w:p>
@@ -2108,14 +2363,28 @@
           <w:rFonts w:ascii="Arial" w:hAnsi="Arial"/>
           <w:b/>
           <w:color w:val="7C3AED"/>
-          <w:sz w:val="22"/>
+          <w:sz w:val="21"/>
         </w:rPr>
-        <w:t>3.5 Task E: Continuous Red-Team AI Agent with Adversarial LLM Mutations</w:t>
+        <w:t>Roadmap Phase 5: Autonomous Self-Healing &amp; Dynamic Deception Networks</w:t>
       </w:r>
     </w:p>
     <w:p>
       <w:r>
-        <w:t>The Q-learning red-teaming agent (cloud_d/logic/red_team_agent.py) incorporates an AdversarialLLMMutator that synthesizes zero-day semantic SQLi AST bypasses (inline comment splits, hex literal encoding, tautology polymorphism). The agent probes QueryShield (Expectimax) and ShardSentry (Minimax) defenses, updating its state-action Q-table via the Bellman equation.</w:t>
+        <w:rPr>
+          <w:rFonts w:ascii="Arial" w:hAnsi="Arial"/>
+          <w:b/>
+          <w:color w:val="0D9488"/>
+          <w:sz w:val="18"/>
+        </w:rPr>
+        <w:t>[Target: Adaptive Active Defense]</w:t>
+        <w:br/>
+      </w:r>
+      <w:r>
+        <w:rPr>
+          <w:rFonts w:ascii="Arial" w:hAnsi="Arial"/>
+          <w:sz w:val="18"/>
+        </w:rPr>
+        <w:t>Upgrade HoneyNet Deceiver from passive honeypot trapping to dynamic adversarial counter-exploitation. When an attacker triggers a tripwire, the system automatically spawns a shadow container with simulated fake database records, isolating the adversary while transparently recording their keystrokes and exploits.</w:t>
       </w:r>
     </w:p>
     <w:p>
@@ -2127,14 +2396,28 @@
           <w:rFonts w:ascii="Arial" w:hAnsi="Arial"/>
           <w:b/>
           <w:color w:val="7C3AED"/>
-          <w:sz w:val="22"/>
+          <w:sz w:val="21"/>
         </w:rPr>
-        <w:t>3.6 Task F: Enterprise FIDO2 / WebAuthn Hardware Attestation Certificate Chains</w:t>
+        <w:t>Roadmap Phase 6: On-Device Edge AI Anomaly Detection for Mobile</w:t>
       </w:r>
     </w:p>
     <w:p>
       <w:r>
-        <w:t>cloud_d/webauthn_auth.py includes full CBOR attestation statement verification (packed, fido-u2f, none) and X.509 certificate chain validation against the FIDO Alliance Metadata Service (MDS) Root CA. The engine looks up authenticator AAGUIDs to grade hardware security (FIPS-140-3 Level 3, Hardware TEE, Software).</w:t>
+        <w:rPr>
+          <w:rFonts w:ascii="Arial" w:hAnsi="Arial"/>
+          <w:b/>
+          <w:color w:val="0D9488"/>
+          <w:sz w:val="18"/>
+        </w:rPr>
+        <w:t>[Target: Mobile Client Security]</w:t>
+        <w:br/>
+      </w:r>
+      <w:r>
+        <w:rPr>
+          <w:rFonts w:ascii="Arial" w:hAnsi="Arial"/>
+          <w:sz w:val="18"/>
+        </w:rPr>
+        <w:t>Deploy lightweight quantized CoreML (iOS) and TensorFlow Lite (Android) models into mobile_app/App.js. Detects anomalous client-side interactions, screen recording attempts, jailbreak/root indicators, and rapid biometric spoofing before sending authentication payloads over the network.</w:t>
       </w:r>
     </w:p>
     <w:p>
@@ -2146,14 +2429,109 @@
           <w:rFonts w:ascii="Arial" w:hAnsi="Arial"/>
           <w:b/>
           <w:color w:val="7C3AED"/>
-          <w:sz w:val="22"/>
+          <w:sz w:val="21"/>
         </w:rPr>
-        <w:t>3.7 Task G: Native iOS APNs &amp; Android FCM Background Services</w:t>
+        <w:t>Roadmap Phase 7: Hardware Security Module (HSM) Cloud Integration</w:t>
       </w:r>
     </w:p>
     <w:p>
       <w:r>
-        <w:t>cloud_d/push_notifications.py supports native mobile delivery via Apple Push Notification service (APNs) and Firebase Cloud Messaging (FCM). Threat defense alerts trigger heads-up mobile banners with critical interruption levels even when the browser or app is killed.</w:t>
+        <w:rPr>
+          <w:rFonts w:ascii="Arial" w:hAnsi="Arial"/>
+          <w:b/>
+          <w:color w:val="0D9488"/>
+          <w:sz w:val="18"/>
+        </w:rPr>
+        <w:t>[Target: Enterprise Cryptographic Assurance]</w:t>
+        <w:br/>
+      </w:r>
+      <w:r>
+        <w:rPr>
+          <w:rFonts w:ascii="Arial" w:hAnsi="Arial"/>
+          <w:sz w:val="18"/>
+        </w:rPr>
+        <w:t>Integrate PKCS#11 hardware interfaces to store root CA keys and Kyber-768 private seeds in physical FIPS 140-3 Level 3 hardware security modules (AWS CloudHSM, Google Cloud HSM, or YubiHSM 2).</w:t>
+      </w:r>
+    </w:p>
+    <w:p>
+      <w:pPr>
+        <w:spacing w:before="200" w:after="60"/>
+      </w:pPr>
+      <w:r>
+        <w:rPr>
+          <w:rFonts w:ascii="Arial" w:hAnsi="Arial"/>
+          <w:b/>
+          <w:color w:val="7C3AED"/>
+          <w:sz w:val="21"/>
+        </w:rPr>
+        <w:t>Roadmap Phase 8: Privacy-Preserving Federated Red-Team Learning</w:t>
+      </w:r>
+    </w:p>
+    <w:p>
+      <w:r>
+        <w:rPr>
+          <w:rFonts w:ascii="Arial" w:hAnsi="Arial"/>
+          <w:b/>
+          <w:color w:val="0D9488"/>
+          <w:sz w:val="18"/>
+        </w:rPr>
+        <w:t>[Target: Collaborative Threat Intelligence]</w:t>
+        <w:br/>
+      </w:r>
+      <w:r>
+        <w:rPr>
+          <w:rFonts w:ascii="Arial" w:hAnsi="Arial"/>
+          <w:sz w:val="18"/>
+        </w:rPr>
+        <w:t>Enable multiple independent Cloud-D enterprise tenant clusters to train the Q-learning Red-Team agent cooperatively via federated differential privacy. Defense policies improve across all clusters while raw logs and proprietary attack payloads remain strictly within tenant boundaries.</w:t>
+      </w:r>
+    </w:p>
+    <w:p>
+      <w:pPr>
+        <w:spacing w:after="240"/>
+      </w:pPr>
+    </w:p>
+    <w:p>
+      <w:pPr>
+        <w:spacing w:before="320" w:after="120"/>
+      </w:pPr>
+      <w:r>
+        <w:rPr>
+          <w:rFonts w:ascii="Arial" w:hAnsi="Arial"/>
+          <w:b/>
+          <w:color w:val="4C1D95"/>
+          <w:sz w:val="26"/>
+        </w:rPr>
+        <w:t>4. Detailed Cross-Platform Mobile Architecture</w:t>
+      </w:r>
+    </w:p>
+    <w:p>
+      <w:r>
+        <w:t>Cloud-D provides two synchronized mobile deployment strategies, ensuring universal compatibility across both Apple iOS and Google Android ecosystems:</w:t>
+        <w:br/>
+        <w:br/>
+        <w:t>1. Native React Native / Expo Application (mobile_app/App.js):</w:t>
+        <w:br/>
+        <w:t xml:space="preserve">   - Framework: React Native with Expo SDK and Lucide vector icons.</w:t>
+        <w:br/>
+        <w:t xml:space="preserve">   - Authentication Gating: State variable 'isAuthenticated' conditionally renders either the clean AuthScreen or the authenticated MainNavigation shell.</w:t>
+        <w:br/>
+        <w:t xml:space="preserve">   - Storage Sheets: Interactive file upload modal with post-quantum encryption toggle, folder selection, and live cryptographic verification progress.</w:t>
+        <w:br/>
+        <w:t xml:space="preserve">   - Simulation Suite: Interactive mobile simulation tab allowing mobile execution of manual attacks, automated defense rounds, and real-time viewing of Minimax game-tree scores.</w:t>
+        <w:br/>
+        <w:t xml:space="preserve">   - Package Specification: Defined in mobile_app/package.json and mobile_app/app.json, ready for standalone builds via 'eas build -p ios' and 'eas build -p android'.</w:t>
+        <w:br/>
+        <w:br/>
+        <w:t>2. Progressive Web App (PWA) Layer:</w:t>
+        <w:br/>
+        <w:t xml:space="preserve">   - Web App Manifest: Located at static/manifest.json with 'display': 'standalone', theme colors (#4c1d95), and multi-resolution high-DPI icons.</w:t>
+        <w:br/>
+        <w:t xml:space="preserve">   - Service Worker (static/sw.js): Caches core shell assets, handles offline resilience, and intercepts push events.</w:t>
+        <w:br/>
+        <w:t xml:space="preserve">   - iOS Safari Standalone: Users tap Share -&gt; 'Add to Home Screen' to launch full-screen without Safari browser bars.</w:t>
+        <w:br/>
+        <w:t xml:space="preserve">   - Android Chrome Standalone: Browser displays 'Install Cloud-D' ambient badge, running as an isolated Android APK task.</w:t>
       </w:r>
     </w:p>
     <w:p>
@@ -2165,22 +2543,64 @@
           <w:rFonts w:ascii="Arial" w:hAnsi="Arial"/>
           <w:b/>
           <w:color w:val="4C1D95"/>
-          <w:sz w:val="28"/>
+          <w:sz w:val="26"/>
         </w:rPr>
-        <w:t>4. Visual UI Layout &amp; Structural Architecture</w:t>
+        <w:t>5. Interactive Threat Simulation Center Specifications</w:t>
       </w:r>
     </w:p>
     <w:p>
       <w:r>
-        <w:t>The interface strictly adheres to user-provided visual screenshots:</w:t>
+        <w:t>The Threat Simulation Center (tab-threat-sim) has been completely aligned with the student investigator's exact visual layout and control requirements:</w:t>
         <w:br/>
-        <w:t>1. Recent Segment: Matches user screenshot media_1792989521886_bbf42880.png with title 'Recent', pill filter chips ('Type ▾', 'People ▾', 'Modified ▾', 'Source ▾'), view switcher [✓≡] [⊞], chronological 'Last week' section grouping, and detailed columns (Name, Uploaded date, Owner me with dark N avatar, File size, Location folder, Actions ⋮).</w:t>
         <w:br/>
-        <w:t>2. Home Workspace: Centered 'Search in Drive' bar, Suggested folders grid ('PS-7', '24X501', 'PS-6', 'Documents'), and Suggested files table.</w:t>
+        <w:t>1. Header Controls:</w:t>
         <w:br/>
-        <w:t>3. Autonomous Threat Defense Navigation: Clean sidebar containing exactly the 4 designated views: 🤖 Agent Background, 🏛️ Cloud Architecture, 📄 Security Report, and 🛡️ Threat Simulation.</w:t>
+        <w:t xml:space="preserve">   - Sub-badge: 'THREAT CENTER • INTERACTIVE &amp; AUTOMATED'</w:t>
         <w:br/>
-        <w:t>4. Duplicate Document Handling: Interactive modal offering Option 1: Save as New Version (n+1), Option 2: Replace Existing File (in-place overwrite), Option 3: Keep Both (Upload as Copy).</w:t>
+        <w:t xml:space="preserve">   - Title: 'Threat Simulation'</w:t>
+        <w:br/>
+        <w:t xml:space="preserve">   - Top Actions: '+ Step one round' (white trigger button) and purple 'Run Automated Defense' button.</w:t>
+        <w:br/>
+        <w:br/>
+        <w:t>2. Section 1 — Manual Attack Vector Induction:</w:t>
+        <w:br/>
+        <w:t xml:space="preserve">   - Adversarial Agent &amp; Target: Dropdown selecting Credential-Bot, Query-Bot, Tamper-Bot, or Replay-Bot.</w:t>
+        <w:br/>
+        <w:t xml:space="preserve">   - Attack Pressure: Dropdown selecting Normal, Elevated, or Maximum.</w:t>
+        <w:br/>
+        <w:t xml:space="preserve">   - Target Cloud Asset: Dynamic badge indicating selected target (e.g., '☁ Auth Server (Node 0)').</w:t>
+        <w:br/>
+        <w:t xml:space="preserve">   - Launch Button: Teal '⚡ Launch Manual Attack' executing instantaneous Minimax simulation.</w:t>
+        <w:br/>
+        <w:br/>
+        <w:t>3. Live Decision Outcome Result Card:</w:t>
+        <w:br/>
+        <w:t xml:space="preserve">   - Outcome Status Pill: Highlighted status (e.g., 'BLOCKED • CONTAINED' or 'ADAPTIVE INTERCEPTION').</w:t>
+        <w:br/>
+        <w:t xml:space="preserve">   - Metric Grid: 4-column breakdown: ADVERSARIAL VECTOR, DEFENDER SPECIALIST, DEFENSE ACTION, and UTILITY SCORE.</w:t>
+        <w:br/>
+        <w:t xml:space="preserve">   - Minimax Game-Tree Search: Visual summary of evaluated adversarial states and optimal defensive moves.</w:t>
+        <w:br/>
+        <w:t xml:space="preserve">   - Cloud Asset Protection: Real-time report of protected storage shards.</w:t>
+        <w:br/>
+        <w:br/>
+        <w:t>4. Section 2 — Automated Defense Simulation Engine:</w:t>
+        <w:br/>
+        <w:t xml:space="preserve">   - Simulation Rounds: Dropdown (5, 10, 25, 50 rounds).</w:t>
+        <w:br/>
+        <w:t xml:space="preserve">   - Threat Intensity: Dropdown (Low, Medium, High, Extreme).</w:t>
+        <w:br/>
+        <w:t xml:space="preserve">   - Active Attack Vectors: Dark chip checkboxes (Credential, DDoS, SQLi, Galois).</w:t>
+        <w:br/>
+        <w:br/>
+        <w:t>5. Section 3 — Decision Engine Defense Threshold:</w:t>
+        <w:br/>
+        <w:t xml:space="preserve">   - Slider Control: Teal interactive range slider (0.10 to 0.90) with real-time numeric readout (e.g., '0.40').</w:t>
+        <w:br/>
+        <w:br/>
+        <w:t>6. Section 4 — Recent Defense Decisions Log:</w:t>
+        <w:br/>
+        <w:t xml:space="preserve">   - Audit Table: Dark navy header with columns for Round #, Adversarial Vector, Defense Specialist, Action, Utility Score, and Status.</w:t>
       </w:r>
     </w:p>
     <w:p>
@@ -2192,32 +2612,7 @@
           <w:rFonts w:ascii="Arial" w:hAnsi="Arial"/>
           <w:b/>
           <w:color w:val="4C1D95"/>
-          <w:sz w:val="28"/>
-        </w:rPr>
-        <w:t>5. System Architecture &amp; Hardware Cryptography</w:t>
-      </w:r>
-    </w:p>
-    <w:p>
-      <w:r>
-        <w:t>Hardware-Authenticated Encryption Mechanics (AES-256-GCM AEAD):</w:t>
-        <w:br/>
-        <w:t>1. Unique Nonce: A cryptographically secure 96-bit (12-byte) initialization vector uniquely generated per revision.</w:t>
-        <w:br/>
-        <w:t>2. Galois Associated Authenticated Data (AAD): Formatted as 'cloud-d|v2|node-&lt;id&gt;|&lt;file_id&gt;|&lt;region&gt;'. Cryptographically binds the ciphertext to its geographic node and file ID.</w:t>
-        <w:br/>
-        <w:t>3. 128-Bit Authentication Tag: Galois field GHASH multiplier computes a 128-bit MAC. Any bit-flip or cross-node tampering triggers StorageIntegrityError.</w:t>
-      </w:r>
-    </w:p>
-    <w:p>
-      <w:pPr>
-        <w:spacing w:before="320" w:after="120"/>
-      </w:pPr>
-      <w:r>
-        <w:rPr>
-          <w:rFonts w:ascii="Arial" w:hAnsi="Arial"/>
-          <w:b/>
-          <w:color w:val="4C1D95"/>
-          <w:sz w:val="28"/>
+          <w:sz w:val="26"/>
         </w:rPr>
         <w:t>6. Complete API Specifications &amp; Route Contract</w:t>
       </w:r>
@@ -2239,10 +2634,10 @@
             <w:tcW w:type="dxa" w:w="1584"/>
             <w:shd w:fill="E2E8F0"/>
             <w:tcMar>
-              <w:top w:w="80" w:type="dxa"/>
-              <w:bottom w:w="80" w:type="dxa"/>
-              <w:left w:w="100" w:type="dxa"/>
-              <w:right w:w="100" w:type="dxa"/>
+              <w:top w:w="70" w:type="dxa"/>
+              <w:bottom w:w="70" w:type="dxa"/>
+              <w:left w:w="90" w:type="dxa"/>
+              <w:right w:w="90" w:type="dxa"/>
             </w:tcMar>
           </w:tcPr>
           <w:p>
@@ -2259,10 +2654,10 @@
             <w:tcW w:type="dxa" w:w="3744"/>
             <w:shd w:fill="E2E8F0"/>
             <w:tcMar>
-              <w:top w:w="80" w:type="dxa"/>
-              <w:bottom w:w="80" w:type="dxa"/>
-              <w:left w:w="100" w:type="dxa"/>
-              <w:right w:w="100" w:type="dxa"/>
+              <w:top w:w="70" w:type="dxa"/>
+              <w:bottom w:w="70" w:type="dxa"/>
+              <w:left w:w="90" w:type="dxa"/>
+              <w:right w:w="90" w:type="dxa"/>
             </w:tcMar>
           </w:tcPr>
           <w:p>
@@ -2279,10 +2674,10 @@
             <w:tcW w:type="dxa" w:w="4752"/>
             <w:shd w:fill="E2E8F0"/>
             <w:tcMar>
-              <w:top w:w="80" w:type="dxa"/>
-              <w:bottom w:w="80" w:type="dxa"/>
-              <w:left w:w="100" w:type="dxa"/>
-              <w:right w:w="100" w:type="dxa"/>
+              <w:top w:w="70" w:type="dxa"/>
+              <w:bottom w:w="70" w:type="dxa"/>
+              <w:left w:w="90" w:type="dxa"/>
+              <w:right w:w="90" w:type="dxa"/>
             </w:tcMar>
           </w:tcPr>
           <w:p>
@@ -2301,10 +2696,10 @@
             <w:tcW w:type="dxa" w:w="1584"/>
             <w:shd w:fill="F8FAFC"/>
             <w:tcMar>
-              <w:top w:w="60" w:type="dxa"/>
-              <w:bottom w:w="60" w:type="dxa"/>
-              <w:left w:w="80" w:type="dxa"/>
-              <w:right w:w="80" w:type="dxa"/>
+              <w:top w:w="50" w:type="dxa"/>
+              <w:bottom w:w="50" w:type="dxa"/>
+              <w:left w:w="70" w:type="dxa"/>
+              <w:right w:w="70" w:type="dxa"/>
             </w:tcMar>
           </w:tcPr>
           <w:p>
@@ -2313,7 +2708,7 @@
                 <w:rFonts w:ascii="Arial" w:hAnsi="Arial"/>
                 <w:b/>
                 <w:color w:val="4C1D95"/>
-                <w:sz w:val="17"/>
+                <w:sz w:val="16"/>
               </w:rPr>
               <w:t>POST</w:t>
             </w:r>
@@ -2324,17 +2719,17 @@
             <w:tcW w:type="dxa" w:w="3744"/>
             <w:shd w:fill="F8FAFC"/>
             <w:tcMar>
-              <w:top w:w="60" w:type="dxa"/>
-              <w:bottom w:w="60" w:type="dxa"/>
-              <w:left w:w="80" w:type="dxa"/>
-              <w:right w:w="80" w:type="dxa"/>
+              <w:top w:w="50" w:type="dxa"/>
+              <w:bottom w:w="50" w:type="dxa"/>
+              <w:left w:w="70" w:type="dxa"/>
+              <w:right w:w="70" w:type="dxa"/>
             </w:tcMar>
           </w:tcPr>
           <w:p>
             <w:r>
               <w:rPr>
                 <w:rFonts w:ascii="Courier New" w:hAnsi="Courier New"/>
-                <w:sz w:val="16"/>
+                <w:sz w:val="15"/>
               </w:rPr>
               <w:t>/api/auth/login</w:t>
             </w:r>
@@ -2345,19 +2740,19 @@
             <w:tcW w:type="dxa" w:w="4752"/>
             <w:shd w:fill="F8FAFC"/>
             <w:tcMar>
-              <w:top w:w="60" w:type="dxa"/>
-              <w:bottom w:w="60" w:type="dxa"/>
-              <w:left w:w="80" w:type="dxa"/>
-              <w:right w:w="80" w:type="dxa"/>
+              <w:top w:w="50" w:type="dxa"/>
+              <w:bottom w:w="50" w:type="dxa"/>
+              <w:left w:w="70" w:type="dxa"/>
+              <w:right w:w="70" w:type="dxa"/>
             </w:tcMar>
           </w:tcPr>
           <w:p>
             <w:r>
               <w:rPr>
                 <w:rFonts w:ascii="Arial" w:hAnsi="Arial"/>
-                <w:sz w:val="17"/>
+                <w:sz w:val="16"/>
               </w:rPr>
-              <w:t>Authenticates seeded credentials (nithish / nithish123) and sets permanent session cookie.</w:t>
+              <w:t>Authenticates credentials (nithish / nithish123) and sets permanent session cookie.</w:t>
             </w:r>
           </w:p>
         </w:tc>
@@ -2368,10 +2763,10 @@
             <w:tcW w:type="dxa" w:w="1584"/>
             <w:shd w:fill="FFFFFF"/>
             <w:tcMar>
-              <w:top w:w="60" w:type="dxa"/>
-              <w:bottom w:w="60" w:type="dxa"/>
-              <w:left w:w="80" w:type="dxa"/>
-              <w:right w:w="80" w:type="dxa"/>
+              <w:top w:w="50" w:type="dxa"/>
+              <w:bottom w:w="50" w:type="dxa"/>
+              <w:left w:w="70" w:type="dxa"/>
+              <w:right w:w="70" w:type="dxa"/>
             </w:tcMar>
           </w:tcPr>
           <w:p>
@@ -2380,7 +2775,275 @@
                 <w:rFonts w:ascii="Arial" w:hAnsi="Arial"/>
                 <w:b/>
                 <w:color w:val="4C1D95"/>
-                <w:sz w:val="17"/>
+                <w:sz w:val="16"/>
+              </w:rPr>
+              <w:t>POST</w:t>
+            </w:r>
+          </w:p>
+        </w:tc>
+        <w:tc>
+          <w:tcPr>
+            <w:tcW w:type="dxa" w:w="3744"/>
+            <w:shd w:fill="FFFFFF"/>
+            <w:tcMar>
+              <w:top w:w="50" w:type="dxa"/>
+              <w:bottom w:w="50" w:type="dxa"/>
+              <w:left w:w="70" w:type="dxa"/>
+              <w:right w:w="70" w:type="dxa"/>
+            </w:tcMar>
+          </w:tcPr>
+          <w:p>
+            <w:r>
+              <w:rPr>
+                <w:rFonts w:ascii="Courier New" w:hAnsi="Courier New"/>
+                <w:sz w:val="15"/>
+              </w:rPr>
+              <w:t>/api/auth/register</w:t>
+            </w:r>
+          </w:p>
+        </w:tc>
+        <w:tc>
+          <w:tcPr>
+            <w:tcW w:type="dxa" w:w="4752"/>
+            <w:shd w:fill="FFFFFF"/>
+            <w:tcMar>
+              <w:top w:w="50" w:type="dxa"/>
+              <w:bottom w:w="50" w:type="dxa"/>
+              <w:left w:w="70" w:type="dxa"/>
+              <w:right w:w="70" w:type="dxa"/>
+            </w:tcMar>
+          </w:tcPr>
+          <w:p>
+            <w:r>
+              <w:rPr>
+                <w:rFonts w:ascii="Arial" w:hAnsi="Arial"/>
+                <w:sz w:val="16"/>
+              </w:rPr>
+              <w:t>Registers new isolated tenant account and initializes private vault shard.</w:t>
+            </w:r>
+          </w:p>
+        </w:tc>
+      </w:tr>
+      <w:tr>
+        <w:tc>
+          <w:tcPr>
+            <w:tcW w:type="dxa" w:w="1584"/>
+            <w:shd w:fill="F8FAFC"/>
+            <w:tcMar>
+              <w:top w:w="50" w:type="dxa"/>
+              <w:bottom w:w="50" w:type="dxa"/>
+              <w:left w:w="70" w:type="dxa"/>
+              <w:right w:w="70" w:type="dxa"/>
+            </w:tcMar>
+          </w:tcPr>
+          <w:p>
+            <w:r>
+              <w:rPr>
+                <w:rFonts w:ascii="Arial" w:hAnsi="Arial"/>
+                <w:b/>
+                <w:color w:val="4C1D95"/>
+                <w:sz w:val="16"/>
+              </w:rPr>
+              <w:t>GET</w:t>
+            </w:r>
+          </w:p>
+        </w:tc>
+        <w:tc>
+          <w:tcPr>
+            <w:tcW w:type="dxa" w:w="3744"/>
+            <w:shd w:fill="F8FAFC"/>
+            <w:tcMar>
+              <w:top w:w="50" w:type="dxa"/>
+              <w:bottom w:w="50" w:type="dxa"/>
+              <w:left w:w="70" w:type="dxa"/>
+              <w:right w:w="70" w:type="dxa"/>
+            </w:tcMar>
+          </w:tcPr>
+          <w:p>
+            <w:r>
+              <w:rPr>
+                <w:rFonts w:ascii="Courier New" w:hAnsi="Courier New"/>
+                <w:sz w:val="15"/>
+              </w:rPr>
+              <w:t>/api/auth/me</w:t>
+            </w:r>
+          </w:p>
+        </w:tc>
+        <w:tc>
+          <w:tcPr>
+            <w:tcW w:type="dxa" w:w="4752"/>
+            <w:shd w:fill="F8FAFC"/>
+            <w:tcMar>
+              <w:top w:w="50" w:type="dxa"/>
+              <w:bottom w:w="50" w:type="dxa"/>
+              <w:left w:w="70" w:type="dxa"/>
+              <w:right w:w="70" w:type="dxa"/>
+            </w:tcMar>
+          </w:tcPr>
+          <w:p>
+            <w:r>
+              <w:rPr>
+                <w:rFonts w:ascii="Arial" w:hAnsi="Arial"/>
+                <w:sz w:val="16"/>
+              </w:rPr>
+              <w:t>Validates session state and returns authenticated user metadata and vault node ID.</w:t>
+            </w:r>
+          </w:p>
+        </w:tc>
+      </w:tr>
+      <w:tr>
+        <w:tc>
+          <w:tcPr>
+            <w:tcW w:type="dxa" w:w="1584"/>
+            <w:shd w:fill="FFFFFF"/>
+            <w:tcMar>
+              <w:top w:w="50" w:type="dxa"/>
+              <w:bottom w:w="50" w:type="dxa"/>
+              <w:left w:w="70" w:type="dxa"/>
+              <w:right w:w="70" w:type="dxa"/>
+            </w:tcMar>
+          </w:tcPr>
+          <w:p>
+            <w:r>
+              <w:rPr>
+                <w:rFonts w:ascii="Arial" w:hAnsi="Arial"/>
+                <w:b/>
+                <w:color w:val="4C1D95"/>
+                <w:sz w:val="16"/>
+              </w:rPr>
+              <w:t>POST</w:t>
+            </w:r>
+          </w:p>
+        </w:tc>
+        <w:tc>
+          <w:tcPr>
+            <w:tcW w:type="dxa" w:w="3744"/>
+            <w:shd w:fill="FFFFFF"/>
+            <w:tcMar>
+              <w:top w:w="50" w:type="dxa"/>
+              <w:bottom w:w="50" w:type="dxa"/>
+              <w:left w:w="70" w:type="dxa"/>
+              <w:right w:w="70" w:type="dxa"/>
+            </w:tcMar>
+          </w:tcPr>
+          <w:p>
+            <w:r>
+              <w:rPr>
+                <w:rFonts w:ascii="Courier New" w:hAnsi="Courier New"/>
+                <w:sz w:val="15"/>
+              </w:rPr>
+              <w:t>/api/auth/logout</w:t>
+            </w:r>
+          </w:p>
+        </w:tc>
+        <w:tc>
+          <w:tcPr>
+            <w:tcW w:type="dxa" w:w="4752"/>
+            <w:shd w:fill="FFFFFF"/>
+            <w:tcMar>
+              <w:top w:w="50" w:type="dxa"/>
+              <w:bottom w:w="50" w:type="dxa"/>
+              <w:left w:w="70" w:type="dxa"/>
+              <w:right w:w="70" w:type="dxa"/>
+            </w:tcMar>
+          </w:tcPr>
+          <w:p>
+            <w:r>
+              <w:rPr>
+                <w:rFonts w:ascii="Arial" w:hAnsi="Arial"/>
+                <w:sz w:val="16"/>
+              </w:rPr>
+              <w:t>Clears active session cookie and resets client-side state.</w:t>
+            </w:r>
+          </w:p>
+        </w:tc>
+      </w:tr>
+      <w:tr>
+        <w:tc>
+          <w:tcPr>
+            <w:tcW w:type="dxa" w:w="1584"/>
+            <w:shd w:fill="F8FAFC"/>
+            <w:tcMar>
+              <w:top w:w="50" w:type="dxa"/>
+              <w:bottom w:w="50" w:type="dxa"/>
+              <w:left w:w="70" w:type="dxa"/>
+              <w:right w:w="70" w:type="dxa"/>
+            </w:tcMar>
+          </w:tcPr>
+          <w:p>
+            <w:r>
+              <w:rPr>
+                <w:rFonts w:ascii="Arial" w:hAnsi="Arial"/>
+                <w:b/>
+                <w:color w:val="4C1D95"/>
+                <w:sz w:val="16"/>
+              </w:rPr>
+              <w:t>GET</w:t>
+            </w:r>
+          </w:p>
+        </w:tc>
+        <w:tc>
+          <w:tcPr>
+            <w:tcW w:type="dxa" w:w="3744"/>
+            <w:shd w:fill="F8FAFC"/>
+            <w:tcMar>
+              <w:top w:w="50" w:type="dxa"/>
+              <w:bottom w:w="50" w:type="dxa"/>
+              <w:left w:w="70" w:type="dxa"/>
+              <w:right w:w="70" w:type="dxa"/>
+            </w:tcMar>
+          </w:tcPr>
+          <w:p>
+            <w:r>
+              <w:rPr>
+                <w:rFonts w:ascii="Courier New" w:hAnsi="Courier New"/>
+                <w:sz w:val="15"/>
+              </w:rPr>
+              <w:t>/api/docs/executive-handover.docx</w:t>
+            </w:r>
+          </w:p>
+        </w:tc>
+        <w:tc>
+          <w:tcPr>
+            <w:tcW w:type="dxa" w:w="4752"/>
+            <w:shd w:fill="F8FAFC"/>
+            <w:tcMar>
+              <w:top w:w="50" w:type="dxa"/>
+              <w:bottom w:w="50" w:type="dxa"/>
+              <w:left w:w="70" w:type="dxa"/>
+              <w:right w:w="70" w:type="dxa"/>
+            </w:tcMar>
+          </w:tcPr>
+          <w:p>
+            <w:r>
+              <w:rPr>
+                <w:rFonts w:ascii="Arial" w:hAnsi="Arial"/>
+                <w:sz w:val="16"/>
+              </w:rPr>
+              <w:t>Auto-downloads this official executive handover Word document (.docx).</w:t>
+            </w:r>
+          </w:p>
+        </w:tc>
+      </w:tr>
+      <w:tr>
+        <w:tc>
+          <w:tcPr>
+            <w:tcW w:type="dxa" w:w="1584"/>
+            <w:shd w:fill="FFFFFF"/>
+            <w:tcMar>
+              <w:top w:w="50" w:type="dxa"/>
+              <w:bottom w:w="50" w:type="dxa"/>
+              <w:left w:w="70" w:type="dxa"/>
+              <w:right w:w="70" w:type="dxa"/>
+            </w:tcMar>
+          </w:tcPr>
+          <w:p>
+            <w:r>
+              <w:rPr>
+                <w:rFonts w:ascii="Arial" w:hAnsi="Arial"/>
+                <w:b/>
+                <w:color w:val="4C1D95"/>
+                <w:sz w:val="16"/>
               </w:rPr>
               <w:t>GET</w:t>
             </w:r>
@@ -2391,17 +3054,17 @@
             <w:tcW w:type="dxa" w:w="3744"/>
             <w:shd w:fill="FFFFFF"/>
             <w:tcMar>
-              <w:top w:w="60" w:type="dxa"/>
-              <w:bottom w:w="60" w:type="dxa"/>
-              <w:left w:w="80" w:type="dxa"/>
-              <w:right w:w="80" w:type="dxa"/>
+              <w:top w:w="50" w:type="dxa"/>
+              <w:bottom w:w="50" w:type="dxa"/>
+              <w:left w:w="70" w:type="dxa"/>
+              <w:right w:w="70" w:type="dxa"/>
             </w:tcMar>
           </w:tcPr>
           <w:p>
             <w:r>
               <w:rPr>
                 <w:rFonts w:ascii="Courier New" w:hAnsi="Courier New"/>
-                <w:sz w:val="16"/>
+                <w:sz w:val="15"/>
               </w:rPr>
               <w:t>/api/system/storage-info</w:t>
             </w:r>
@@ -2412,19 +3075,19 @@
             <w:tcW w:type="dxa" w:w="4752"/>
             <w:shd w:fill="FFFFFF"/>
             <w:tcMar>
-              <w:top w:w="60" w:type="dxa"/>
-              <w:bottom w:w="60" w:type="dxa"/>
-              <w:left w:w="80" w:type="dxa"/>
-              <w:right w:w="80" w:type="dxa"/>
+              <w:top w:w="50" w:type="dxa"/>
+              <w:bottom w:w="50" w:type="dxa"/>
+              <w:left w:w="70" w:type="dxa"/>
+              <w:right w:w="70" w:type="dxa"/>
             </w:tcMar>
           </w:tcPr>
           <w:p>
             <w:r>
               <w:rPr>
                 <w:rFonts w:ascii="Arial" w:hAnsi="Arial"/>
-                <w:sz w:val="17"/>
+                <w:sz w:val="16"/>
               </w:rPr>
-              <w:t>Returns Task A Render persistent disk telemetry, capacity, and cold-boot health.</w:t>
+              <w:t>Returns Render persistent disk telemetry, storage capacity, and mount health.</w:t>
             </w:r>
           </w:p>
         </w:tc>
@@ -2435,10 +3098,10 @@
             <w:tcW w:type="dxa" w:w="1584"/>
             <w:shd w:fill="F8FAFC"/>
             <w:tcMar>
-              <w:top w:w="60" w:type="dxa"/>
-              <w:bottom w:w="60" w:type="dxa"/>
-              <w:left w:w="80" w:type="dxa"/>
-              <w:right w:w="80" w:type="dxa"/>
+              <w:top w:w="50" w:type="dxa"/>
+              <w:bottom w:w="50" w:type="dxa"/>
+              <w:left w:w="70" w:type="dxa"/>
+              <w:right w:w="70" w:type="dxa"/>
             </w:tcMar>
           </w:tcPr>
           <w:p>
@@ -2447,7 +3110,7 @@
                 <w:rFonts w:ascii="Arial" w:hAnsi="Arial"/>
                 <w:b/>
                 <w:color w:val="4C1D95"/>
-                <w:sz w:val="17"/>
+                <w:sz w:val="16"/>
               </w:rPr>
               <w:t>GET</w:t>
             </w:r>
@@ -2458,17 +3121,17 @@
             <w:tcW w:type="dxa" w:w="3744"/>
             <w:shd w:fill="F8FAFC"/>
             <w:tcMar>
-              <w:top w:w="60" w:type="dxa"/>
-              <w:bottom w:w="60" w:type="dxa"/>
-              <w:left w:w="80" w:type="dxa"/>
-              <w:right w:w="80" w:type="dxa"/>
+              <w:top w:w="50" w:type="dxa"/>
+              <w:bottom w:w="50" w:type="dxa"/>
+              <w:left w:w="70" w:type="dxa"/>
+              <w:right w:w="70" w:type="dxa"/>
             </w:tcMar>
           </w:tcPr>
           <w:p>
             <w:r>
               <w:rPr>
                 <w:rFonts w:ascii="Courier New" w:hAnsi="Courier New"/>
-                <w:sz w:val="16"/>
+                <w:sz w:val="15"/>
               </w:rPr>
               <w:t>/api/files</w:t>
             </w:r>
@@ -2479,17 +3142,17 @@
             <w:tcW w:type="dxa" w:w="4752"/>
             <w:shd w:fill="F8FAFC"/>
             <w:tcMar>
-              <w:top w:w="60" w:type="dxa"/>
-              <w:bottom w:w="60" w:type="dxa"/>
-              <w:left w:w="80" w:type="dxa"/>
-              <w:right w:w="80" w:type="dxa"/>
+              <w:top w:w="50" w:type="dxa"/>
+              <w:bottom w:w="50" w:type="dxa"/>
+              <w:left w:w="70" w:type="dxa"/>
+              <w:right w:w="70" w:type="dxa"/>
             </w:tcMar>
           </w:tcPr>
           <w:p>
             <w:r>
               <w:rPr>
                 <w:rFonts w:ascii="Arial" w:hAnsi="Arial"/>
-                <w:sz w:val="17"/>
+                <w:sz w:val="16"/>
               </w:rPr>
               <w:t>Lists active (is_current=1) files in target folder, including sizes, versions, and owners.</w:t>
             </w:r>
@@ -2502,10 +3165,10 @@
             <w:tcW w:type="dxa" w:w="1584"/>
             <w:shd w:fill="FFFFFF"/>
             <w:tcMar>
-              <w:top w:w="60" w:type="dxa"/>
-              <w:bottom w:w="60" w:type="dxa"/>
-              <w:left w:w="80" w:type="dxa"/>
-              <w:right w:w="80" w:type="dxa"/>
+              <w:top w:w="50" w:type="dxa"/>
+              <w:bottom w:w="50" w:type="dxa"/>
+              <w:left w:w="70" w:type="dxa"/>
+              <w:right w:w="70" w:type="dxa"/>
             </w:tcMar>
           </w:tcPr>
           <w:p>
@@ -2514,7 +3177,7 @@
                 <w:rFonts w:ascii="Arial" w:hAnsi="Arial"/>
                 <w:b/>
                 <w:color w:val="4C1D95"/>
-                <w:sz w:val="17"/>
+                <w:sz w:val="16"/>
               </w:rPr>
               <w:t>POST</w:t>
             </w:r>
@@ -2525,17 +3188,17 @@
             <w:tcW w:type="dxa" w:w="3744"/>
             <w:shd w:fill="FFFFFF"/>
             <w:tcMar>
-              <w:top w:w="60" w:type="dxa"/>
-              <w:bottom w:w="60" w:type="dxa"/>
-              <w:left w:w="80" w:type="dxa"/>
-              <w:right w:w="80" w:type="dxa"/>
+              <w:top w:w="50" w:type="dxa"/>
+              <w:bottom w:w="50" w:type="dxa"/>
+              <w:left w:w="70" w:type="dxa"/>
+              <w:right w:w="70" w:type="dxa"/>
             </w:tcMar>
           </w:tcPr>
           <w:p>
             <w:r>
               <w:rPr>
                 <w:rFonts w:ascii="Courier New" w:hAnsi="Courier New"/>
-                <w:sz w:val="16"/>
+                <w:sz w:val="15"/>
               </w:rPr>
               <w:t>/api/upload</w:t>
             </w:r>
@@ -2546,17 +3209,17 @@
             <w:tcW w:type="dxa" w:w="4752"/>
             <w:shd w:fill="FFFFFF"/>
             <w:tcMar>
-              <w:top w:w="60" w:type="dxa"/>
-              <w:bottom w:w="60" w:type="dxa"/>
-              <w:left w:w="80" w:type="dxa"/>
-              <w:right w:w="80" w:type="dxa"/>
+              <w:top w:w="50" w:type="dxa"/>
+              <w:bottom w:w="50" w:type="dxa"/>
+              <w:left w:w="70" w:type="dxa"/>
+              <w:right w:w="70" w:type="dxa"/>
             </w:tcMar>
           </w:tcPr>
           <w:p>
             <w:r>
               <w:rPr>
                 <w:rFonts w:ascii="Arial" w:hAnsi="Arial"/>
-                <w:sz w:val="17"/>
+                <w:sz w:val="16"/>
               </w:rPr>
               <w:t>Uploads and AEAD seals file; supports target_logical_id (n+1) and use_post_quantum flag.</w:t>
             </w:r>
@@ -2569,10 +3232,10 @@
             <w:tcW w:type="dxa" w:w="1584"/>
             <w:shd w:fill="F8FAFC"/>
             <w:tcMar>
-              <w:top w:w="60" w:type="dxa"/>
-              <w:bottom w:w="60" w:type="dxa"/>
-              <w:left w:w="80" w:type="dxa"/>
-              <w:right w:w="80" w:type="dxa"/>
+              <w:top w:w="50" w:type="dxa"/>
+              <w:bottom w:w="50" w:type="dxa"/>
+              <w:left w:w="70" w:type="dxa"/>
+              <w:right w:w="70" w:type="dxa"/>
             </w:tcMar>
           </w:tcPr>
           <w:p>
@@ -2581,7 +3244,7 @@
                 <w:rFonts w:ascii="Arial" w:hAnsi="Arial"/>
                 <w:b/>
                 <w:color w:val="4C1D95"/>
-                <w:sz w:val="17"/>
+                <w:sz w:val="16"/>
               </w:rPr>
               <w:t>POST</w:t>
             </w:r>
@@ -2592,17 +3255,17 @@
             <w:tcW w:type="dxa" w:w="3744"/>
             <w:shd w:fill="F8FAFC"/>
             <w:tcMar>
-              <w:top w:w="60" w:type="dxa"/>
-              <w:bottom w:w="60" w:type="dxa"/>
-              <w:left w:w="80" w:type="dxa"/>
-              <w:right w:w="80" w:type="dxa"/>
+              <w:top w:w="50" w:type="dxa"/>
+              <w:bottom w:w="50" w:type="dxa"/>
+              <w:left w:w="70" w:type="dxa"/>
+              <w:right w:w="70" w:type="dxa"/>
             </w:tcMar>
           </w:tcPr>
           <w:p>
             <w:r>
               <w:rPr>
                 <w:rFonts w:ascii="Courier New" w:hAnsi="Courier New"/>
-                <w:sz w:val="16"/>
+                <w:sz w:val="15"/>
               </w:rPr>
               <w:t>/api/files/check-duplicate</w:t>
             </w:r>
@@ -2613,17 +3276,17 @@
             <w:tcW w:type="dxa" w:w="4752"/>
             <w:shd w:fill="F8FAFC"/>
             <w:tcMar>
-              <w:top w:w="60" w:type="dxa"/>
-              <w:bottom w:w="60" w:type="dxa"/>
-              <w:left w:w="80" w:type="dxa"/>
-              <w:right w:w="80" w:type="dxa"/>
+              <w:top w:w="50" w:type="dxa"/>
+              <w:bottom w:w="50" w:type="dxa"/>
+              <w:left w:w="70" w:type="dxa"/>
+              <w:right w:w="70" w:type="dxa"/>
             </w:tcMar>
           </w:tcPr>
           <w:p>
             <w:r>
               <w:rPr>
                 <w:rFonts w:ascii="Arial" w:hAnsi="Arial"/>
-                <w:sz w:val="17"/>
+                <w:sz w:val="16"/>
               </w:rPr>
               <w:t>Checks if filename exists in folder; returns {exists, duplicate_info}.</w:t>
             </w:r>
@@ -2636,10 +3299,10 @@
             <w:tcW w:type="dxa" w:w="1584"/>
             <w:shd w:fill="FFFFFF"/>
             <w:tcMar>
-              <w:top w:w="60" w:type="dxa"/>
-              <w:bottom w:w="60" w:type="dxa"/>
-              <w:left w:w="80" w:type="dxa"/>
-              <w:right w:w="80" w:type="dxa"/>
+              <w:top w:w="50" w:type="dxa"/>
+              <w:bottom w:w="50" w:type="dxa"/>
+              <w:left w:w="70" w:type="dxa"/>
+              <w:right w:w="70" w:type="dxa"/>
             </w:tcMar>
           </w:tcPr>
           <w:p>
@@ -2648,7 +3311,7 @@
                 <w:rFonts w:ascii="Arial" w:hAnsi="Arial"/>
                 <w:b/>
                 <w:color w:val="4C1D95"/>
-                <w:sz w:val="17"/>
+                <w:sz w:val="16"/>
               </w:rPr>
               <w:t>GET</w:t>
             </w:r>
@@ -2659,17 +3322,17 @@
             <w:tcW w:type="dxa" w:w="3744"/>
             <w:shd w:fill="FFFFFF"/>
             <w:tcMar>
-              <w:top w:w="60" w:type="dxa"/>
-              <w:bottom w:w="60" w:type="dxa"/>
-              <w:left w:w="80" w:type="dxa"/>
-              <w:right w:w="80" w:type="dxa"/>
+              <w:top w:w="50" w:type="dxa"/>
+              <w:bottom w:w="50" w:type="dxa"/>
+              <w:left w:w="70" w:type="dxa"/>
+              <w:right w:w="70" w:type="dxa"/>
             </w:tcMar>
           </w:tcPr>
           <w:p>
             <w:r>
               <w:rPr>
                 <w:rFonts w:ascii="Courier New" w:hAnsi="Courier New"/>
-                <w:sz w:val="16"/>
+                <w:sz w:val="15"/>
               </w:rPr>
               <w:t>/api/files/&lt;id&gt;/verify</w:t>
             </w:r>
@@ -2680,17 +3343,17 @@
             <w:tcW w:type="dxa" w:w="4752"/>
             <w:shd w:fill="FFFFFF"/>
             <w:tcMar>
-              <w:top w:w="60" w:type="dxa"/>
-              <w:bottom w:w="60" w:type="dxa"/>
-              <w:left w:w="80" w:type="dxa"/>
-              <w:right w:w="80" w:type="dxa"/>
+              <w:top w:w="50" w:type="dxa"/>
+              <w:bottom w:w="50" w:type="dxa"/>
+              <w:left w:w="70" w:type="dxa"/>
+              <w:right w:w="70" w:type="dxa"/>
             </w:tcMar>
           </w:tcPr>
           <w:p>
             <w:r>
               <w:rPr>
                 <w:rFonts w:ascii="Arial" w:hAnsi="Arial"/>
-                <w:sz w:val="17"/>
+                <w:sz w:val="16"/>
               </w:rPr>
               <w:t>Extracts 96-bit nonce, SHA-256 digest, and validates 128-bit Galois GHASH tag.</w:t>
             </w:r>
@@ -2703,10 +3366,10 @@
             <w:tcW w:type="dxa" w:w="1584"/>
             <w:shd w:fill="F8FAFC"/>
             <w:tcMar>
-              <w:top w:w="60" w:type="dxa"/>
-              <w:bottom w:w="60" w:type="dxa"/>
-              <w:left w:w="80" w:type="dxa"/>
-              <w:right w:w="80" w:type="dxa"/>
+              <w:top w:w="50" w:type="dxa"/>
+              <w:bottom w:w="50" w:type="dxa"/>
+              <w:left w:w="70" w:type="dxa"/>
+              <w:right w:w="70" w:type="dxa"/>
             </w:tcMar>
           </w:tcPr>
           <w:p>
@@ -2715,7 +3378,7 @@
                 <w:rFonts w:ascii="Arial" w:hAnsi="Arial"/>
                 <w:b/>
                 <w:color w:val="4C1D95"/>
-                <w:sz w:val="17"/>
+                <w:sz w:val="16"/>
               </w:rPr>
               <w:t>GET</w:t>
             </w:r>
@@ -2726,17 +3389,17 @@
             <w:tcW w:type="dxa" w:w="3744"/>
             <w:shd w:fill="F8FAFC"/>
             <w:tcMar>
-              <w:top w:w="60" w:type="dxa"/>
-              <w:bottom w:w="60" w:type="dxa"/>
-              <w:left w:w="80" w:type="dxa"/>
-              <w:right w:w="80" w:type="dxa"/>
+              <w:top w:w="50" w:type="dxa"/>
+              <w:bottom w:w="50" w:type="dxa"/>
+              <w:left w:w="70" w:type="dxa"/>
+              <w:right w:w="70" w:type="dxa"/>
             </w:tcMar>
           </w:tcPr>
           <w:p>
             <w:r>
               <w:rPr>
                 <w:rFonts w:ascii="Courier New" w:hAnsi="Courier New"/>
-                <w:sz w:val="16"/>
+                <w:sz w:val="15"/>
               </w:rPr>
               <w:t>/api/files/&lt;id&gt;/preview</w:t>
             </w:r>
@@ -2747,17 +3410,17 @@
             <w:tcW w:type="dxa" w:w="4752"/>
             <w:shd w:fill="F8FAFC"/>
             <w:tcMar>
-              <w:top w:w="60" w:type="dxa"/>
-              <w:bottom w:w="60" w:type="dxa"/>
-              <w:left w:w="80" w:type="dxa"/>
-              <w:right w:w="80" w:type="dxa"/>
+              <w:top w:w="50" w:type="dxa"/>
+              <w:bottom w:w="50" w:type="dxa"/>
+              <w:left w:w="70" w:type="dxa"/>
+              <w:right w:w="70" w:type="dxa"/>
             </w:tcMar>
           </w:tcPr>
           <w:p>
             <w:r>
               <w:rPr>
                 <w:rFonts w:ascii="Arial" w:hAnsi="Arial"/>
-                <w:sz w:val="17"/>
+                <w:sz w:val="16"/>
               </w:rPr>
               <w:t>Decrypts AES-256-GCM payload on-the-fly for in-browser plaintext inspection.</w:t>
             </w:r>
@@ -2770,10 +3433,10 @@
             <w:tcW w:type="dxa" w:w="1584"/>
             <w:shd w:fill="FFFFFF"/>
             <w:tcMar>
-              <w:top w:w="60" w:type="dxa"/>
-              <w:bottom w:w="60" w:type="dxa"/>
-              <w:left w:w="80" w:type="dxa"/>
-              <w:right w:w="80" w:type="dxa"/>
+              <w:top w:w="50" w:type="dxa"/>
+              <w:bottom w:w="50" w:type="dxa"/>
+              <w:left w:w="70" w:type="dxa"/>
+              <w:right w:w="70" w:type="dxa"/>
             </w:tcMar>
           </w:tcPr>
           <w:p>
@@ -2782,7 +3445,7 @@
                 <w:rFonts w:ascii="Arial" w:hAnsi="Arial"/>
                 <w:b/>
                 <w:color w:val="4C1D95"/>
-                <w:sz w:val="17"/>
+                <w:sz w:val="16"/>
               </w:rPr>
               <w:t>GET</w:t>
             </w:r>
@@ -2793,17 +3456,17 @@
             <w:tcW w:type="dxa" w:w="3744"/>
             <w:shd w:fill="FFFFFF"/>
             <w:tcMar>
-              <w:top w:w="60" w:type="dxa"/>
-              <w:bottom w:w="60" w:type="dxa"/>
-              <w:left w:w="80" w:type="dxa"/>
-              <w:right w:w="80" w:type="dxa"/>
+              <w:top w:w="50" w:type="dxa"/>
+              <w:bottom w:w="50" w:type="dxa"/>
+              <w:left w:w="70" w:type="dxa"/>
+              <w:right w:w="70" w:type="dxa"/>
             </w:tcMar>
           </w:tcPr>
           <w:p>
             <w:r>
               <w:rPr>
                 <w:rFonts w:ascii="Courier New" w:hAnsi="Courier New"/>
-                <w:sz w:val="16"/>
+                <w:sz w:val="15"/>
               </w:rPr>
               <w:t>/api/files/diff</w:t>
             </w:r>
@@ -2814,17 +3477,17 @@
             <w:tcW w:type="dxa" w:w="4752"/>
             <w:shd w:fill="FFFFFF"/>
             <w:tcMar>
-              <w:top w:w="60" w:type="dxa"/>
-              <w:bottom w:w="60" w:type="dxa"/>
-              <w:left w:w="80" w:type="dxa"/>
-              <w:right w:w="80" w:type="dxa"/>
+              <w:top w:w="50" w:type="dxa"/>
+              <w:bottom w:w="50" w:type="dxa"/>
+              <w:left w:w="70" w:type="dxa"/>
+              <w:right w:w="70" w:type="dxa"/>
             </w:tcMar>
           </w:tcPr>
           <w:p>
             <w:r>
               <w:rPr>
                 <w:rFonts w:ascii="Arial" w:hAnsi="Arial"/>
-                <w:sz w:val="17"/>
+                <w:sz w:val="16"/>
               </w:rPr>
               <w:t>Computes unified line diff between revisions with line addition/deletion metrics.</w:t>
             </w:r>
@@ -2837,10 +3500,10 @@
             <w:tcW w:type="dxa" w:w="1584"/>
             <w:shd w:fill="F8FAFC"/>
             <w:tcMar>
-              <w:top w:w="60" w:type="dxa"/>
-              <w:bottom w:w="60" w:type="dxa"/>
-              <w:left w:w="80" w:type="dxa"/>
-              <w:right w:w="80" w:type="dxa"/>
+              <w:top w:w="50" w:type="dxa"/>
+              <w:bottom w:w="50" w:type="dxa"/>
+              <w:left w:w="70" w:type="dxa"/>
+              <w:right w:w="70" w:type="dxa"/>
             </w:tcMar>
           </w:tcPr>
           <w:p>
@@ -2849,7 +3512,7 @@
                 <w:rFonts w:ascii="Arial" w:hAnsi="Arial"/>
                 <w:b/>
                 <w:color w:val="4C1D95"/>
-                <w:sz w:val="17"/>
+                <w:sz w:val="16"/>
               </w:rPr>
               <w:t>GET/POST</w:t>
             </w:r>
@@ -2860,17 +3523,17 @@
             <w:tcW w:type="dxa" w:w="3744"/>
             <w:shd w:fill="F8FAFC"/>
             <w:tcMar>
-              <w:top w:w="60" w:type="dxa"/>
-              <w:bottom w:w="60" w:type="dxa"/>
-              <w:left w:w="80" w:type="dxa"/>
-              <w:right w:w="80" w:type="dxa"/>
+              <w:top w:w="50" w:type="dxa"/>
+              <w:bottom w:w="50" w:type="dxa"/>
+              <w:left w:w="70" w:type="dxa"/>
+              <w:right w:w="70" w:type="dxa"/>
             </w:tcMar>
           </w:tcPr>
           <w:p>
             <w:r>
               <w:rPr>
                 <w:rFonts w:ascii="Courier New" w:hAnsi="Courier New"/>
-                <w:sz w:val="16"/>
+                <w:sz w:val="15"/>
               </w:rPr>
               <w:t>/api/collab/&lt;id&gt;/ops</w:t>
             </w:r>
@@ -2881,19 +3544,19 @@
             <w:tcW w:type="dxa" w:w="4752"/>
             <w:shd w:fill="F8FAFC"/>
             <w:tcMar>
-              <w:top w:w="60" w:type="dxa"/>
-              <w:bottom w:w="60" w:type="dxa"/>
-              <w:left w:w="80" w:type="dxa"/>
-              <w:right w:w="80" w:type="dxa"/>
+              <w:top w:w="50" w:type="dxa"/>
+              <w:bottom w:w="50" w:type="dxa"/>
+              <w:left w:w="70" w:type="dxa"/>
+              <w:right w:w="70" w:type="dxa"/>
             </w:tcMar>
           </w:tcPr>
           <w:p>
             <w:r>
               <w:rPr>
                 <w:rFonts w:ascii="Arial" w:hAnsi="Arial"/>
-                <w:sz w:val="17"/>
+                <w:sz w:val="16"/>
               </w:rPr>
-              <w:t>Task B: Syncs or appends Sequence CRDT character operations and rich-text OT spans.</w:t>
+              <w:t>Syncs or appends Sequence CRDT character operations and rich-text OT spans.</w:t>
             </w:r>
           </w:p>
         </w:tc>
@@ -2904,10 +3567,10 @@
             <w:tcW w:type="dxa" w:w="1584"/>
             <w:shd w:fill="FFFFFF"/>
             <w:tcMar>
-              <w:top w:w="60" w:type="dxa"/>
-              <w:bottom w:w="60" w:type="dxa"/>
-              <w:left w:w="80" w:type="dxa"/>
-              <w:right w:w="80" w:type="dxa"/>
+              <w:top w:w="50" w:type="dxa"/>
+              <w:bottom w:w="50" w:type="dxa"/>
+              <w:left w:w="70" w:type="dxa"/>
+              <w:right w:w="70" w:type="dxa"/>
             </w:tcMar>
           </w:tcPr>
           <w:p>
@@ -2916,7 +3579,7 @@
                 <w:rFonts w:ascii="Arial" w:hAnsi="Arial"/>
                 <w:b/>
                 <w:color w:val="4C1D95"/>
-                <w:sz w:val="17"/>
+                <w:sz w:val="16"/>
               </w:rPr>
               <w:t>GET/POST</w:t>
             </w:r>
@@ -2927,17 +3590,17 @@
             <w:tcW w:type="dxa" w:w="3744"/>
             <w:shd w:fill="FFFFFF"/>
             <w:tcMar>
-              <w:top w:w="60" w:type="dxa"/>
-              <w:bottom w:w="60" w:type="dxa"/>
-              <w:left w:w="80" w:type="dxa"/>
-              <w:right w:w="80" w:type="dxa"/>
+              <w:top w:w="50" w:type="dxa"/>
+              <w:bottom w:w="50" w:type="dxa"/>
+              <w:left w:w="70" w:type="dxa"/>
+              <w:right w:w="70" w:type="dxa"/>
             </w:tcMar>
           </w:tcPr>
           <w:p>
             <w:r>
               <w:rPr>
                 <w:rFonts w:ascii="Courier New" w:hAnsi="Courier New"/>
-                <w:sz w:val="16"/>
+                <w:sz w:val="15"/>
               </w:rPr>
               <w:t>/api/collab/&lt;id&gt;/cursors</w:t>
             </w:r>
@@ -2948,19 +3611,19 @@
             <w:tcW w:type="dxa" w:w="4752"/>
             <w:shd w:fill="FFFFFF"/>
             <w:tcMar>
-              <w:top w:w="60" w:type="dxa"/>
-              <w:bottom w:w="60" w:type="dxa"/>
-              <w:left w:w="80" w:type="dxa"/>
-              <w:right w:w="80" w:type="dxa"/>
+              <w:top w:w="50" w:type="dxa"/>
+              <w:bottom w:w="50" w:type="dxa"/>
+              <w:left w:w="70" w:type="dxa"/>
+              <w:right w:w="70" w:type="dxa"/>
             </w:tcMar>
           </w:tcPr>
           <w:p>
             <w:r>
               <w:rPr>
                 <w:rFonts w:ascii="Arial" w:hAnsi="Arial"/>
-                <w:sz w:val="17"/>
+                <w:sz w:val="16"/>
               </w:rPr>
-              <w:t>Task B: Broadcasts and retrieves live multi-user cursor presence and selections.</w:t>
+              <w:t>Broadcasts and retrieves live multi-user cursor presence and selections.</w:t>
             </w:r>
           </w:p>
         </w:tc>
@@ -2971,10 +3634,10 @@
             <w:tcW w:type="dxa" w:w="1584"/>
             <w:shd w:fill="F8FAFC"/>
             <w:tcMar>
-              <w:top w:w="60" w:type="dxa"/>
-              <w:bottom w:w="60" w:type="dxa"/>
-              <w:left w:w="80" w:type="dxa"/>
-              <w:right w:w="80" w:type="dxa"/>
+              <w:top w:w="50" w:type="dxa"/>
+              <w:bottom w:w="50" w:type="dxa"/>
+              <w:left w:w="70" w:type="dxa"/>
+              <w:right w:w="70" w:type="dxa"/>
             </w:tcMar>
           </w:tcPr>
           <w:p>
@@ -2983,7 +3646,7 @@
                 <w:rFonts w:ascii="Arial" w:hAnsi="Arial"/>
                 <w:b/>
                 <w:color w:val="4C1D95"/>
-                <w:sz w:val="17"/>
+                <w:sz w:val="16"/>
               </w:rPr>
               <w:t>GET</w:t>
             </w:r>
@@ -2994,17 +3657,17 @@
             <w:tcW w:type="dxa" w:w="3744"/>
             <w:shd w:fill="F8FAFC"/>
             <w:tcMar>
-              <w:top w:w="60" w:type="dxa"/>
-              <w:bottom w:w="60" w:type="dxa"/>
-              <w:left w:w="80" w:type="dxa"/>
-              <w:right w:w="80" w:type="dxa"/>
+              <w:top w:w="50" w:type="dxa"/>
+              <w:bottom w:w="50" w:type="dxa"/>
+              <w:left w:w="70" w:type="dxa"/>
+              <w:right w:w="70" w:type="dxa"/>
             </w:tcMar>
           </w:tcPr>
           <w:p>
             <w:r>
               <w:rPr>
                 <w:rFonts w:ascii="Courier New" w:hAnsi="Courier New"/>
-                <w:sz w:val="16"/>
+                <w:sz w:val="15"/>
               </w:rPr>
               <w:t>/api/shards/topology</w:t>
             </w:r>
@@ -3015,19 +3678,19 @@
             <w:tcW w:type="dxa" w:w="4752"/>
             <w:shd w:fill="F8FAFC"/>
             <w:tcMar>
-              <w:top w:w="60" w:type="dxa"/>
-              <w:bottom w:w="60" w:type="dxa"/>
-              <w:left w:w="80" w:type="dxa"/>
-              <w:right w:w="80" w:type="dxa"/>
+              <w:top w:w="50" w:type="dxa"/>
+              <w:bottom w:w="50" w:type="dxa"/>
+              <w:left w:w="70" w:type="dxa"/>
+              <w:right w:w="70" w:type="dxa"/>
             </w:tcMar>
           </w:tcPr>
           <w:p>
             <w:r>
               <w:rPr>
                 <w:rFonts w:ascii="Arial" w:hAnsi="Arial"/>
-                <w:sz w:val="17"/>
+                <w:sz w:val="16"/>
               </w:rPr>
-              <w:t>Task C: Returns 4-tier cross-region shard topology and latency metrics.</w:t>
+              <w:t>Returns 4-tier cross-region shard topology and latency metrics.</w:t>
             </w:r>
           </w:p>
         </w:tc>
@@ -3038,10 +3701,10 @@
             <w:tcW w:type="dxa" w:w="1584"/>
             <w:shd w:fill="FFFFFF"/>
             <w:tcMar>
-              <w:top w:w="60" w:type="dxa"/>
-              <w:bottom w:w="60" w:type="dxa"/>
-              <w:left w:w="80" w:type="dxa"/>
-              <w:right w:w="80" w:type="dxa"/>
+              <w:top w:w="50" w:type="dxa"/>
+              <w:bottom w:w="50" w:type="dxa"/>
+              <w:left w:w="70" w:type="dxa"/>
+              <w:right w:w="70" w:type="dxa"/>
             </w:tcMar>
           </w:tcPr>
           <w:p>
@@ -3050,7 +3713,7 @@
                 <w:rFonts w:ascii="Arial" w:hAnsi="Arial"/>
                 <w:b/>
                 <w:color w:val="4C1D95"/>
-                <w:sz w:val="17"/>
+                <w:sz w:val="16"/>
               </w:rPr>
               <w:t>POST</w:t>
             </w:r>
@@ -3061,17 +3724,17 @@
             <w:tcW w:type="dxa" w:w="3744"/>
             <w:shd w:fill="FFFFFF"/>
             <w:tcMar>
-              <w:top w:w="60" w:type="dxa"/>
-              <w:bottom w:w="60" w:type="dxa"/>
-              <w:left w:w="80" w:type="dxa"/>
-              <w:right w:w="80" w:type="dxa"/>
+              <w:top w:w="50" w:type="dxa"/>
+              <w:bottom w:w="50" w:type="dxa"/>
+              <w:left w:w="70" w:type="dxa"/>
+              <w:right w:w="70" w:type="dxa"/>
             </w:tcMar>
           </w:tcPr>
           <w:p>
             <w:r>
               <w:rPr>
                 <w:rFonts w:ascii="Courier New" w:hAnsi="Courier New"/>
-                <w:sz w:val="16"/>
+                <w:sz w:val="15"/>
               </w:rPr>
               <w:t>/api/shards/transfer</w:t>
             </w:r>
@@ -3082,19 +3745,19 @@
             <w:tcW w:type="dxa" w:w="4752"/>
             <w:shd w:fill="FFFFFF"/>
             <w:tcMar>
-              <w:top w:w="60" w:type="dxa"/>
-              <w:bottom w:w="60" w:type="dxa"/>
-              <w:left w:w="80" w:type="dxa"/>
-              <w:right w:w="80" w:type="dxa"/>
+              <w:top w:w="50" w:type="dxa"/>
+              <w:bottom w:w="50" w:type="dxa"/>
+              <w:left w:w="70" w:type="dxa"/>
+              <w:right w:w="70" w:type="dxa"/>
             </w:tcMar>
           </w:tcPr>
           <w:p>
             <w:r>
               <w:rPr>
                 <w:rFonts w:ascii="Arial" w:hAnsi="Arial"/>
-                <w:sz w:val="17"/>
+                <w:sz w:val="16"/>
               </w:rPr>
-              <w:t>Task C: Migrates file across regional shards with automatic AAD re-sealing.</w:t>
+              <w:t>Migrates file across regional shards with automatic AAD re-sealing.</w:t>
             </w:r>
           </w:p>
         </w:tc>
@@ -3105,10 +3768,10 @@
             <w:tcW w:type="dxa" w:w="1584"/>
             <w:shd w:fill="F8FAFC"/>
             <w:tcMar>
-              <w:top w:w="60" w:type="dxa"/>
-              <w:bottom w:w="60" w:type="dxa"/>
-              <w:left w:w="80" w:type="dxa"/>
-              <w:right w:w="80" w:type="dxa"/>
+              <w:top w:w="50" w:type="dxa"/>
+              <w:bottom w:w="50" w:type="dxa"/>
+              <w:left w:w="70" w:type="dxa"/>
+              <w:right w:w="70" w:type="dxa"/>
             </w:tcMar>
           </w:tcPr>
           <w:p>
@@ -3117,7 +3780,7 @@
                 <w:rFonts w:ascii="Arial" w:hAnsi="Arial"/>
                 <w:b/>
                 <w:color w:val="4C1D95"/>
-                <w:sz w:val="17"/>
+                <w:sz w:val="16"/>
               </w:rPr>
               <w:t>POST</w:t>
             </w:r>
@@ -3128,17 +3791,17 @@
             <w:tcW w:type="dxa" w:w="3744"/>
             <w:shd w:fill="F8FAFC"/>
             <w:tcMar>
-              <w:top w:w="60" w:type="dxa"/>
-              <w:bottom w:w="60" w:type="dxa"/>
-              <w:left w:w="80" w:type="dxa"/>
-              <w:right w:w="80" w:type="dxa"/>
+              <w:top w:w="50" w:type="dxa"/>
+              <w:bottom w:w="50" w:type="dxa"/>
+              <w:left w:w="70" w:type="dxa"/>
+              <w:right w:w="70" w:type="dxa"/>
             </w:tcMar>
           </w:tcPr>
           <w:p>
             <w:r>
               <w:rPr>
                 <w:rFonts w:ascii="Courier New" w:hAnsi="Courier New"/>
-                <w:sz w:val="16"/>
+                <w:sz w:val="15"/>
               </w:rPr>
               <w:t>/api/crypto/pq-seal</w:t>
             </w:r>
@@ -3149,19 +3812,19 @@
             <w:tcW w:type="dxa" w:w="4752"/>
             <w:shd w:fill="F8FAFC"/>
             <w:tcMar>
-              <w:top w:w="60" w:type="dxa"/>
-              <w:bottom w:w="60" w:type="dxa"/>
-              <w:left w:w="80" w:type="dxa"/>
-              <w:right w:w="80" w:type="dxa"/>
+              <w:top w:w="50" w:type="dxa"/>
+              <w:bottom w:w="50" w:type="dxa"/>
+              <w:left w:w="70" w:type="dxa"/>
+              <w:right w:w="70" w:type="dxa"/>
             </w:tcMar>
           </w:tcPr>
           <w:p>
             <w:r>
               <w:rPr>
                 <w:rFonts w:ascii="Arial" w:hAnsi="Arial"/>
-                <w:sz w:val="17"/>
+                <w:sz w:val="16"/>
               </w:rPr>
-              <w:t>Task D: Performs hybrid ML-KEM-768 + AES-256-GCM authenticated encryption.</w:t>
+              <w:t>Performs hybrid ML-KEM-768 + AES-256-GCM authenticated encryption.</w:t>
             </w:r>
           </w:p>
         </w:tc>
@@ -3172,10 +3835,10 @@
             <w:tcW w:type="dxa" w:w="1584"/>
             <w:shd w:fill="FFFFFF"/>
             <w:tcMar>
-              <w:top w:w="60" w:type="dxa"/>
-              <w:bottom w:w="60" w:type="dxa"/>
-              <w:left w:w="80" w:type="dxa"/>
-              <w:right w:w="80" w:type="dxa"/>
+              <w:top w:w="50" w:type="dxa"/>
+              <w:bottom w:w="50" w:type="dxa"/>
+              <w:left w:w="70" w:type="dxa"/>
+              <w:right w:w="70" w:type="dxa"/>
             </w:tcMar>
           </w:tcPr>
           <w:p>
@@ -3184,7 +3847,7 @@
                 <w:rFonts w:ascii="Arial" w:hAnsi="Arial"/>
                 <w:b/>
                 <w:color w:val="4C1D95"/>
-                <w:sz w:val="17"/>
+                <w:sz w:val="16"/>
               </w:rPr>
               <w:t>GET</w:t>
             </w:r>
@@ -3195,17 +3858,17 @@
             <w:tcW w:type="dxa" w:w="3744"/>
             <w:shd w:fill="FFFFFF"/>
             <w:tcMar>
-              <w:top w:w="60" w:type="dxa"/>
-              <w:bottom w:w="60" w:type="dxa"/>
-              <w:left w:w="80" w:type="dxa"/>
-              <w:right w:w="80" w:type="dxa"/>
+              <w:top w:w="50" w:type="dxa"/>
+              <w:bottom w:w="50" w:type="dxa"/>
+              <w:left w:w="70" w:type="dxa"/>
+              <w:right w:w="70" w:type="dxa"/>
             </w:tcMar>
           </w:tcPr>
           <w:p>
             <w:r>
               <w:rPr>
                 <w:rFonts w:ascii="Courier New" w:hAnsi="Courier New"/>
-                <w:sz w:val="16"/>
+                <w:sz w:val="15"/>
               </w:rPr>
               <w:t>/api/crypto/pq-proof</w:t>
             </w:r>
@@ -3216,19 +3879,19 @@
             <w:tcW w:type="dxa" w:w="4752"/>
             <w:shd w:fill="FFFFFF"/>
             <w:tcMar>
-              <w:top w:w="60" w:type="dxa"/>
-              <w:bottom w:w="60" w:type="dxa"/>
-              <w:left w:w="80" w:type="dxa"/>
-              <w:right w:w="80" w:type="dxa"/>
+              <w:top w:w="50" w:type="dxa"/>
+              <w:bottom w:w="50" w:type="dxa"/>
+              <w:left w:w="70" w:type="dxa"/>
+              <w:right w:w="70" w:type="dxa"/>
             </w:tcMar>
           </w:tcPr>
           <w:p>
             <w:r>
               <w:rPr>
                 <w:rFonts w:ascii="Arial" w:hAnsi="Arial"/>
-                <w:sz w:val="17"/>
+                <w:sz w:val="16"/>
               </w:rPr>
-              <w:t>Task D: Returns Kyber-768 lattice parameters, key fingerprint, and Shor immunity proof.</w:t>
+              <w:t>Returns Kyber-768 lattice parameters, key fingerprint, and Shor immunity proof.</w:t>
             </w:r>
           </w:p>
         </w:tc>
@@ -3239,10 +3902,10 @@
             <w:tcW w:type="dxa" w:w="1584"/>
             <w:shd w:fill="F8FAFC"/>
             <w:tcMar>
-              <w:top w:w="60" w:type="dxa"/>
-              <w:bottom w:w="60" w:type="dxa"/>
-              <w:left w:w="80" w:type="dxa"/>
-              <w:right w:w="80" w:type="dxa"/>
+              <w:top w:w="50" w:type="dxa"/>
+              <w:bottom w:w="50" w:type="dxa"/>
+              <w:left w:w="70" w:type="dxa"/>
+              <w:right w:w="70" w:type="dxa"/>
             </w:tcMar>
           </w:tcPr>
           <w:p>
@@ -3251,7 +3914,7 @@
                 <w:rFonts w:ascii="Arial" w:hAnsi="Arial"/>
                 <w:b/>
                 <w:color w:val="4C1D95"/>
-                <w:sz w:val="17"/>
+                <w:sz w:val="16"/>
               </w:rPr>
               <w:t>POST</w:t>
             </w:r>
@@ -3262,17 +3925,17 @@
             <w:tcW w:type="dxa" w:w="3744"/>
             <w:shd w:fill="F8FAFC"/>
             <w:tcMar>
-              <w:top w:w="60" w:type="dxa"/>
-              <w:bottom w:w="60" w:type="dxa"/>
-              <w:left w:w="80" w:type="dxa"/>
-              <w:right w:w="80" w:type="dxa"/>
+              <w:top w:w="50" w:type="dxa"/>
+              <w:bottom w:w="50" w:type="dxa"/>
+              <w:left w:w="70" w:type="dxa"/>
+              <w:right w:w="70" w:type="dxa"/>
             </w:tcMar>
           </w:tcPr>
           <w:p>
             <w:r>
               <w:rPr>
                 <w:rFonts w:ascii="Courier New" w:hAnsi="Courier New"/>
-                <w:sz w:val="16"/>
+                <w:sz w:val="15"/>
               </w:rPr>
               <w:t>/api/threats/red-team/simulate</w:t>
             </w:r>
@@ -3283,19 +3946,19 @@
             <w:tcW w:type="dxa" w:w="4752"/>
             <w:shd w:fill="F8FAFC"/>
             <w:tcMar>
-              <w:top w:w="60" w:type="dxa"/>
-              <w:bottom w:w="60" w:type="dxa"/>
-              <w:left w:w="80" w:type="dxa"/>
-              <w:right w:w="80" w:type="dxa"/>
+              <w:top w:w="50" w:type="dxa"/>
+              <w:bottom w:w="50" w:type="dxa"/>
+              <w:left w:w="70" w:type="dxa"/>
+              <w:right w:w="70" w:type="dxa"/>
             </w:tcMar>
           </w:tcPr>
           <w:p>
             <w:r>
               <w:rPr>
                 <w:rFonts w:ascii="Arial" w:hAnsi="Arial"/>
-                <w:sz w:val="17"/>
+                <w:sz w:val="16"/>
               </w:rPr>
-              <w:t>Task E: Executes Q-learning RL attack episode with LLM-mutated AST payloads.</w:t>
+              <w:t>Executes Q-learning RL attack episode with LLM-mutated AST payloads.</w:t>
             </w:r>
           </w:p>
         </w:tc>
@@ -3306,10 +3969,10 @@
             <w:tcW w:type="dxa" w:w="1584"/>
             <w:shd w:fill="FFFFFF"/>
             <w:tcMar>
-              <w:top w:w="60" w:type="dxa"/>
-              <w:bottom w:w="60" w:type="dxa"/>
-              <w:left w:w="80" w:type="dxa"/>
-              <w:right w:w="80" w:type="dxa"/>
+              <w:top w:w="50" w:type="dxa"/>
+              <w:bottom w:w="50" w:type="dxa"/>
+              <w:left w:w="70" w:type="dxa"/>
+              <w:right w:w="70" w:type="dxa"/>
             </w:tcMar>
           </w:tcPr>
           <w:p>
@@ -3318,7 +3981,7 @@
                 <w:rFonts w:ascii="Arial" w:hAnsi="Arial"/>
                 <w:b/>
                 <w:color w:val="4C1D95"/>
-                <w:sz w:val="17"/>
+                <w:sz w:val="16"/>
               </w:rPr>
               <w:t>GET</w:t>
             </w:r>
@@ -3329,17 +3992,17 @@
             <w:tcW w:type="dxa" w:w="3744"/>
             <w:shd w:fill="FFFFFF"/>
             <w:tcMar>
-              <w:top w:w="60" w:type="dxa"/>
-              <w:bottom w:w="60" w:type="dxa"/>
-              <w:left w:w="80" w:type="dxa"/>
-              <w:right w:w="80" w:type="dxa"/>
+              <w:top w:w="50" w:type="dxa"/>
+              <w:bottom w:w="50" w:type="dxa"/>
+              <w:left w:w="70" w:type="dxa"/>
+              <w:right w:w="70" w:type="dxa"/>
             </w:tcMar>
           </w:tcPr>
           <w:p>
             <w:r>
               <w:rPr>
                 <w:rFonts w:ascii="Courier New" w:hAnsi="Courier New"/>
-                <w:sz w:val="16"/>
+                <w:sz w:val="15"/>
               </w:rPr>
               <w:t>/api/threats/red-team/q-matrix</w:t>
             </w:r>
@@ -3350,19 +4013,19 @@
             <w:tcW w:type="dxa" w:w="4752"/>
             <w:shd w:fill="FFFFFF"/>
             <w:tcMar>
-              <w:top w:w="60" w:type="dxa"/>
-              <w:bottom w:w="60" w:type="dxa"/>
-              <w:left w:w="80" w:type="dxa"/>
-              <w:right w:w="80" w:type="dxa"/>
+              <w:top w:w="50" w:type="dxa"/>
+              <w:bottom w:w="50" w:type="dxa"/>
+              <w:left w:w="70" w:type="dxa"/>
+              <w:right w:w="70" w:type="dxa"/>
             </w:tcMar>
           </w:tcPr>
           <w:p>
             <w:r>
               <w:rPr>
                 <w:rFonts w:ascii="Arial" w:hAnsi="Arial"/>
-                <w:sz w:val="17"/>
+                <w:sz w:val="16"/>
               </w:rPr>
-              <w:t>Task E: Returns Q-learning state-action table and exploration metrics.</w:t>
+              <w:t>Returns Q-learning state-action table and exploration metrics.</w:t>
             </w:r>
           </w:p>
         </w:tc>
@@ -3373,10 +4036,10 @@
             <w:tcW w:type="dxa" w:w="1584"/>
             <w:shd w:fill="F8FAFC"/>
             <w:tcMar>
-              <w:top w:w="60" w:type="dxa"/>
-              <w:bottom w:w="60" w:type="dxa"/>
-              <w:left w:w="80" w:type="dxa"/>
-              <w:right w:w="80" w:type="dxa"/>
+              <w:top w:w="50" w:type="dxa"/>
+              <w:bottom w:w="50" w:type="dxa"/>
+              <w:left w:w="70" w:type="dxa"/>
+              <w:right w:w="70" w:type="dxa"/>
             </w:tcMar>
           </w:tcPr>
           <w:p>
@@ -3385,7 +4048,7 @@
                 <w:rFonts w:ascii="Arial" w:hAnsi="Arial"/>
                 <w:b/>
                 <w:color w:val="4C1D95"/>
-                <w:sz w:val="17"/>
+                <w:sz w:val="16"/>
               </w:rPr>
               <w:t>POST</w:t>
             </w:r>
@@ -3396,17 +4059,17 @@
             <w:tcW w:type="dxa" w:w="3744"/>
             <w:shd w:fill="F8FAFC"/>
             <w:tcMar>
-              <w:top w:w="60" w:type="dxa"/>
-              <w:bottom w:w="60" w:type="dxa"/>
-              <w:left w:w="80" w:type="dxa"/>
-              <w:right w:w="80" w:type="dxa"/>
+              <w:top w:w="50" w:type="dxa"/>
+              <w:bottom w:w="50" w:type="dxa"/>
+              <w:left w:w="70" w:type="dxa"/>
+              <w:right w:w="70" w:type="dxa"/>
             </w:tcMar>
           </w:tcPr>
           <w:p>
             <w:r>
               <w:rPr>
                 <w:rFonts w:ascii="Courier New" w:hAnsi="Courier New"/>
-                <w:sz w:val="16"/>
+                <w:sz w:val="15"/>
               </w:rPr>
               <w:t>/api/auth/webauthn/register-verify</w:t>
             </w:r>
@@ -3417,19 +4080,19 @@
             <w:tcW w:type="dxa" w:w="4752"/>
             <w:shd w:fill="F8FAFC"/>
             <w:tcMar>
-              <w:top w:w="60" w:type="dxa"/>
-              <w:bottom w:w="60" w:type="dxa"/>
-              <w:left w:w="80" w:type="dxa"/>
-              <w:right w:w="80" w:type="dxa"/>
+              <w:top w:w="50" w:type="dxa"/>
+              <w:bottom w:w="50" w:type="dxa"/>
+              <w:left w:w="70" w:type="dxa"/>
+              <w:right w:w="70" w:type="dxa"/>
             </w:tcMar>
           </w:tcPr>
           <w:p>
             <w:r>
               <w:rPr>
                 <w:rFonts w:ascii="Arial" w:hAnsi="Arial"/>
-                <w:sz w:val="17"/>
+                <w:sz w:val="16"/>
               </w:rPr>
-              <w:t>Task F: Validates FIDO2 CBOR attestation statements against MDS Root CA.</w:t>
+              <w:t>Validates FIDO2 CBOR attestation statements against MDS Root CA.</w:t>
             </w:r>
           </w:p>
         </w:tc>
@@ -3440,10 +4103,10 @@
             <w:tcW w:type="dxa" w:w="1584"/>
             <w:shd w:fill="FFFFFF"/>
             <w:tcMar>
-              <w:top w:w="60" w:type="dxa"/>
-              <w:bottom w:w="60" w:type="dxa"/>
-              <w:left w:w="80" w:type="dxa"/>
-              <w:right w:w="80" w:type="dxa"/>
+              <w:top w:w="50" w:type="dxa"/>
+              <w:bottom w:w="50" w:type="dxa"/>
+              <w:left w:w="70" w:type="dxa"/>
+              <w:right w:w="70" w:type="dxa"/>
             </w:tcMar>
           </w:tcPr>
           <w:p>
@@ -3452,141 +4115,7 @@
                 <w:rFonts w:ascii="Arial" w:hAnsi="Arial"/>
                 <w:b/>
                 <w:color w:val="4C1D95"/>
-                <w:sz w:val="17"/>
-              </w:rPr>
-              <w:t>GET</w:t>
-            </w:r>
-          </w:p>
-        </w:tc>
-        <w:tc>
-          <w:tcPr>
-            <w:tcW w:type="dxa" w:w="3744"/>
-            <w:shd w:fill="FFFFFF"/>
-            <w:tcMar>
-              <w:top w:w="60" w:type="dxa"/>
-              <w:bottom w:w="60" w:type="dxa"/>
-              <w:left w:w="80" w:type="dxa"/>
-              <w:right w:w="80" w:type="dxa"/>
-            </w:tcMar>
-          </w:tcPr>
-          <w:p>
-            <w:r>
-              <w:rPr>
-                <w:rFonts w:ascii="Courier New" w:hAnsi="Courier New"/>
                 <w:sz w:val="16"/>
-              </w:rPr>
-              <w:t>/api/auth/webauthn/devices</w:t>
-            </w:r>
-          </w:p>
-        </w:tc>
-        <w:tc>
-          <w:tcPr>
-            <w:tcW w:type="dxa" w:w="4752"/>
-            <w:shd w:fill="FFFFFF"/>
-            <w:tcMar>
-              <w:top w:w="60" w:type="dxa"/>
-              <w:bottom w:w="60" w:type="dxa"/>
-              <w:left w:w="80" w:type="dxa"/>
-              <w:right w:w="80" w:type="dxa"/>
-            </w:tcMar>
-          </w:tcPr>
-          <w:p>
-            <w:r>
-              <w:rPr>
-                <w:rFonts w:ascii="Arial" w:hAnsi="Arial"/>
-                <w:sz w:val="17"/>
-              </w:rPr>
-              <w:t>Task F: Lists enrolled biometric passkeys with hardware security levels.</w:t>
-            </w:r>
-          </w:p>
-        </w:tc>
-      </w:tr>
-      <w:tr>
-        <w:tc>
-          <w:tcPr>
-            <w:tcW w:type="dxa" w:w="1584"/>
-            <w:shd w:fill="F8FAFC"/>
-            <w:tcMar>
-              <w:top w:w="60" w:type="dxa"/>
-              <w:bottom w:w="60" w:type="dxa"/>
-              <w:left w:w="80" w:type="dxa"/>
-              <w:right w:w="80" w:type="dxa"/>
-            </w:tcMar>
-          </w:tcPr>
-          <w:p>
-            <w:r>
-              <w:rPr>
-                <w:rFonts w:ascii="Arial" w:hAnsi="Arial"/>
-                <w:b/>
-                <w:color w:val="4C1D95"/>
-                <w:sz w:val="17"/>
-              </w:rPr>
-              <w:t>POST</w:t>
-            </w:r>
-          </w:p>
-        </w:tc>
-        <w:tc>
-          <w:tcPr>
-            <w:tcW w:type="dxa" w:w="3744"/>
-            <w:shd w:fill="F8FAFC"/>
-            <w:tcMar>
-              <w:top w:w="60" w:type="dxa"/>
-              <w:bottom w:w="60" w:type="dxa"/>
-              <w:left w:w="80" w:type="dxa"/>
-              <w:right w:w="80" w:type="dxa"/>
-            </w:tcMar>
-          </w:tcPr>
-          <w:p>
-            <w:r>
-              <w:rPr>
-                <w:rFonts w:ascii="Courier New" w:hAnsi="Courier New"/>
-                <w:sz w:val="16"/>
-              </w:rPr>
-              <w:t>/api/push/register-native</w:t>
-            </w:r>
-          </w:p>
-        </w:tc>
-        <w:tc>
-          <w:tcPr>
-            <w:tcW w:type="dxa" w:w="4752"/>
-            <w:shd w:fill="F8FAFC"/>
-            <w:tcMar>
-              <w:top w:w="60" w:type="dxa"/>
-              <w:bottom w:w="60" w:type="dxa"/>
-              <w:left w:w="80" w:type="dxa"/>
-              <w:right w:w="80" w:type="dxa"/>
-            </w:tcMar>
-          </w:tcPr>
-          <w:p>
-            <w:r>
-              <w:rPr>
-                <w:rFonts w:ascii="Arial" w:hAnsi="Arial"/>
-                <w:sz w:val="17"/>
-              </w:rPr>
-              <w:t>Task G: Registers native iOS APNs device token or Android FCM token.</w:t>
-            </w:r>
-          </w:p>
-        </w:tc>
-      </w:tr>
-      <w:tr>
-        <w:tc>
-          <w:tcPr>
-            <w:tcW w:type="dxa" w:w="1584"/>
-            <w:shd w:fill="FFFFFF"/>
-            <w:tcMar>
-              <w:top w:w="60" w:type="dxa"/>
-              <w:bottom w:w="60" w:type="dxa"/>
-              <w:left w:w="80" w:type="dxa"/>
-              <w:right w:w="80" w:type="dxa"/>
-            </w:tcMar>
-          </w:tcPr>
-          <w:p>
-            <w:r>
-              <w:rPr>
-                <w:rFonts w:ascii="Arial" w:hAnsi="Arial"/>
-                <w:b/>
-                <w:color w:val="4C1D95"/>
-                <w:sz w:val="17"/>
               </w:rPr>
               <w:t>POST</w:t>
             </w:r>
@@ -3597,17 +4126,17 @@
             <w:tcW w:type="dxa" w:w="3744"/>
             <w:shd w:fill="FFFFFF"/>
             <w:tcMar>
-              <w:top w:w="60" w:type="dxa"/>
-              <w:bottom w:w="60" w:type="dxa"/>
-              <w:left w:w="80" w:type="dxa"/>
-              <w:right w:w="80" w:type="dxa"/>
+              <w:top w:w="50" w:type="dxa"/>
+              <w:bottom w:w="50" w:type="dxa"/>
+              <w:left w:w="70" w:type="dxa"/>
+              <w:right w:w="70" w:type="dxa"/>
             </w:tcMar>
           </w:tcPr>
           <w:p>
             <w:r>
               <w:rPr>
                 <w:rFonts w:ascii="Courier New" w:hAnsi="Courier New"/>
-                <w:sz w:val="16"/>
+                <w:sz w:val="15"/>
               </w:rPr>
               <w:t>/api/push/broadcast-threat</w:t>
             </w:r>
@@ -3618,19 +4147,19 @@
             <w:tcW w:type="dxa" w:w="4752"/>
             <w:shd w:fill="FFFFFF"/>
             <w:tcMar>
-              <w:top w:w="60" w:type="dxa"/>
-              <w:bottom w:w="60" w:type="dxa"/>
-              <w:left w:w="80" w:type="dxa"/>
-              <w:right w:w="80" w:type="dxa"/>
+              <w:top w:w="50" w:type="dxa"/>
+              <w:bottom w:w="50" w:type="dxa"/>
+              <w:left w:w="70" w:type="dxa"/>
+              <w:right w:w="70" w:type="dxa"/>
             </w:tcMar>
           </w:tcPr>
           <w:p>
             <w:r>
               <w:rPr>
                 <w:rFonts w:ascii="Arial" w:hAnsi="Arial"/>
-                <w:sz w:val="17"/>
+                <w:sz w:val="16"/>
               </w:rPr>
-              <w:t>Task G: Dispatches multi-channel threat alert across Web Push, APNs, and FCM.</w:t>
+              <w:t>Dispatches multi-channel threat alert across Web Push, APNs, and FCM.</w:t>
             </w:r>
           </w:p>
         </w:tc>
@@ -3650,46 +4179,26 @@
           <w:rFonts w:ascii="Arial" w:hAnsi="Arial"/>
           <w:b/>
           <w:color w:val="4C1D95"/>
-          <w:sz w:val="28"/>
+          <w:sz w:val="26"/>
         </w:rPr>
-        <w:t>7. Deployment &amp; Git Synchronization Manual</w:t>
+        <w:t>7. Verification &amp; Production Readiness Checklist</w:t>
       </w:r>
     </w:p>
     <w:p>
       <w:r>
-        <w:t>1. Local Server Verification:</w:t>
+        <w:t>Before final academic evaluation or enterprise demonstration, verify the following 6 checkpoints:</w:t>
         <w:br/>
-        <w:t xml:space="preserve">   Start server: python run_server.py</w:t>
+        <w:t>1. Web Server Execution: Start via 'python run_server.py'. Binds to 0.0.0.0:5000 with persistent SQLite database.</w:t>
         <w:br/>
-        <w:t xml:space="preserve">   Runs on http://127.0.0.1:5000 with all delivered features and roadmap tasks active.</w:t>
+        <w:t>2. GitHub Repository: Master branch confirmed at commit c50405a with all 26 production files present.</w:t>
         <w:br/>
+        <w:t>3. Render Live Service: Check https://cloud-d.onrender.com/. When prompted, deploy latest commit to activate.</w:t>
         <w:br/>
-        <w:t>2. Git Repository Push (Using Git CLI or push_to_github.py):</w:t>
+        <w:t>4. Mobile Screen Gating: Load https://cloud-d.onrender.com/ on iOS Safari or Android Chrome. Ensure bottom bar is hidden.</w:t>
         <w:br/>
-        <w:t xml:space="preserve">   Option A (Git CLI):</w:t>
+        <w:t>5. Login Authentication: Authenticate with staff 'nithish' / 'nithish123'. Ensure bottom bar smoothly reveals.</w:t>
         <w:br/>
-        <w:t xml:space="preserve">     git add .</w:t>
-        <w:br/>
-        <w:t xml:space="preserve">     git commit -m "Implement All Cloud-D Roadmap Tasks: Persistent Disk /var/data, CRDT Rich-Text &amp; Multi-Cursor, Cross-Region Sharding, Hybrid ML-KEM Kyber-768, Red-Team LLM Mutations, FIDO2 Attestation, and Native APNs/FCM"</w:t>
-        <w:br/>
-        <w:t xml:space="preserve">     git push origin main</w:t>
-        <w:br/>
-        <w:br/>
-        <w:t xml:space="preserve">   Option B (Pure Python Dulwich without Git installed):</w:t>
-        <w:br/>
-        <w:t xml:space="preserve">     python push_to_github.py &lt;GITHUB_TOKEN&gt;</w:t>
-        <w:br/>
-        <w:br/>
-        <w:t>3. Live Render Deployment:</w:t>
-        <w:br/>
-        <w:t xml:space="preserve">   The GitHub repository https://github.com/Nithishammu/cloud-d-enterprise-security.git is connected to Render.</w:t>
-        <w:br/>
-        <w:t xml:space="preserve">   Pushing to main automatically deploys the live service at https://cloud-d.onrender.com/.</w:t>
-        <w:br/>
-        <w:br/>
-        <w:t>4. Document Location:</w:t>
-        <w:br/>
-        <w:t xml:space="preserve">   This document is saved as static/Cloud_D_Executive_Handover_Specification.docx and is accessible via the top-right '📥 Download Docs' button in the live application.</w:t>
+        <w:t>6. Threat Simulation: Execute 1 manual round and 1 automated 10-round audit. Verify Minimax tree score readout.</w:t>
       </w:r>
     </w:p>
     <w:sectPr>

</xml_diff>